<commit_message>
Complete MLOps report with all 14 visual evidence screenshots, Docker/K8s testing, and Grafana monitoring
</commit_message>
<xml_diff>
--- a/MLOps_Report.docx
+++ b/MLOps_Report.docx
@@ -4975,6 +4975,168 @@
     </w:p>
     <w:p>
       <w:pPr>
+        <w:spacing w:before="120" w:after="40"/>
+        <w:jc w:val="center"/>
+      </w:pPr>
+      <w:r>
+        <w:drawing>
+          <wp:inline xmlns:a="http://schemas.openxmlformats.org/drawingml/2006/main" xmlns:pic="http://schemas.openxmlformats.org/drawingml/2006/picture">
+            <wp:extent cx="5669280" cy="2546747"/>
+            <wp:docPr id="7" name="Picture 7"/>
+            <wp:cNvGraphicFramePr>
+              <a:graphicFrameLocks noChangeAspect="1"/>
+            </wp:cNvGraphicFramePr>
+            <a:graphic>
+              <a:graphicData uri="http://schemas.openxmlformats.org/drawingml/2006/picture">
+                <pic:pic>
+                  <pic:nvPicPr>
+                    <pic:cNvPr id="0" name="03_mlflow_runs.png"/>
+                    <pic:cNvPicPr/>
+                  </pic:nvPicPr>
+                  <pic:blipFill>
+                    <a:blip r:embed="rId15"/>
+                    <a:stretch>
+                      <a:fillRect/>
+                    </a:stretch>
+                  </pic:blipFill>
+                  <pic:spPr>
+                    <a:xfrm>
+                      <a:off x="0" y="0"/>
+                      <a:ext cx="5669280" cy="2546747"/>
+                    </a:xfrm>
+                    <a:prstGeom prst="rect"/>
+                  </pic:spPr>
+                </pic:pic>
+              </a:graphicData>
+            </a:graphic>
+          </wp:inline>
+        </w:drawing>
+      </w:r>
+    </w:p>
+    <w:p>
+      <w:pPr>
+        <w:spacing w:before="0" w:after="160"/>
+        <w:jc w:val="center"/>
+      </w:pPr>
+      <w:r>
+        <w:rPr>
+          <w:i/>
+          <w:color w:val="505050"/>
+          <w:sz w:val="17"/>
+        </w:rPr>
+        <w:t>Figure 7: MLflow Tracking Server — Experiment 'heart-disease-risk' runs table with candidate comparison.</w:t>
+      </w:r>
+    </w:p>
+    <w:p>
+      <w:pPr>
+        <w:spacing w:before="120" w:after="40"/>
+        <w:jc w:val="center"/>
+      </w:pPr>
+      <w:r>
+        <w:drawing>
+          <wp:inline xmlns:a="http://schemas.openxmlformats.org/drawingml/2006/main" xmlns:pic="http://schemas.openxmlformats.org/drawingml/2006/picture">
+            <wp:extent cx="5669280" cy="2563356"/>
+            <wp:docPr id="8" name="Picture 8"/>
+            <wp:cNvGraphicFramePr>
+              <a:graphicFrameLocks noChangeAspect="1"/>
+            </wp:cNvGraphicFramePr>
+            <a:graphic>
+              <a:graphicData uri="http://schemas.openxmlformats.org/drawingml/2006/picture">
+                <pic:pic>
+                  <pic:nvPicPr>
+                    <pic:cNvPr id="0" name="04_mlflow_run_detail.png"/>
+                    <pic:cNvPicPr/>
+                  </pic:nvPicPr>
+                  <pic:blipFill>
+                    <a:blip r:embed="rId16"/>
+                    <a:stretch>
+                      <a:fillRect/>
+                    </a:stretch>
+                  </pic:blipFill>
+                  <pic:spPr>
+                    <a:xfrm>
+                      <a:off x="0" y="0"/>
+                      <a:ext cx="5669280" cy="2563356"/>
+                    </a:xfrm>
+                    <a:prstGeom prst="rect"/>
+                  </pic:spPr>
+                </pic:pic>
+              </a:graphicData>
+            </a:graphic>
+          </wp:inline>
+        </w:drawing>
+      </w:r>
+    </w:p>
+    <w:p>
+      <w:pPr>
+        <w:spacing w:before="0" w:after="160"/>
+        <w:jc w:val="center"/>
+      </w:pPr>
+      <w:r>
+        <w:rPr>
+          <w:i/>
+          <w:color w:val="505050"/>
+          <w:sz w:val="17"/>
+        </w:rPr>
+        <w:t>Figure 8: MLflow run detail for champion Logistic Regression showing logged parameters and cross-validation metrics.</w:t>
+      </w:r>
+    </w:p>
+    <w:p>
+      <w:pPr>
+        <w:spacing w:before="120" w:after="40"/>
+        <w:jc w:val="center"/>
+      </w:pPr>
+      <w:r>
+        <w:drawing>
+          <wp:inline xmlns:a="http://schemas.openxmlformats.org/drawingml/2006/main" xmlns:pic="http://schemas.openxmlformats.org/drawingml/2006/picture">
+            <wp:extent cx="5303520" cy="2382441"/>
+            <wp:docPr id="9" name="Picture 9"/>
+            <wp:cNvGraphicFramePr>
+              <a:graphicFrameLocks noChangeAspect="1"/>
+            </wp:cNvGraphicFramePr>
+            <a:graphic>
+              <a:graphicData uri="http://schemas.openxmlformats.org/drawingml/2006/picture">
+                <pic:pic>
+                  <pic:nvPicPr>
+                    <pic:cNvPr id="0" name="04b_mlflow_artifacts.png"/>
+                    <pic:cNvPicPr/>
+                  </pic:nvPicPr>
+                  <pic:blipFill>
+                    <a:blip r:embed="rId17"/>
+                    <a:stretch>
+                      <a:fillRect/>
+                    </a:stretch>
+                  </pic:blipFill>
+                  <pic:spPr>
+                    <a:xfrm>
+                      <a:off x="0" y="0"/>
+                      <a:ext cx="5303520" cy="2382441"/>
+                    </a:xfrm>
+                    <a:prstGeom prst="rect"/>
+                  </pic:spPr>
+                </pic:pic>
+              </a:graphicData>
+            </a:graphic>
+          </wp:inline>
+        </w:drawing>
+      </w:r>
+    </w:p>
+    <w:p>
+      <w:pPr>
+        <w:spacing w:before="0" w:after="160"/>
+        <w:jc w:val="center"/>
+      </w:pPr>
+      <w:r>
+        <w:rPr>
+          <w:i/>
+          <w:color w:val="505050"/>
+          <w:sz w:val="17"/>
+        </w:rPr>
+        <w:t>Figure 9: MLflow Artifacts browser displaying packaged scikit-learn model, requirements, and confusion matrix plot.</w:t>
+      </w:r>
+    </w:p>
+    <w:p>
+      <w:pPr>
         <w:pStyle w:val="Heading1"/>
         <w:keepNext/>
         <w:spacing w:before="280" w:after="80"/>
@@ -5653,6 +5815,60 @@
     </w:p>
     <w:p>
       <w:pPr>
+        <w:spacing w:before="120" w:after="40"/>
+        <w:jc w:val="center"/>
+      </w:pPr>
+      <w:r>
+        <w:drawing>
+          <wp:inline xmlns:a="http://schemas.openxmlformats.org/drawingml/2006/main" xmlns:pic="http://schemas.openxmlformats.org/drawingml/2006/picture">
+            <wp:extent cx="5669280" cy="3751174"/>
+            <wp:docPr id="10" name="Picture 10"/>
+            <wp:cNvGraphicFramePr>
+              <a:graphicFrameLocks noChangeAspect="1"/>
+            </wp:cNvGraphicFramePr>
+            <a:graphic>
+              <a:graphicData uri="http://schemas.openxmlformats.org/drawingml/2006/picture">
+                <pic:pic>
+                  <pic:nvPicPr>
+                    <pic:cNvPr id="0" name="05_pytest_pass.png"/>
+                    <pic:cNvPicPr/>
+                  </pic:nvPicPr>
+                  <pic:blipFill>
+                    <a:blip r:embed="rId18"/>
+                    <a:stretch>
+                      <a:fillRect/>
+                    </a:stretch>
+                  </pic:blipFill>
+                  <pic:spPr>
+                    <a:xfrm>
+                      <a:off x="0" y="0"/>
+                      <a:ext cx="5669280" cy="3751174"/>
+                    </a:xfrm>
+                    <a:prstGeom prst="rect"/>
+                  </pic:spPr>
+                </pic:pic>
+              </a:graphicData>
+            </a:graphic>
+          </wp:inline>
+        </w:drawing>
+      </w:r>
+    </w:p>
+    <w:p>
+      <w:pPr>
+        <w:spacing w:before="0" w:after="160"/>
+        <w:jc w:val="center"/>
+      </w:pPr>
+      <w:r>
+        <w:rPr>
+          <w:i/>
+          <w:color w:val="505050"/>
+          <w:sz w:val="17"/>
+        </w:rPr>
+        <w:t>Figure 10: Local execution of 21 pytest unit tests with 100% pass rate across API, data sanitization, features, and modeling.</w:t>
+      </w:r>
+    </w:p>
+    <w:p>
+      <w:pPr>
         <w:pStyle w:val="Heading2"/>
         <w:keepNext/>
         <w:spacing w:before="200" w:after="60"/>
@@ -5972,6 +6188,168 @@
       <w:pPr>
         <w:spacing w:before="40" w:after="80"/>
       </w:pPr>
+    </w:p>
+    <w:p>
+      <w:pPr>
+        <w:spacing w:before="120" w:after="40"/>
+        <w:jc w:val="center"/>
+      </w:pPr>
+      <w:r>
+        <w:drawing>
+          <wp:inline xmlns:a="http://schemas.openxmlformats.org/drawingml/2006/main" xmlns:pic="http://schemas.openxmlformats.org/drawingml/2006/picture">
+            <wp:extent cx="5669280" cy="2297609"/>
+            <wp:docPr id="11" name="Picture 11"/>
+            <wp:cNvGraphicFramePr>
+              <a:graphicFrameLocks noChangeAspect="1"/>
+            </wp:cNvGraphicFramePr>
+            <a:graphic>
+              <a:graphicData uri="http://schemas.openxmlformats.org/drawingml/2006/picture">
+                <pic:pic>
+                  <pic:nvPicPr>
+                    <pic:cNvPr id="0" name="06_actions_run.png"/>
+                    <pic:cNvPicPr/>
+                  </pic:nvPicPr>
+                  <pic:blipFill>
+                    <a:blip r:embed="rId19"/>
+                    <a:stretch>
+                      <a:fillRect/>
+                    </a:stretch>
+                  </pic:blipFill>
+                  <pic:spPr>
+                    <a:xfrm>
+                      <a:off x="0" y="0"/>
+                      <a:ext cx="5669280" cy="2297609"/>
+                    </a:xfrm>
+                    <a:prstGeom prst="rect"/>
+                  </pic:spPr>
+                </pic:pic>
+              </a:graphicData>
+            </a:graphic>
+          </wp:inline>
+        </w:drawing>
+      </w:r>
+    </w:p>
+    <w:p>
+      <w:pPr>
+        <w:spacing w:before="0" w:after="160"/>
+        <w:jc w:val="center"/>
+      </w:pPr>
+      <w:r>
+        <w:rPr>
+          <w:i/>
+          <w:color w:val="505050"/>
+          <w:sz w:val="17"/>
+        </w:rPr>
+        <w:t>Figure 11: GitHub Actions CI/CD workflow run — All four jobs (lint, test, train, docker) completed green.</w:t>
+      </w:r>
+    </w:p>
+    <w:p>
+      <w:pPr>
+        <w:spacing w:before="120" w:after="40"/>
+        <w:jc w:val="center"/>
+      </w:pPr>
+      <w:r>
+        <w:drawing>
+          <wp:inline xmlns:a="http://schemas.openxmlformats.org/drawingml/2006/main" xmlns:pic="http://schemas.openxmlformats.org/drawingml/2006/picture">
+            <wp:extent cx="5486400" cy="2480667"/>
+            <wp:docPr id="12" name="Picture 12"/>
+            <wp:cNvGraphicFramePr>
+              <a:graphicFrameLocks noChangeAspect="1"/>
+            </wp:cNvGraphicFramePr>
+            <a:graphic>
+              <a:graphicData uri="http://schemas.openxmlformats.org/drawingml/2006/picture">
+                <pic:pic>
+                  <pic:nvPicPr>
+                    <pic:cNvPr id="0" name="07_actions_artifacts.png"/>
+                    <pic:cNvPicPr/>
+                  </pic:nvPicPr>
+                  <pic:blipFill>
+                    <a:blip r:embed="rId20"/>
+                    <a:stretch>
+                      <a:fillRect/>
+                    </a:stretch>
+                  </pic:blipFill>
+                  <pic:spPr>
+                    <a:xfrm>
+                      <a:off x="0" y="0"/>
+                      <a:ext cx="5486400" cy="2480667"/>
+                    </a:xfrm>
+                    <a:prstGeom prst="rect"/>
+                  </pic:spPr>
+                </pic:pic>
+              </a:graphicData>
+            </a:graphic>
+          </wp:inline>
+        </w:drawing>
+      </w:r>
+    </w:p>
+    <w:p>
+      <w:pPr>
+        <w:spacing w:before="0" w:after="160"/>
+        <w:jc w:val="center"/>
+      </w:pPr>
+      <w:r>
+        <w:rPr>
+          <w:i/>
+          <w:color w:val="505050"/>
+          <w:sz w:val="17"/>
+        </w:rPr>
+        <w:t>Figure 12: GitHub Actions uploaded build artifacts (figures, mlruns, model, test-reports).</w:t>
+      </w:r>
+    </w:p>
+    <w:p>
+      <w:pPr>
+        <w:spacing w:before="120" w:after="40"/>
+        <w:jc w:val="center"/>
+      </w:pPr>
+      <w:r>
+        <w:drawing>
+          <wp:inline xmlns:a="http://schemas.openxmlformats.org/drawingml/2006/main" xmlns:pic="http://schemas.openxmlformats.org/drawingml/2006/picture">
+            <wp:extent cx="5486400" cy="2400300"/>
+            <wp:docPr id="13" name="Picture 13"/>
+            <wp:cNvGraphicFramePr>
+              <a:graphicFrameLocks noChangeAspect="1"/>
+            </wp:cNvGraphicFramePr>
+            <a:graphic>
+              <a:graphicData uri="http://schemas.openxmlformats.org/drawingml/2006/picture">
+                <pic:pic>
+                  <pic:nvPicPr>
+                    <pic:cNvPr id="0" name="08_actions_failure.png"/>
+                    <pic:cNvPicPr/>
+                  </pic:nvPicPr>
+                  <pic:blipFill>
+                    <a:blip r:embed="rId21"/>
+                    <a:stretch>
+                      <a:fillRect/>
+                    </a:stretch>
+                  </pic:blipFill>
+                  <pic:spPr>
+                    <a:xfrm>
+                      <a:off x="0" y="0"/>
+                      <a:ext cx="5486400" cy="2400300"/>
+                    </a:xfrm>
+                    <a:prstGeom prst="rect"/>
+                  </pic:spPr>
+                </pic:pic>
+              </a:graphicData>
+            </a:graphic>
+          </wp:inline>
+        </w:drawing>
+      </w:r>
+    </w:p>
+    <w:p>
+      <w:pPr>
+        <w:spacing w:before="0" w:after="160"/>
+        <w:jc w:val="center"/>
+      </w:pPr>
+      <w:r>
+        <w:rPr>
+          <w:i/>
+          <w:color w:val="505050"/>
+          <w:sz w:val="17"/>
+        </w:rPr>
+        <w:t>Figure 13: CI/CD fail-fast demonstration verifying that code quality violations intentionally halt the pipeline.</w:t>
+      </w:r>
     </w:p>
     <w:p>
       <w:pPr>
@@ -6782,6 +7160,114 @@
     </w:p>
     <w:p>
       <w:pPr>
+        <w:spacing w:before="120" w:after="40"/>
+        <w:jc w:val="center"/>
+      </w:pPr>
+      <w:r>
+        <w:drawing>
+          <wp:inline xmlns:a="http://schemas.openxmlformats.org/drawingml/2006/main" xmlns:pic="http://schemas.openxmlformats.org/drawingml/2006/picture">
+            <wp:extent cx="5669280" cy="2622042"/>
+            <wp:docPr id="14" name="Picture 14"/>
+            <wp:cNvGraphicFramePr>
+              <a:graphicFrameLocks noChangeAspect="1"/>
+            </wp:cNvGraphicFramePr>
+            <a:graphic>
+              <a:graphicData uri="http://schemas.openxmlformats.org/drawingml/2006/picture">
+                <pic:pic>
+                  <pic:nvPicPr>
+                    <pic:cNvPr id="0" name="09_docker_build.png"/>
+                    <pic:cNvPicPr/>
+                  </pic:nvPicPr>
+                  <pic:blipFill>
+                    <a:blip r:embed="rId22"/>
+                    <a:stretch>
+                      <a:fillRect/>
+                    </a:stretch>
+                  </pic:blipFill>
+                  <pic:spPr>
+                    <a:xfrm>
+                      <a:off x="0" y="0"/>
+                      <a:ext cx="5669280" cy="2622042"/>
+                    </a:xfrm>
+                    <a:prstGeom prst="rect"/>
+                  </pic:spPr>
+                </pic:pic>
+              </a:graphicData>
+            </a:graphic>
+          </wp:inline>
+        </w:drawing>
+      </w:r>
+    </w:p>
+    <w:p>
+      <w:pPr>
+        <w:spacing w:before="0" w:after="160"/>
+        <w:jc w:val="center"/>
+      </w:pPr>
+      <w:r>
+        <w:rPr>
+          <w:i/>
+          <w:color w:val="505050"/>
+          <w:sz w:val="17"/>
+        </w:rPr>
+        <w:t>Figure 14: Terminal output of multi-stage Docker build producing non-root production container image (162 MB).</w:t>
+      </w:r>
+    </w:p>
+    <w:p>
+      <w:pPr>
+        <w:spacing w:before="120" w:after="40"/>
+        <w:jc w:val="center"/>
+      </w:pPr>
+      <w:r>
+        <w:drawing>
+          <wp:inline xmlns:a="http://schemas.openxmlformats.org/drawingml/2006/main" xmlns:pic="http://schemas.openxmlformats.org/drawingml/2006/picture">
+            <wp:extent cx="5669280" cy="2187397"/>
+            <wp:docPr id="15" name="Picture 15"/>
+            <wp:cNvGraphicFramePr>
+              <a:graphicFrameLocks noChangeAspect="1"/>
+            </wp:cNvGraphicFramePr>
+            <a:graphic>
+              <a:graphicData uri="http://schemas.openxmlformats.org/drawingml/2006/picture">
+                <pic:pic>
+                  <pic:nvPicPr>
+                    <pic:cNvPr id="0" name="10_docker_predict.png"/>
+                    <pic:cNvPicPr/>
+                  </pic:nvPicPr>
+                  <pic:blipFill>
+                    <a:blip r:embed="rId23"/>
+                    <a:stretch>
+                      <a:fillRect/>
+                    </a:stretch>
+                  </pic:blipFill>
+                  <pic:spPr>
+                    <a:xfrm>
+                      <a:off x="0" y="0"/>
+                      <a:ext cx="5669280" cy="2187397"/>
+                    </a:xfrm>
+                    <a:prstGeom prst="rect"/>
+                  </pic:spPr>
+                </pic:pic>
+              </a:graphicData>
+            </a:graphic>
+          </wp:inline>
+        </w:drawing>
+      </w:r>
+    </w:p>
+    <w:p>
+      <w:pPr>
+        <w:spacing w:before="0" w:after="160"/>
+        <w:jc w:val="center"/>
+      </w:pPr>
+      <w:r>
+        <w:rPr>
+          <w:i/>
+          <w:color w:val="505050"/>
+          <w:sz w:val="17"/>
+        </w:rPr>
+        <w:t>Figure 15: Docker container serving FastAPI microservice and returning real-time inference prediction with health status.</w:t>
+      </w:r>
+    </w:p>
+    <w:p>
+      <w:pPr>
         <w:pStyle w:val="Heading1"/>
         <w:keepNext/>
         <w:spacing w:before="280" w:after="80"/>
@@ -7128,6 +7614,114 @@
     </w:p>
     <w:p>
       <w:pPr>
+        <w:spacing w:before="120" w:after="40"/>
+        <w:jc w:val="center"/>
+      </w:pPr>
+      <w:r>
+        <w:drawing>
+          <wp:inline xmlns:a="http://schemas.openxmlformats.org/drawingml/2006/main" xmlns:pic="http://schemas.openxmlformats.org/drawingml/2006/picture">
+            <wp:extent cx="5669280" cy="2187397"/>
+            <wp:docPr id="16" name="Picture 16"/>
+            <wp:cNvGraphicFramePr>
+              <a:graphicFrameLocks noChangeAspect="1"/>
+            </wp:cNvGraphicFramePr>
+            <a:graphic>
+              <a:graphicData uri="http://schemas.openxmlformats.org/drawingml/2006/picture">
+                <pic:pic>
+                  <pic:nvPicPr>
+                    <pic:cNvPr id="0" name="11_k8s_pods_svc.png"/>
+                    <pic:cNvPicPr/>
+                  </pic:nvPicPr>
+                  <pic:blipFill>
+                    <a:blip r:embed="rId24"/>
+                    <a:stretch>
+                      <a:fillRect/>
+                    </a:stretch>
+                  </pic:blipFill>
+                  <pic:spPr>
+                    <a:xfrm>
+                      <a:off x="0" y="0"/>
+                      <a:ext cx="5669280" cy="2187397"/>
+                    </a:xfrm>
+                    <a:prstGeom prst="rect"/>
+                  </pic:spPr>
+                </pic:pic>
+              </a:graphicData>
+            </a:graphic>
+          </wp:inline>
+        </w:drawing>
+      </w:r>
+    </w:p>
+    <w:p>
+      <w:pPr>
+        <w:spacing w:before="0" w:after="160"/>
+        <w:jc w:val="center"/>
+      </w:pPr>
+      <w:r>
+        <w:rPr>
+          <w:i/>
+          <w:color w:val="505050"/>
+          <w:sz w:val="17"/>
+        </w:rPr>
+        <w:t>Figure 16: Kubernetes cluster resources — Replicated pods, LoadBalancer Service, and Horizontal Pod Autoscaler.</w:t>
+      </w:r>
+    </w:p>
+    <w:p>
+      <w:pPr>
+        <w:spacing w:before="120" w:after="40"/>
+        <w:jc w:val="center"/>
+      </w:pPr>
+      <w:r>
+        <w:drawing>
+          <wp:inline xmlns:a="http://schemas.openxmlformats.org/drawingml/2006/main" xmlns:pic="http://schemas.openxmlformats.org/drawingml/2006/picture">
+            <wp:extent cx="5669280" cy="2187397"/>
+            <wp:docPr id="17" name="Picture 17"/>
+            <wp:cNvGraphicFramePr>
+              <a:graphicFrameLocks noChangeAspect="1"/>
+            </wp:cNvGraphicFramePr>
+            <a:graphic>
+              <a:graphicData uri="http://schemas.openxmlformats.org/drawingml/2006/picture">
+                <pic:pic>
+                  <pic:nvPicPr>
+                    <pic:cNvPr id="0" name="12_k8s_predict.png"/>
+                    <pic:cNvPicPr/>
+                  </pic:nvPicPr>
+                  <pic:blipFill>
+                    <a:blip r:embed="rId25"/>
+                    <a:stretch>
+                      <a:fillRect/>
+                    </a:stretch>
+                  </pic:blipFill>
+                  <pic:spPr>
+                    <a:xfrm>
+                      <a:off x="0" y="0"/>
+                      <a:ext cx="5669280" cy="2187397"/>
+                    </a:xfrm>
+                    <a:prstGeom prst="rect"/>
+                  </pic:spPr>
+                </pic:pic>
+              </a:graphicData>
+            </a:graphic>
+          </wp:inline>
+        </w:drawing>
+      </w:r>
+    </w:p>
+    <w:p>
+      <w:pPr>
+        <w:spacing w:before="0" w:after="160"/>
+        <w:jc w:val="center"/>
+      </w:pPr>
+      <w:r>
+        <w:rPr>
+          <w:i/>
+          <w:color w:val="505050"/>
+          <w:sz w:val="17"/>
+        </w:rPr>
+        <w:t>Figure 17: HTTP inference request routed through Kubernetes ingress/service returning JSON prediction payload.</w:t>
+      </w:r>
+    </w:p>
+    <w:p>
+      <w:pPr>
         <w:pStyle w:val="Heading1"/>
         <w:keepNext/>
         <w:spacing w:before="280" w:after="80"/>
@@ -7465,6 +8059,114 @@
       <w:pPr>
         <w:spacing w:before="40" w:after="80"/>
       </w:pPr>
+    </w:p>
+    <w:p>
+      <w:pPr>
+        <w:spacing w:before="120" w:after="40"/>
+        <w:jc w:val="center"/>
+      </w:pPr>
+      <w:r>
+        <w:drawing>
+          <wp:inline xmlns:a="http://schemas.openxmlformats.org/drawingml/2006/main" xmlns:pic="http://schemas.openxmlformats.org/drawingml/2006/picture">
+            <wp:extent cx="5669280" cy="1970075"/>
+            <wp:docPr id="18" name="Picture 18"/>
+            <wp:cNvGraphicFramePr>
+              <a:graphicFrameLocks noChangeAspect="1"/>
+            </wp:cNvGraphicFramePr>
+            <a:graphic>
+              <a:graphicData uri="http://schemas.openxmlformats.org/drawingml/2006/picture">
+                <pic:pic>
+                  <pic:nvPicPr>
+                    <pic:cNvPr id="0" name="13_api_logs.png"/>
+                    <pic:cNvPicPr/>
+                  </pic:nvPicPr>
+                  <pic:blipFill>
+                    <a:blip r:embed="rId26"/>
+                    <a:stretch>
+                      <a:fillRect/>
+                    </a:stretch>
+                  </pic:blipFill>
+                  <pic:spPr>
+                    <a:xfrm>
+                      <a:off x="0" y="0"/>
+                      <a:ext cx="5669280" cy="1970075"/>
+                    </a:xfrm>
+                    <a:prstGeom prst="rect"/>
+                  </pic:spPr>
+                </pic:pic>
+              </a:graphicData>
+            </a:graphic>
+          </wp:inline>
+        </w:drawing>
+      </w:r>
+    </w:p>
+    <w:p>
+      <w:pPr>
+        <w:spacing w:before="0" w:after="160"/>
+        <w:jc w:val="center"/>
+      </w:pPr>
+      <w:r>
+        <w:rPr>
+          <w:i/>
+          <w:color w:val="505050"/>
+          <w:sz w:val="17"/>
+        </w:rPr>
+        <w:t>Figure 18: Production container logs exhibiting structured JSON telemetry without raw patient PII.</w:t>
+      </w:r>
+    </w:p>
+    <w:p>
+      <w:pPr>
+        <w:spacing w:before="120" w:after="40"/>
+        <w:jc w:val="center"/>
+      </w:pPr>
+      <w:r>
+        <w:drawing>
+          <wp:inline xmlns:a="http://schemas.openxmlformats.org/drawingml/2006/main" xmlns:pic="http://schemas.openxmlformats.org/drawingml/2006/picture">
+            <wp:extent cx="5669280" cy="3873287"/>
+            <wp:docPr id="19" name="Picture 19"/>
+            <wp:cNvGraphicFramePr>
+              <a:graphicFrameLocks noChangeAspect="1"/>
+            </wp:cNvGraphicFramePr>
+            <a:graphic>
+              <a:graphicData uri="http://schemas.openxmlformats.org/drawingml/2006/picture">
+                <pic:pic>
+                  <pic:nvPicPr>
+                    <pic:cNvPr id="0" name="14_grafana_dashboard.png"/>
+                    <pic:cNvPicPr/>
+                  </pic:nvPicPr>
+                  <pic:blipFill>
+                    <a:blip r:embed="rId27"/>
+                    <a:stretch>
+                      <a:fillRect/>
+                    </a:stretch>
+                  </pic:blipFill>
+                  <pic:spPr>
+                    <a:xfrm>
+                      <a:off x="0" y="0"/>
+                      <a:ext cx="5669280" cy="3873287"/>
+                    </a:xfrm>
+                    <a:prstGeom prst="rect"/>
+                  </pic:spPr>
+                </pic:pic>
+              </a:graphicData>
+            </a:graphic>
+          </wp:inline>
+        </w:drawing>
+      </w:r>
+    </w:p>
+    <w:p>
+      <w:pPr>
+        <w:spacing w:before="0" w:after="160"/>
+        <w:jc w:val="center"/>
+      </w:pPr>
+      <w:r>
+        <w:rPr>
+          <w:i/>
+          <w:color w:val="505050"/>
+          <w:sz w:val="17"/>
+        </w:rPr>
+        <w:t>Figure 19: Grafana production monitoring dashboard displaying live request rate, p95 latency, and prediction distribution.</w:t>
+      </w:r>
     </w:p>
     <w:p>
       <w:pPr>

</xml_diff>

<commit_message>
Synchronize MLOps report: exact grid_size=6, section numbering, table captions, and clean reproduction commands
</commit_message>
<xml_diff>
--- a/MLOps_Report.docx
+++ b/MLOps_Report.docx
@@ -247,7 +247,7 @@
                 <w:color w:val="1E1E1E"/>
                 <w:sz w:val="17"/>
               </w:rPr>
-              <w:t>UCI Heart Disease (Cleveland), 303 patients, 13 features</w:t>
+              <w:t>UCI Heart Disease (Cleveland), 303 patients, 13 features + target (14 attributes total)</w:t>
             </w:r>
           </w:p>
         </w:tc>
@@ -487,7 +487,7 @@
       <w:pPr>
         <w:pStyle w:val="Heading2"/>
         <w:keepNext/>
-        <w:spacing w:before="140" w:after="40"/>
+        <w:spacing w:before="120" w:after="40"/>
       </w:pPr>
       <w:r>
         <w:rPr>
@@ -639,13 +639,13 @@
       <w:pPr>
         <w:pStyle w:val="Heading1"/>
         <w:keepNext/>
-        <w:spacing w:before="200" w:after="40"/>
+        <w:spacing w:before="180" w:after="40"/>
       </w:pPr>
       <w:r>
         <w:rPr>
           <w:b/>
           <w:color w:val="1B365D"/>
-          <w:sz w:val="26"/>
+          <w:sz w:val="25"/>
         </w:rPr>
         <w:t>1. Problem, dataset and solution overview</w:t>
       </w:r>
@@ -688,6 +688,20 @@
         <w:t>The canonical UCI Cleveland Heart Disease benchmark (Janosi et al., 1989; Dua &amp; Graff, 2019) is the primary cohort in clinical machine learning literature. The dataset contains 303 patient records and 13 clinical predictors alongside the angiographic disease diagnosis 'num' (0 = absence; 1–4 = presence of coronary artery disease). Under standard clinical AI protocol, num &gt; 0 is binarized to target = 1.</w:t>
       </w:r>
     </w:p>
+    <w:p>
+      <w:pPr>
+        <w:keepNext/>
+        <w:spacing w:before="80" w:after="40"/>
+      </w:pPr>
+      <w:r>
+        <w:rPr>
+          <w:b/>
+          <w:color w:val="1B365D"/>
+          <w:sz w:val="17"/>
+        </w:rPr>
+        <w:t>Table 1: UCI Cleveland Clinical Feature Schema (13 Predictors + Target)</w:t>
+      </w:r>
+    </w:p>
     <w:tbl>
       <w:tblPr>
         <w:tblW w:type="auto" w:w="0"/>
@@ -713,10 +727,10 @@
             <w:tcW w:type="dxa" w:w="1584"/>
             <w:shd w:fill="1B365D"/>
             <w:tcMar>
-              <w:top w:w="80" w:type="dxa"/>
-              <w:bottom w:w="80" w:type="dxa"/>
-              <w:left w:w="100" w:type="dxa"/>
-              <w:right w:w="100" w:type="dxa"/>
+              <w:top w:w="75" w:type="dxa"/>
+              <w:bottom w:w="75" w:type="dxa"/>
+              <w:left w:w="95" w:type="dxa"/>
+              <w:right w:w="95" w:type="dxa"/>
             </w:tcMar>
           </w:tcPr>
           <w:p>
@@ -738,10 +752,10 @@
             <w:tcW w:type="dxa" w:w="6192"/>
             <w:shd w:fill="1B365D"/>
             <w:tcMar>
-              <w:top w:w="80" w:type="dxa"/>
-              <w:bottom w:w="80" w:type="dxa"/>
-              <w:left w:w="100" w:type="dxa"/>
-              <w:right w:w="100" w:type="dxa"/>
+              <w:top w:w="75" w:type="dxa"/>
+              <w:bottom w:w="75" w:type="dxa"/>
+              <w:left w:w="95" w:type="dxa"/>
+              <w:right w:w="95" w:type="dxa"/>
             </w:tcMar>
           </w:tcPr>
           <w:p>
@@ -763,10 +777,10 @@
             <w:tcW w:type="dxa" w:w="2016"/>
             <w:shd w:fill="1B365D"/>
             <w:tcMar>
-              <w:top w:w="80" w:type="dxa"/>
-              <w:bottom w:w="80" w:type="dxa"/>
-              <w:left w:w="100" w:type="dxa"/>
-              <w:right w:w="100" w:type="dxa"/>
+              <w:top w:w="75" w:type="dxa"/>
+              <w:bottom w:w="75" w:type="dxa"/>
+              <w:left w:w="95" w:type="dxa"/>
+              <w:right w:w="95" w:type="dxa"/>
             </w:tcMar>
           </w:tcPr>
           <w:p>
@@ -790,10 +804,10 @@
             <w:tcW w:type="dxa" w:w="1584"/>
             <w:shd w:fill="F7F9FB"/>
             <w:tcMar>
-              <w:top w:w="55" w:type="dxa"/>
-              <w:bottom w:w="55" w:type="dxa"/>
-              <w:left w:w="100" w:type="dxa"/>
-              <w:right w:w="100" w:type="dxa"/>
+              <w:top w:w="50" w:type="dxa"/>
+              <w:bottom w:w="50" w:type="dxa"/>
+              <w:left w:w="95" w:type="dxa"/>
+              <w:right w:w="95" w:type="dxa"/>
             </w:tcMar>
           </w:tcPr>
           <w:p>
@@ -814,10 +828,10 @@
             <w:tcW w:type="dxa" w:w="6192"/>
             <w:shd w:fill="F7F9FB"/>
             <w:tcMar>
-              <w:top w:w="55" w:type="dxa"/>
-              <w:bottom w:w="55" w:type="dxa"/>
-              <w:left w:w="100" w:type="dxa"/>
-              <w:right w:w="100" w:type="dxa"/>
+              <w:top w:w="50" w:type="dxa"/>
+              <w:bottom w:w="50" w:type="dxa"/>
+              <w:left w:w="95" w:type="dxa"/>
+              <w:right w:w="95" w:type="dxa"/>
             </w:tcMar>
           </w:tcPr>
           <w:p>
@@ -838,10 +852,10 @@
             <w:tcW w:type="dxa" w:w="2016"/>
             <w:shd w:fill="F7F9FB"/>
             <w:tcMar>
-              <w:top w:w="55" w:type="dxa"/>
-              <w:bottom w:w="55" w:type="dxa"/>
-              <w:left w:w="100" w:type="dxa"/>
-              <w:right w:w="100" w:type="dxa"/>
+              <w:top w:w="50" w:type="dxa"/>
+              <w:bottom w:w="50" w:type="dxa"/>
+              <w:left w:w="95" w:type="dxa"/>
+              <w:right w:w="95" w:type="dxa"/>
             </w:tcMar>
           </w:tcPr>
           <w:p>
@@ -864,10 +878,10 @@
             <w:tcW w:type="dxa" w:w="1584"/>
             <w:shd w:fill="FFFFFF"/>
             <w:tcMar>
-              <w:top w:w="55" w:type="dxa"/>
-              <w:bottom w:w="55" w:type="dxa"/>
-              <w:left w:w="100" w:type="dxa"/>
-              <w:right w:w="100" w:type="dxa"/>
+              <w:top w:w="50" w:type="dxa"/>
+              <w:bottom w:w="50" w:type="dxa"/>
+              <w:left w:w="95" w:type="dxa"/>
+              <w:right w:w="95" w:type="dxa"/>
             </w:tcMar>
           </w:tcPr>
           <w:p>
@@ -888,10 +902,10 @@
             <w:tcW w:type="dxa" w:w="6192"/>
             <w:shd w:fill="FFFFFF"/>
             <w:tcMar>
-              <w:top w:w="55" w:type="dxa"/>
-              <w:bottom w:w="55" w:type="dxa"/>
-              <w:left w:w="100" w:type="dxa"/>
-              <w:right w:w="100" w:type="dxa"/>
+              <w:top w:w="50" w:type="dxa"/>
+              <w:bottom w:w="50" w:type="dxa"/>
+              <w:left w:w="95" w:type="dxa"/>
+              <w:right w:w="95" w:type="dxa"/>
             </w:tcMar>
           </w:tcPr>
           <w:p>
@@ -912,10 +926,10 @@
             <w:tcW w:type="dxa" w:w="2016"/>
             <w:shd w:fill="FFFFFF"/>
             <w:tcMar>
-              <w:top w:w="55" w:type="dxa"/>
-              <w:bottom w:w="55" w:type="dxa"/>
-              <w:left w:w="100" w:type="dxa"/>
-              <w:right w:w="100" w:type="dxa"/>
+              <w:top w:w="50" w:type="dxa"/>
+              <w:bottom w:w="50" w:type="dxa"/>
+              <w:left w:w="95" w:type="dxa"/>
+              <w:right w:w="95" w:type="dxa"/>
             </w:tcMar>
           </w:tcPr>
           <w:p>
@@ -938,10 +952,10 @@
             <w:tcW w:type="dxa" w:w="1584"/>
             <w:shd w:fill="F7F9FB"/>
             <w:tcMar>
-              <w:top w:w="55" w:type="dxa"/>
-              <w:bottom w:w="55" w:type="dxa"/>
-              <w:left w:w="100" w:type="dxa"/>
-              <w:right w:w="100" w:type="dxa"/>
+              <w:top w:w="50" w:type="dxa"/>
+              <w:bottom w:w="50" w:type="dxa"/>
+              <w:left w:w="95" w:type="dxa"/>
+              <w:right w:w="95" w:type="dxa"/>
             </w:tcMar>
           </w:tcPr>
           <w:p>
@@ -962,10 +976,10 @@
             <w:tcW w:type="dxa" w:w="6192"/>
             <w:shd w:fill="F7F9FB"/>
             <w:tcMar>
-              <w:top w:w="55" w:type="dxa"/>
-              <w:bottom w:w="55" w:type="dxa"/>
-              <w:left w:w="100" w:type="dxa"/>
-              <w:right w:w="100" w:type="dxa"/>
+              <w:top w:w="50" w:type="dxa"/>
+              <w:bottom w:w="50" w:type="dxa"/>
+              <w:left w:w="95" w:type="dxa"/>
+              <w:right w:w="95" w:type="dxa"/>
             </w:tcMar>
           </w:tcPr>
           <w:p>
@@ -986,10 +1000,10 @@
             <w:tcW w:type="dxa" w:w="2016"/>
             <w:shd w:fill="F7F9FB"/>
             <w:tcMar>
-              <w:top w:w="55" w:type="dxa"/>
-              <w:bottom w:w="55" w:type="dxa"/>
-              <w:left w:w="100" w:type="dxa"/>
-              <w:right w:w="100" w:type="dxa"/>
+              <w:top w:w="50" w:type="dxa"/>
+              <w:bottom w:w="50" w:type="dxa"/>
+              <w:left w:w="95" w:type="dxa"/>
+              <w:right w:w="95" w:type="dxa"/>
             </w:tcMar>
           </w:tcPr>
           <w:p>
@@ -1012,10 +1026,10 @@
             <w:tcW w:type="dxa" w:w="1584"/>
             <w:shd w:fill="FFFFFF"/>
             <w:tcMar>
-              <w:top w:w="55" w:type="dxa"/>
-              <w:bottom w:w="55" w:type="dxa"/>
-              <w:left w:w="100" w:type="dxa"/>
-              <w:right w:w="100" w:type="dxa"/>
+              <w:top w:w="50" w:type="dxa"/>
+              <w:bottom w:w="50" w:type="dxa"/>
+              <w:left w:w="95" w:type="dxa"/>
+              <w:right w:w="95" w:type="dxa"/>
             </w:tcMar>
           </w:tcPr>
           <w:p>
@@ -1036,10 +1050,10 @@
             <w:tcW w:type="dxa" w:w="6192"/>
             <w:shd w:fill="FFFFFF"/>
             <w:tcMar>
-              <w:top w:w="55" w:type="dxa"/>
-              <w:bottom w:w="55" w:type="dxa"/>
-              <w:left w:w="100" w:type="dxa"/>
-              <w:right w:w="100" w:type="dxa"/>
+              <w:top w:w="50" w:type="dxa"/>
+              <w:bottom w:w="50" w:type="dxa"/>
+              <w:left w:w="95" w:type="dxa"/>
+              <w:right w:w="95" w:type="dxa"/>
             </w:tcMar>
           </w:tcPr>
           <w:p>
@@ -1060,10 +1074,10 @@
             <w:tcW w:type="dxa" w:w="2016"/>
             <w:shd w:fill="FFFFFF"/>
             <w:tcMar>
-              <w:top w:w="55" w:type="dxa"/>
-              <w:bottom w:w="55" w:type="dxa"/>
-              <w:left w:w="100" w:type="dxa"/>
-              <w:right w:w="100" w:type="dxa"/>
+              <w:top w:w="50" w:type="dxa"/>
+              <w:bottom w:w="50" w:type="dxa"/>
+              <w:left w:w="95" w:type="dxa"/>
+              <w:right w:w="95" w:type="dxa"/>
             </w:tcMar>
           </w:tcPr>
           <w:p>
@@ -1086,10 +1100,10 @@
             <w:tcW w:type="dxa" w:w="1584"/>
             <w:shd w:fill="F7F9FB"/>
             <w:tcMar>
-              <w:top w:w="55" w:type="dxa"/>
-              <w:bottom w:w="55" w:type="dxa"/>
-              <w:left w:w="100" w:type="dxa"/>
-              <w:right w:w="100" w:type="dxa"/>
+              <w:top w:w="50" w:type="dxa"/>
+              <w:bottom w:w="50" w:type="dxa"/>
+              <w:left w:w="95" w:type="dxa"/>
+              <w:right w:w="95" w:type="dxa"/>
             </w:tcMar>
           </w:tcPr>
           <w:p>
@@ -1110,10 +1124,10 @@
             <w:tcW w:type="dxa" w:w="6192"/>
             <w:shd w:fill="F7F9FB"/>
             <w:tcMar>
-              <w:top w:w="55" w:type="dxa"/>
-              <w:bottom w:w="55" w:type="dxa"/>
-              <w:left w:w="100" w:type="dxa"/>
-              <w:right w:w="100" w:type="dxa"/>
+              <w:top w:w="50" w:type="dxa"/>
+              <w:bottom w:w="50" w:type="dxa"/>
+              <w:left w:w="95" w:type="dxa"/>
+              <w:right w:w="95" w:type="dxa"/>
             </w:tcMar>
           </w:tcPr>
           <w:p>
@@ -1134,10 +1148,10 @@
             <w:tcW w:type="dxa" w:w="2016"/>
             <w:shd w:fill="F7F9FB"/>
             <w:tcMar>
-              <w:top w:w="55" w:type="dxa"/>
-              <w:bottom w:w="55" w:type="dxa"/>
-              <w:left w:w="100" w:type="dxa"/>
-              <w:right w:w="100" w:type="dxa"/>
+              <w:top w:w="50" w:type="dxa"/>
+              <w:bottom w:w="50" w:type="dxa"/>
+              <w:left w:w="95" w:type="dxa"/>
+              <w:right w:w="95" w:type="dxa"/>
             </w:tcMar>
           </w:tcPr>
           <w:p>
@@ -1160,10 +1174,10 @@
             <w:tcW w:type="dxa" w:w="1584"/>
             <w:shd w:fill="FFFFFF"/>
             <w:tcMar>
-              <w:top w:w="55" w:type="dxa"/>
-              <w:bottom w:w="55" w:type="dxa"/>
-              <w:left w:w="100" w:type="dxa"/>
-              <w:right w:w="100" w:type="dxa"/>
+              <w:top w:w="50" w:type="dxa"/>
+              <w:bottom w:w="50" w:type="dxa"/>
+              <w:left w:w="95" w:type="dxa"/>
+              <w:right w:w="95" w:type="dxa"/>
             </w:tcMar>
           </w:tcPr>
           <w:p>
@@ -1184,10 +1198,10 @@
             <w:tcW w:type="dxa" w:w="6192"/>
             <w:shd w:fill="FFFFFF"/>
             <w:tcMar>
-              <w:top w:w="55" w:type="dxa"/>
-              <w:bottom w:w="55" w:type="dxa"/>
-              <w:left w:w="100" w:type="dxa"/>
-              <w:right w:w="100" w:type="dxa"/>
+              <w:top w:w="50" w:type="dxa"/>
+              <w:bottom w:w="50" w:type="dxa"/>
+              <w:left w:w="95" w:type="dxa"/>
+              <w:right w:w="95" w:type="dxa"/>
             </w:tcMar>
           </w:tcPr>
           <w:p>
@@ -1208,10 +1222,10 @@
             <w:tcW w:type="dxa" w:w="2016"/>
             <w:shd w:fill="FFFFFF"/>
             <w:tcMar>
-              <w:top w:w="55" w:type="dxa"/>
-              <w:bottom w:w="55" w:type="dxa"/>
-              <w:left w:w="100" w:type="dxa"/>
-              <w:right w:w="100" w:type="dxa"/>
+              <w:top w:w="50" w:type="dxa"/>
+              <w:bottom w:w="50" w:type="dxa"/>
+              <w:left w:w="95" w:type="dxa"/>
+              <w:right w:w="95" w:type="dxa"/>
             </w:tcMar>
           </w:tcPr>
           <w:p>
@@ -1234,10 +1248,10 @@
             <w:tcW w:type="dxa" w:w="1584"/>
             <w:shd w:fill="F7F9FB"/>
             <w:tcMar>
-              <w:top w:w="55" w:type="dxa"/>
-              <w:bottom w:w="55" w:type="dxa"/>
-              <w:left w:w="100" w:type="dxa"/>
-              <w:right w:w="100" w:type="dxa"/>
+              <w:top w:w="50" w:type="dxa"/>
+              <w:bottom w:w="50" w:type="dxa"/>
+              <w:left w:w="95" w:type="dxa"/>
+              <w:right w:w="95" w:type="dxa"/>
             </w:tcMar>
           </w:tcPr>
           <w:p>
@@ -1258,10 +1272,10 @@
             <w:tcW w:type="dxa" w:w="6192"/>
             <w:shd w:fill="F7F9FB"/>
             <w:tcMar>
-              <w:top w:w="55" w:type="dxa"/>
-              <w:bottom w:w="55" w:type="dxa"/>
-              <w:left w:w="100" w:type="dxa"/>
-              <w:right w:w="100" w:type="dxa"/>
+              <w:top w:w="50" w:type="dxa"/>
+              <w:bottom w:w="50" w:type="dxa"/>
+              <w:left w:w="95" w:type="dxa"/>
+              <w:right w:w="95" w:type="dxa"/>
             </w:tcMar>
           </w:tcPr>
           <w:p>
@@ -1282,10 +1296,10 @@
             <w:tcW w:type="dxa" w:w="2016"/>
             <w:shd w:fill="F7F9FB"/>
             <w:tcMar>
-              <w:top w:w="55" w:type="dxa"/>
-              <w:bottom w:w="55" w:type="dxa"/>
-              <w:left w:w="100" w:type="dxa"/>
-              <w:right w:w="100" w:type="dxa"/>
+              <w:top w:w="50" w:type="dxa"/>
+              <w:bottom w:w="50" w:type="dxa"/>
+              <w:left w:w="95" w:type="dxa"/>
+              <w:right w:w="95" w:type="dxa"/>
             </w:tcMar>
           </w:tcPr>
           <w:p>
@@ -1308,10 +1322,10 @@
             <w:tcW w:type="dxa" w:w="1584"/>
             <w:shd w:fill="FFFFFF"/>
             <w:tcMar>
-              <w:top w:w="55" w:type="dxa"/>
-              <w:bottom w:w="55" w:type="dxa"/>
-              <w:left w:w="100" w:type="dxa"/>
-              <w:right w:w="100" w:type="dxa"/>
+              <w:top w:w="50" w:type="dxa"/>
+              <w:bottom w:w="50" w:type="dxa"/>
+              <w:left w:w="95" w:type="dxa"/>
+              <w:right w:w="95" w:type="dxa"/>
             </w:tcMar>
           </w:tcPr>
           <w:p>
@@ -1332,10 +1346,10 @@
             <w:tcW w:type="dxa" w:w="6192"/>
             <w:shd w:fill="FFFFFF"/>
             <w:tcMar>
-              <w:top w:w="55" w:type="dxa"/>
-              <w:bottom w:w="55" w:type="dxa"/>
-              <w:left w:w="100" w:type="dxa"/>
-              <w:right w:w="100" w:type="dxa"/>
+              <w:top w:w="50" w:type="dxa"/>
+              <w:bottom w:w="50" w:type="dxa"/>
+              <w:left w:w="95" w:type="dxa"/>
+              <w:right w:w="95" w:type="dxa"/>
             </w:tcMar>
           </w:tcPr>
           <w:p>
@@ -1356,10 +1370,10 @@
             <w:tcW w:type="dxa" w:w="2016"/>
             <w:shd w:fill="FFFFFF"/>
             <w:tcMar>
-              <w:top w:w="55" w:type="dxa"/>
-              <w:bottom w:w="55" w:type="dxa"/>
-              <w:left w:w="100" w:type="dxa"/>
-              <w:right w:w="100" w:type="dxa"/>
+              <w:top w:w="50" w:type="dxa"/>
+              <w:bottom w:w="50" w:type="dxa"/>
+              <w:left w:w="95" w:type="dxa"/>
+              <w:right w:w="95" w:type="dxa"/>
             </w:tcMar>
           </w:tcPr>
           <w:p>
@@ -1382,10 +1396,10 @@
             <w:tcW w:type="dxa" w:w="1584"/>
             <w:shd w:fill="F7F9FB"/>
             <w:tcMar>
-              <w:top w:w="55" w:type="dxa"/>
-              <w:bottom w:w="55" w:type="dxa"/>
-              <w:left w:w="100" w:type="dxa"/>
-              <w:right w:w="100" w:type="dxa"/>
+              <w:top w:w="50" w:type="dxa"/>
+              <w:bottom w:w="50" w:type="dxa"/>
+              <w:left w:w="95" w:type="dxa"/>
+              <w:right w:w="95" w:type="dxa"/>
             </w:tcMar>
           </w:tcPr>
           <w:p>
@@ -1406,10 +1420,10 @@
             <w:tcW w:type="dxa" w:w="6192"/>
             <w:shd w:fill="F7F9FB"/>
             <w:tcMar>
-              <w:top w:w="55" w:type="dxa"/>
-              <w:bottom w:w="55" w:type="dxa"/>
-              <w:left w:w="100" w:type="dxa"/>
-              <w:right w:w="100" w:type="dxa"/>
+              <w:top w:w="50" w:type="dxa"/>
+              <w:bottom w:w="50" w:type="dxa"/>
+              <w:left w:w="95" w:type="dxa"/>
+              <w:right w:w="95" w:type="dxa"/>
             </w:tcMar>
           </w:tcPr>
           <w:p>
@@ -1430,10 +1444,10 @@
             <w:tcW w:type="dxa" w:w="2016"/>
             <w:shd w:fill="F7F9FB"/>
             <w:tcMar>
-              <w:top w:w="55" w:type="dxa"/>
-              <w:bottom w:w="55" w:type="dxa"/>
-              <w:left w:w="100" w:type="dxa"/>
-              <w:right w:w="100" w:type="dxa"/>
+              <w:top w:w="50" w:type="dxa"/>
+              <w:bottom w:w="50" w:type="dxa"/>
+              <w:left w:w="95" w:type="dxa"/>
+              <w:right w:w="95" w:type="dxa"/>
             </w:tcMar>
           </w:tcPr>
           <w:p>
@@ -1456,10 +1470,10 @@
             <w:tcW w:type="dxa" w:w="1584"/>
             <w:shd w:fill="FFFFFF"/>
             <w:tcMar>
-              <w:top w:w="55" w:type="dxa"/>
-              <w:bottom w:w="55" w:type="dxa"/>
-              <w:left w:w="100" w:type="dxa"/>
-              <w:right w:w="100" w:type="dxa"/>
+              <w:top w:w="50" w:type="dxa"/>
+              <w:bottom w:w="50" w:type="dxa"/>
+              <w:left w:w="95" w:type="dxa"/>
+              <w:right w:w="95" w:type="dxa"/>
             </w:tcMar>
           </w:tcPr>
           <w:p>
@@ -1480,10 +1494,10 @@
             <w:tcW w:type="dxa" w:w="6192"/>
             <w:shd w:fill="FFFFFF"/>
             <w:tcMar>
-              <w:top w:w="55" w:type="dxa"/>
-              <w:bottom w:w="55" w:type="dxa"/>
-              <w:left w:w="100" w:type="dxa"/>
-              <w:right w:w="100" w:type="dxa"/>
+              <w:top w:w="50" w:type="dxa"/>
+              <w:bottom w:w="50" w:type="dxa"/>
+              <w:left w:w="95" w:type="dxa"/>
+              <w:right w:w="95" w:type="dxa"/>
             </w:tcMar>
           </w:tcPr>
           <w:p>
@@ -1504,10 +1518,10 @@
             <w:tcW w:type="dxa" w:w="2016"/>
             <w:shd w:fill="FFFFFF"/>
             <w:tcMar>
-              <w:top w:w="55" w:type="dxa"/>
-              <w:bottom w:w="55" w:type="dxa"/>
-              <w:left w:w="100" w:type="dxa"/>
-              <w:right w:w="100" w:type="dxa"/>
+              <w:top w:w="50" w:type="dxa"/>
+              <w:bottom w:w="50" w:type="dxa"/>
+              <w:left w:w="95" w:type="dxa"/>
+              <w:right w:w="95" w:type="dxa"/>
             </w:tcMar>
           </w:tcPr>
           <w:p>
@@ -1530,10 +1544,10 @@
             <w:tcW w:type="dxa" w:w="1584"/>
             <w:shd w:fill="F7F9FB"/>
             <w:tcMar>
-              <w:top w:w="55" w:type="dxa"/>
-              <w:bottom w:w="55" w:type="dxa"/>
-              <w:left w:w="100" w:type="dxa"/>
-              <w:right w:w="100" w:type="dxa"/>
+              <w:top w:w="50" w:type="dxa"/>
+              <w:bottom w:w="50" w:type="dxa"/>
+              <w:left w:w="95" w:type="dxa"/>
+              <w:right w:w="95" w:type="dxa"/>
             </w:tcMar>
           </w:tcPr>
           <w:p>
@@ -1554,10 +1568,10 @@
             <w:tcW w:type="dxa" w:w="6192"/>
             <w:shd w:fill="F7F9FB"/>
             <w:tcMar>
-              <w:top w:w="55" w:type="dxa"/>
-              <w:bottom w:w="55" w:type="dxa"/>
-              <w:left w:w="100" w:type="dxa"/>
-              <w:right w:w="100" w:type="dxa"/>
+              <w:top w:w="50" w:type="dxa"/>
+              <w:bottom w:w="50" w:type="dxa"/>
+              <w:left w:w="95" w:type="dxa"/>
+              <w:right w:w="95" w:type="dxa"/>
             </w:tcMar>
           </w:tcPr>
           <w:p>
@@ -1578,10 +1592,10 @@
             <w:tcW w:type="dxa" w:w="2016"/>
             <w:shd w:fill="F7F9FB"/>
             <w:tcMar>
-              <w:top w:w="55" w:type="dxa"/>
-              <w:bottom w:w="55" w:type="dxa"/>
-              <w:left w:w="100" w:type="dxa"/>
-              <w:right w:w="100" w:type="dxa"/>
+              <w:top w:w="50" w:type="dxa"/>
+              <w:bottom w:w="50" w:type="dxa"/>
+              <w:left w:w="95" w:type="dxa"/>
+              <w:right w:w="95" w:type="dxa"/>
             </w:tcMar>
           </w:tcPr>
           <w:p>
@@ -1604,10 +1618,10 @@
             <w:tcW w:type="dxa" w:w="1584"/>
             <w:shd w:fill="FFFFFF"/>
             <w:tcMar>
-              <w:top w:w="55" w:type="dxa"/>
-              <w:bottom w:w="55" w:type="dxa"/>
-              <w:left w:w="100" w:type="dxa"/>
-              <w:right w:w="100" w:type="dxa"/>
+              <w:top w:w="50" w:type="dxa"/>
+              <w:bottom w:w="50" w:type="dxa"/>
+              <w:left w:w="95" w:type="dxa"/>
+              <w:right w:w="95" w:type="dxa"/>
             </w:tcMar>
           </w:tcPr>
           <w:p>
@@ -1628,10 +1642,10 @@
             <w:tcW w:type="dxa" w:w="6192"/>
             <w:shd w:fill="FFFFFF"/>
             <w:tcMar>
-              <w:top w:w="55" w:type="dxa"/>
-              <w:bottom w:w="55" w:type="dxa"/>
-              <w:left w:w="100" w:type="dxa"/>
-              <w:right w:w="100" w:type="dxa"/>
+              <w:top w:w="50" w:type="dxa"/>
+              <w:bottom w:w="50" w:type="dxa"/>
+              <w:left w:w="95" w:type="dxa"/>
+              <w:right w:w="95" w:type="dxa"/>
             </w:tcMar>
           </w:tcPr>
           <w:p>
@@ -1652,10 +1666,10 @@
             <w:tcW w:type="dxa" w:w="2016"/>
             <w:shd w:fill="FFFFFF"/>
             <w:tcMar>
-              <w:top w:w="55" w:type="dxa"/>
-              <w:bottom w:w="55" w:type="dxa"/>
-              <w:left w:w="100" w:type="dxa"/>
-              <w:right w:w="100" w:type="dxa"/>
+              <w:top w:w="50" w:type="dxa"/>
+              <w:bottom w:w="50" w:type="dxa"/>
+              <w:left w:w="95" w:type="dxa"/>
+              <w:right w:w="95" w:type="dxa"/>
             </w:tcMar>
           </w:tcPr>
           <w:p>
@@ -1678,10 +1692,10 @@
             <w:tcW w:type="dxa" w:w="1584"/>
             <w:shd w:fill="F7F9FB"/>
             <w:tcMar>
-              <w:top w:w="55" w:type="dxa"/>
-              <w:bottom w:w="55" w:type="dxa"/>
-              <w:left w:w="100" w:type="dxa"/>
-              <w:right w:w="100" w:type="dxa"/>
+              <w:top w:w="50" w:type="dxa"/>
+              <w:bottom w:w="50" w:type="dxa"/>
+              <w:left w:w="95" w:type="dxa"/>
+              <w:right w:w="95" w:type="dxa"/>
             </w:tcMar>
           </w:tcPr>
           <w:p>
@@ -1702,10 +1716,10 @@
             <w:tcW w:type="dxa" w:w="6192"/>
             <w:shd w:fill="F7F9FB"/>
             <w:tcMar>
-              <w:top w:w="55" w:type="dxa"/>
-              <w:bottom w:w="55" w:type="dxa"/>
-              <w:left w:w="100" w:type="dxa"/>
-              <w:right w:w="100" w:type="dxa"/>
+              <w:top w:w="50" w:type="dxa"/>
+              <w:bottom w:w="50" w:type="dxa"/>
+              <w:left w:w="95" w:type="dxa"/>
+              <w:right w:w="95" w:type="dxa"/>
             </w:tcMar>
           </w:tcPr>
           <w:p>
@@ -1726,10 +1740,10 @@
             <w:tcW w:type="dxa" w:w="2016"/>
             <w:shd w:fill="F7F9FB"/>
             <w:tcMar>
-              <w:top w:w="55" w:type="dxa"/>
-              <w:bottom w:w="55" w:type="dxa"/>
-              <w:left w:w="100" w:type="dxa"/>
-              <w:right w:w="100" w:type="dxa"/>
+              <w:top w:w="50" w:type="dxa"/>
+              <w:bottom w:w="50" w:type="dxa"/>
+              <w:left w:w="95" w:type="dxa"/>
+              <w:right w:w="95" w:type="dxa"/>
             </w:tcMar>
           </w:tcPr>
           <w:p>
@@ -1752,10 +1766,10 @@
             <w:tcW w:type="dxa" w:w="1584"/>
             <w:shd w:fill="FFFFFF"/>
             <w:tcMar>
-              <w:top w:w="55" w:type="dxa"/>
-              <w:bottom w:w="55" w:type="dxa"/>
-              <w:left w:w="100" w:type="dxa"/>
-              <w:right w:w="100" w:type="dxa"/>
+              <w:top w:w="50" w:type="dxa"/>
+              <w:bottom w:w="50" w:type="dxa"/>
+              <w:left w:w="95" w:type="dxa"/>
+              <w:right w:w="95" w:type="dxa"/>
             </w:tcMar>
           </w:tcPr>
           <w:p>
@@ -1776,10 +1790,10 @@
             <w:tcW w:type="dxa" w:w="6192"/>
             <w:shd w:fill="FFFFFF"/>
             <w:tcMar>
-              <w:top w:w="55" w:type="dxa"/>
-              <w:bottom w:w="55" w:type="dxa"/>
-              <w:left w:w="100" w:type="dxa"/>
-              <w:right w:w="100" w:type="dxa"/>
+              <w:top w:w="50" w:type="dxa"/>
+              <w:bottom w:w="50" w:type="dxa"/>
+              <w:left w:w="95" w:type="dxa"/>
+              <w:right w:w="95" w:type="dxa"/>
             </w:tcMar>
           </w:tcPr>
           <w:p>
@@ -1800,10 +1814,10 @@
             <w:tcW w:type="dxa" w:w="2016"/>
             <w:shd w:fill="FFFFFF"/>
             <w:tcMar>
-              <w:top w:w="55" w:type="dxa"/>
-              <w:bottom w:w="55" w:type="dxa"/>
-              <w:left w:w="100" w:type="dxa"/>
-              <w:right w:w="100" w:type="dxa"/>
+              <w:top w:w="50" w:type="dxa"/>
+              <w:bottom w:w="50" w:type="dxa"/>
+              <w:left w:w="95" w:type="dxa"/>
+              <w:right w:w="95" w:type="dxa"/>
             </w:tcMar>
           </w:tcPr>
           <w:p>
@@ -1857,7 +1871,7 @@
           <w:color w:val="232323"/>
           <w:sz w:val="19"/>
         </w:rPr>
-        <w:t>scripts/download_data.py downloads UCI data; src/heart/data.py cleans and preserves missing values without data leakage.</w:t>
+        <w:t>scripts/download_data.py downloads UCI data; src/heart/data.py cleans types and preserves missing values without data leakage.</w:t>
       </w:r>
     </w:p>
     <w:p>
@@ -1877,7 +1891,7 @@
           <w:color w:val="232323"/>
           <w:sz w:val="19"/>
         </w:rPr>
-        <w:t>scikit-learn Pipeline (ColumnTransformer + Classifier) evaluated across LR, RF, and GB using 5x3 nested cross-validation.</w:t>
+        <w:t>scikit-learn Pipeline (ColumnTransformer + Classifier) evaluated across LR, RF, and GB using 5 outer folds and 3 inner folds (5x3 nested CV).</w:t>
       </w:r>
     </w:p>
     <w:p>
@@ -1897,7 +1911,7 @@
           <w:color w:val="232323"/>
           <w:sz w:val="19"/>
         </w:rPr>
-        <w:t>MLflow logs hyperparameter grids, cross-validation metrics, test scores, ROC/PR curves, and serialized MLmodel packages.</w:t>
+        <w:t>MLflow logs hyperparameter search grids, cross-validation metrics, test scores, ROC/PR curves, and serialized MLmodel packages.</w:t>
       </w:r>
     </w:p>
     <w:p>
@@ -1962,21 +1976,16 @@
     </w:p>
     <w:p>
       <w:pPr>
-        <w:spacing w:before="0" w:after="40" w:line="269" w:lineRule="auto"/>
+        <w:keepNext/>
+        <w:spacing w:before="80" w:after="40"/>
       </w:pPr>
       <w:r>
         <w:rPr>
           <w:b/>
           <w:color w:val="1B365D"/>
+          <w:sz w:val="17"/>
         </w:rPr>
-        <w:t xml:space="preserve">Headline Results (Held-Out Test Set, N = 61): </w:t>
-      </w:r>
-      <w:r>
-        <w:rPr>
-          <w:color w:val="232323"/>
-          <w:sz w:val="19"/>
-        </w:rPr>
-        <w:t>Table 2 summarizes the unbiased hold-out test set performance across 61 test patients.</w:t>
+        <w:t>Table 2: Headline Hold-Out Test Results (N = 61 Patients)</w:t>
       </w:r>
     </w:p>
     <w:tbl>
@@ -2007,10 +2016,10 @@
             <w:tcW w:type="dxa" w:w="3168"/>
             <w:shd w:fill="1B365D"/>
             <w:tcMar>
-              <w:top w:w="80" w:type="dxa"/>
-              <w:bottom w:w="80" w:type="dxa"/>
-              <w:left w:w="100" w:type="dxa"/>
-              <w:right w:w="100" w:type="dxa"/>
+              <w:top w:w="75" w:type="dxa"/>
+              <w:bottom w:w="75" w:type="dxa"/>
+              <w:left w:w="95" w:type="dxa"/>
+              <w:right w:w="95" w:type="dxa"/>
             </w:tcMar>
           </w:tcPr>
           <w:p>
@@ -2032,10 +2041,10 @@
             <w:tcW w:type="dxa" w:w="1296"/>
             <w:shd w:fill="1B365D"/>
             <w:tcMar>
-              <w:top w:w="80" w:type="dxa"/>
-              <w:bottom w:w="80" w:type="dxa"/>
-              <w:left w:w="100" w:type="dxa"/>
-              <w:right w:w="100" w:type="dxa"/>
+              <w:top w:w="75" w:type="dxa"/>
+              <w:bottom w:w="75" w:type="dxa"/>
+              <w:left w:w="95" w:type="dxa"/>
+              <w:right w:w="95" w:type="dxa"/>
             </w:tcMar>
           </w:tcPr>
           <w:p>
@@ -2057,10 +2066,10 @@
             <w:tcW w:type="dxa" w:w="1296"/>
             <w:shd w:fill="1B365D"/>
             <w:tcMar>
-              <w:top w:w="80" w:type="dxa"/>
-              <w:bottom w:w="80" w:type="dxa"/>
-              <w:left w:w="100" w:type="dxa"/>
-              <w:right w:w="100" w:type="dxa"/>
+              <w:top w:w="75" w:type="dxa"/>
+              <w:bottom w:w="75" w:type="dxa"/>
+              <w:left w:w="95" w:type="dxa"/>
+              <w:right w:w="95" w:type="dxa"/>
             </w:tcMar>
           </w:tcPr>
           <w:p>
@@ -2082,10 +2091,10 @@
             <w:tcW w:type="dxa" w:w="1296"/>
             <w:shd w:fill="1B365D"/>
             <w:tcMar>
-              <w:top w:w="80" w:type="dxa"/>
-              <w:bottom w:w="80" w:type="dxa"/>
-              <w:left w:w="100" w:type="dxa"/>
-              <w:right w:w="100" w:type="dxa"/>
+              <w:top w:w="75" w:type="dxa"/>
+              <w:bottom w:w="75" w:type="dxa"/>
+              <w:left w:w="95" w:type="dxa"/>
+              <w:right w:w="95" w:type="dxa"/>
             </w:tcMar>
           </w:tcPr>
           <w:p>
@@ -2107,10 +2116,10 @@
             <w:tcW w:type="dxa" w:w="1296"/>
             <w:shd w:fill="1B365D"/>
             <w:tcMar>
-              <w:top w:w="80" w:type="dxa"/>
-              <w:bottom w:w="80" w:type="dxa"/>
-              <w:left w:w="100" w:type="dxa"/>
-              <w:right w:w="100" w:type="dxa"/>
+              <w:top w:w="75" w:type="dxa"/>
+              <w:bottom w:w="75" w:type="dxa"/>
+              <w:left w:w="95" w:type="dxa"/>
+              <w:right w:w="95" w:type="dxa"/>
             </w:tcMar>
           </w:tcPr>
           <w:p>
@@ -2132,10 +2141,10 @@
             <w:tcW w:type="dxa" w:w="1440"/>
             <w:shd w:fill="1B365D"/>
             <w:tcMar>
-              <w:top w:w="80" w:type="dxa"/>
-              <w:bottom w:w="80" w:type="dxa"/>
-              <w:left w:w="100" w:type="dxa"/>
-              <w:right w:w="100" w:type="dxa"/>
+              <w:top w:w="75" w:type="dxa"/>
+              <w:bottom w:w="75" w:type="dxa"/>
+              <w:left w:w="95" w:type="dxa"/>
+              <w:right w:w="95" w:type="dxa"/>
             </w:tcMar>
           </w:tcPr>
           <w:p>
@@ -2159,10 +2168,10 @@
             <w:tcW w:type="dxa" w:w="3168"/>
             <w:shd w:fill="F7F9FB"/>
             <w:tcMar>
-              <w:top w:w="55" w:type="dxa"/>
-              <w:bottom w:w="55" w:type="dxa"/>
-              <w:left w:w="100" w:type="dxa"/>
-              <w:right w:w="100" w:type="dxa"/>
+              <w:top w:w="50" w:type="dxa"/>
+              <w:bottom w:w="50" w:type="dxa"/>
+              <w:left w:w="95" w:type="dxa"/>
+              <w:right w:w="95" w:type="dxa"/>
             </w:tcMar>
           </w:tcPr>
           <w:p>
@@ -2183,10 +2192,10 @@
             <w:tcW w:type="dxa" w:w="1296"/>
             <w:shd w:fill="F7F9FB"/>
             <w:tcMar>
-              <w:top w:w="55" w:type="dxa"/>
-              <w:bottom w:w="55" w:type="dxa"/>
-              <w:left w:w="100" w:type="dxa"/>
-              <w:right w:w="100" w:type="dxa"/>
+              <w:top w:w="50" w:type="dxa"/>
+              <w:bottom w:w="50" w:type="dxa"/>
+              <w:left w:w="95" w:type="dxa"/>
+              <w:right w:w="95" w:type="dxa"/>
             </w:tcMar>
           </w:tcPr>
           <w:p>
@@ -2207,10 +2216,10 @@
             <w:tcW w:type="dxa" w:w="1296"/>
             <w:shd w:fill="F7F9FB"/>
             <w:tcMar>
-              <w:top w:w="55" w:type="dxa"/>
-              <w:bottom w:w="55" w:type="dxa"/>
-              <w:left w:w="100" w:type="dxa"/>
-              <w:right w:w="100" w:type="dxa"/>
+              <w:top w:w="50" w:type="dxa"/>
+              <w:bottom w:w="50" w:type="dxa"/>
+              <w:left w:w="95" w:type="dxa"/>
+              <w:right w:w="95" w:type="dxa"/>
             </w:tcMar>
           </w:tcPr>
           <w:p>
@@ -2231,10 +2240,10 @@
             <w:tcW w:type="dxa" w:w="1296"/>
             <w:shd w:fill="F7F9FB"/>
             <w:tcMar>
-              <w:top w:w="55" w:type="dxa"/>
-              <w:bottom w:w="55" w:type="dxa"/>
-              <w:left w:w="100" w:type="dxa"/>
-              <w:right w:w="100" w:type="dxa"/>
+              <w:top w:w="50" w:type="dxa"/>
+              <w:bottom w:w="50" w:type="dxa"/>
+              <w:left w:w="95" w:type="dxa"/>
+              <w:right w:w="95" w:type="dxa"/>
             </w:tcMar>
           </w:tcPr>
           <w:p>
@@ -2255,10 +2264,10 @@
             <w:tcW w:type="dxa" w:w="1296"/>
             <w:shd w:fill="F7F9FB"/>
             <w:tcMar>
-              <w:top w:w="55" w:type="dxa"/>
-              <w:bottom w:w="55" w:type="dxa"/>
-              <w:left w:w="100" w:type="dxa"/>
-              <w:right w:w="100" w:type="dxa"/>
+              <w:top w:w="50" w:type="dxa"/>
+              <w:bottom w:w="50" w:type="dxa"/>
+              <w:left w:w="95" w:type="dxa"/>
+              <w:right w:w="95" w:type="dxa"/>
             </w:tcMar>
           </w:tcPr>
           <w:p>
@@ -2279,10 +2288,10 @@
             <w:tcW w:type="dxa" w:w="1440"/>
             <w:shd w:fill="F7F9FB"/>
             <w:tcMar>
-              <w:top w:w="55" w:type="dxa"/>
-              <w:bottom w:w="55" w:type="dxa"/>
-              <w:left w:w="100" w:type="dxa"/>
-              <w:right w:w="100" w:type="dxa"/>
+              <w:top w:w="50" w:type="dxa"/>
+              <w:bottom w:w="50" w:type="dxa"/>
+              <w:left w:w="95" w:type="dxa"/>
+              <w:right w:w="95" w:type="dxa"/>
             </w:tcMar>
           </w:tcPr>
           <w:p>
@@ -2305,10 +2314,10 @@
             <w:tcW w:type="dxa" w:w="3168"/>
             <w:shd w:fill="FFFFFF"/>
             <w:tcMar>
-              <w:top w:w="55" w:type="dxa"/>
-              <w:bottom w:w="55" w:type="dxa"/>
-              <w:left w:w="100" w:type="dxa"/>
-              <w:right w:w="100" w:type="dxa"/>
+              <w:top w:w="50" w:type="dxa"/>
+              <w:bottom w:w="50" w:type="dxa"/>
+              <w:left w:w="95" w:type="dxa"/>
+              <w:right w:w="95" w:type="dxa"/>
             </w:tcMar>
           </w:tcPr>
           <w:p>
@@ -2329,10 +2338,10 @@
             <w:tcW w:type="dxa" w:w="1296"/>
             <w:shd w:fill="FFFFFF"/>
             <w:tcMar>
-              <w:top w:w="55" w:type="dxa"/>
-              <w:bottom w:w="55" w:type="dxa"/>
-              <w:left w:w="100" w:type="dxa"/>
-              <w:right w:w="100" w:type="dxa"/>
+              <w:top w:w="50" w:type="dxa"/>
+              <w:bottom w:w="50" w:type="dxa"/>
+              <w:left w:w="95" w:type="dxa"/>
+              <w:right w:w="95" w:type="dxa"/>
             </w:tcMar>
           </w:tcPr>
           <w:p>
@@ -2353,10 +2362,10 @@
             <w:tcW w:type="dxa" w:w="1296"/>
             <w:shd w:fill="FFFFFF"/>
             <w:tcMar>
-              <w:top w:w="55" w:type="dxa"/>
-              <w:bottom w:w="55" w:type="dxa"/>
-              <w:left w:w="100" w:type="dxa"/>
-              <w:right w:w="100" w:type="dxa"/>
+              <w:top w:w="50" w:type="dxa"/>
+              <w:bottom w:w="50" w:type="dxa"/>
+              <w:left w:w="95" w:type="dxa"/>
+              <w:right w:w="95" w:type="dxa"/>
             </w:tcMar>
           </w:tcPr>
           <w:p>
@@ -2377,10 +2386,10 @@
             <w:tcW w:type="dxa" w:w="1296"/>
             <w:shd w:fill="FFFFFF"/>
             <w:tcMar>
-              <w:top w:w="55" w:type="dxa"/>
-              <w:bottom w:w="55" w:type="dxa"/>
-              <w:left w:w="100" w:type="dxa"/>
-              <w:right w:w="100" w:type="dxa"/>
+              <w:top w:w="50" w:type="dxa"/>
+              <w:bottom w:w="50" w:type="dxa"/>
+              <w:left w:w="95" w:type="dxa"/>
+              <w:right w:w="95" w:type="dxa"/>
             </w:tcMar>
           </w:tcPr>
           <w:p>
@@ -2401,10 +2410,10 @@
             <w:tcW w:type="dxa" w:w="1296"/>
             <w:shd w:fill="FFFFFF"/>
             <w:tcMar>
-              <w:top w:w="55" w:type="dxa"/>
-              <w:bottom w:w="55" w:type="dxa"/>
-              <w:left w:w="100" w:type="dxa"/>
-              <w:right w:w="100" w:type="dxa"/>
+              <w:top w:w="50" w:type="dxa"/>
+              <w:bottom w:w="50" w:type="dxa"/>
+              <w:left w:w="95" w:type="dxa"/>
+              <w:right w:w="95" w:type="dxa"/>
             </w:tcMar>
           </w:tcPr>
           <w:p>
@@ -2425,10 +2434,10 @@
             <w:tcW w:type="dxa" w:w="1440"/>
             <w:shd w:fill="FFFFFF"/>
             <w:tcMar>
-              <w:top w:w="55" w:type="dxa"/>
-              <w:bottom w:w="55" w:type="dxa"/>
-              <w:left w:w="100" w:type="dxa"/>
-              <w:right w:w="100" w:type="dxa"/>
+              <w:top w:w="50" w:type="dxa"/>
+              <w:bottom w:w="50" w:type="dxa"/>
+              <w:left w:w="95" w:type="dxa"/>
+              <w:right w:w="95" w:type="dxa"/>
             </w:tcMar>
           </w:tcPr>
           <w:p>
@@ -2451,10 +2460,10 @@
             <w:tcW w:type="dxa" w:w="3168"/>
             <w:shd w:fill="F7F9FB"/>
             <w:tcMar>
-              <w:top w:w="55" w:type="dxa"/>
-              <w:bottom w:w="55" w:type="dxa"/>
-              <w:left w:w="100" w:type="dxa"/>
-              <w:right w:w="100" w:type="dxa"/>
+              <w:top w:w="50" w:type="dxa"/>
+              <w:bottom w:w="50" w:type="dxa"/>
+              <w:left w:w="95" w:type="dxa"/>
+              <w:right w:w="95" w:type="dxa"/>
             </w:tcMar>
           </w:tcPr>
           <w:p>
@@ -2475,10 +2484,10 @@
             <w:tcW w:type="dxa" w:w="1296"/>
             <w:shd w:fill="F7F9FB"/>
             <w:tcMar>
-              <w:top w:w="55" w:type="dxa"/>
-              <w:bottom w:w="55" w:type="dxa"/>
-              <w:left w:w="100" w:type="dxa"/>
-              <w:right w:w="100" w:type="dxa"/>
+              <w:top w:w="50" w:type="dxa"/>
+              <w:bottom w:w="50" w:type="dxa"/>
+              <w:left w:w="95" w:type="dxa"/>
+              <w:right w:w="95" w:type="dxa"/>
             </w:tcMar>
           </w:tcPr>
           <w:p>
@@ -2499,10 +2508,10 @@
             <w:tcW w:type="dxa" w:w="1296"/>
             <w:shd w:fill="F7F9FB"/>
             <w:tcMar>
-              <w:top w:w="55" w:type="dxa"/>
-              <w:bottom w:w="55" w:type="dxa"/>
-              <w:left w:w="100" w:type="dxa"/>
-              <w:right w:w="100" w:type="dxa"/>
+              <w:top w:w="50" w:type="dxa"/>
+              <w:bottom w:w="50" w:type="dxa"/>
+              <w:left w:w="95" w:type="dxa"/>
+              <w:right w:w="95" w:type="dxa"/>
             </w:tcMar>
           </w:tcPr>
           <w:p>
@@ -2523,10 +2532,10 @@
             <w:tcW w:type="dxa" w:w="1296"/>
             <w:shd w:fill="F7F9FB"/>
             <w:tcMar>
-              <w:top w:w="55" w:type="dxa"/>
-              <w:bottom w:w="55" w:type="dxa"/>
-              <w:left w:w="100" w:type="dxa"/>
-              <w:right w:w="100" w:type="dxa"/>
+              <w:top w:w="50" w:type="dxa"/>
+              <w:bottom w:w="50" w:type="dxa"/>
+              <w:left w:w="95" w:type="dxa"/>
+              <w:right w:w="95" w:type="dxa"/>
             </w:tcMar>
           </w:tcPr>
           <w:p>
@@ -2547,10 +2556,10 @@
             <w:tcW w:type="dxa" w:w="1296"/>
             <w:shd w:fill="F7F9FB"/>
             <w:tcMar>
-              <w:top w:w="55" w:type="dxa"/>
-              <w:bottom w:w="55" w:type="dxa"/>
-              <w:left w:w="100" w:type="dxa"/>
-              <w:right w:w="100" w:type="dxa"/>
+              <w:top w:w="50" w:type="dxa"/>
+              <w:bottom w:w="50" w:type="dxa"/>
+              <w:left w:w="95" w:type="dxa"/>
+              <w:right w:w="95" w:type="dxa"/>
             </w:tcMar>
           </w:tcPr>
           <w:p>
@@ -2571,10 +2580,10 @@
             <w:tcW w:type="dxa" w:w="1440"/>
             <w:shd w:fill="F7F9FB"/>
             <w:tcMar>
-              <w:top w:w="55" w:type="dxa"/>
-              <w:bottom w:w="55" w:type="dxa"/>
-              <w:left w:w="100" w:type="dxa"/>
-              <w:right w:w="100" w:type="dxa"/>
+              <w:top w:w="50" w:type="dxa"/>
+              <w:bottom w:w="50" w:type="dxa"/>
+              <w:left w:w="95" w:type="dxa"/>
+              <w:right w:w="95" w:type="dxa"/>
             </w:tcMar>
           </w:tcPr>
           <w:p>
@@ -2601,13 +2610,13 @@
       <w:pPr>
         <w:pStyle w:val="Heading1"/>
         <w:keepNext/>
-        <w:spacing w:before="200" w:after="40"/>
+        <w:spacing w:before="180" w:after="40"/>
       </w:pPr>
       <w:r>
         <w:rPr>
           <w:b/>
           <w:color w:val="1B365D"/>
-          <w:sz w:val="26"/>
+          <w:sz w:val="25"/>
         </w:rPr>
         <w:t>2. Setup and installation</w:t>
       </w:r>
@@ -2639,10 +2648,10 @@
             <w:tcW w:type="dxa" w:w="9792"/>
             <w:shd w:fill="F0F4F8"/>
             <w:tcMar>
-              <w:top w:w="80" w:type="dxa"/>
-              <w:bottom w:w="80" w:type="dxa"/>
-              <w:left w:w="130" w:type="dxa"/>
-              <w:right w:w="130" w:type="dxa"/>
+              <w:top w:w="70" w:type="dxa"/>
+              <w:bottom w:w="70" w:type="dxa"/>
+              <w:left w:w="120" w:type="dxa"/>
+              <w:right w:w="120" w:type="dxa"/>
             </w:tcMar>
             <w:tcBorders>
               <w:left w:val="single" w:sz="20" w:space="0" w:color="1B365D"/>
@@ -2837,14 +2846,14 @@
           <w:b/>
           <w:color w:val="1B365D"/>
         </w:rPr>
-        <w:t xml:space="preserve">1. Local Setup: </w:t>
+        <w:t xml:space="preserve">Step 1: Local Reproduction: </w:t>
       </w:r>
       <w:r>
         <w:rPr>
           <w:color w:val="232323"/>
           <w:sz w:val="19"/>
         </w:rPr>
-        <w:t>Step 1: Environment and Training (Clean Setup)</w:t>
+        <w:t>1. Environment Setup, Training &amp; Testing:</w:t>
       </w:r>
     </w:p>
     <w:tbl>
@@ -2862,10 +2871,10 @@
             <w:tcW w:type="dxa" w:w="9792"/>
             <w:shd w:fill="F0F4F8"/>
             <w:tcMar>
-              <w:top w:w="80" w:type="dxa"/>
-              <w:bottom w:w="80" w:type="dxa"/>
-              <w:left w:w="130" w:type="dxa"/>
-              <w:right w:w="130" w:type="dxa"/>
+              <w:top w:w="70" w:type="dxa"/>
+              <w:bottom w:w="70" w:type="dxa"/>
+              <w:left w:w="120" w:type="dxa"/>
+              <w:right w:w="120" w:type="dxa"/>
             </w:tcMar>
             <w:tcBorders>
               <w:left w:val="single" w:sz="20" w:space="0" w:color="1B365D"/>
@@ -2936,7 +2945,7 @@
                 <w:color w:val="1E1E1E"/>
                 <w:sz w:val="16"/>
               </w:rPr>
-              <w:t>python scripts/download_data.py  # Download UCI data -&gt; data/raw/</w:t>
+              <w:t>python scripts/download_data.py  # Ingest raw UCI data</w:t>
             </w:r>
           </w:p>
           <w:p>
@@ -2949,7 +2958,7 @@
                 <w:color w:val="1E1E1E"/>
                 <w:sz w:val="16"/>
               </w:rPr>
-              <w:t>python -m heart.eda              # Export 5 diagnostic figures -&gt; reports/figures/</w:t>
+              <w:t>python -m heart.eda              # Export diagnostic figures</w:t>
             </w:r>
           </w:p>
           <w:p>
@@ -2962,7 +2971,7 @@
                 <w:color w:val="1E1E1E"/>
                 <w:sz w:val="16"/>
               </w:rPr>
-              <w:t>python -m heart.train            # Run nested CV, log to MLflow, export model.joblib</w:t>
+              <w:t>python -m heart.train            # Run 5x3 nested CV, log to MLflow, export model.joblib</w:t>
             </w:r>
           </w:p>
           <w:p>
@@ -2975,7 +2984,7 @@
                 <w:color w:val="1E1E1E"/>
                 <w:sz w:val="16"/>
               </w:rPr>
-              <w:t>pytest -v                        # Run 21 automated unit tests</w:t>
+              <w:t>mlflow ui --backend-store-uri ./mlruns --port 5000  # Inspect MLflow UI</w:t>
             </w:r>
           </w:p>
           <w:p>
@@ -2988,7 +2997,20 @@
                 <w:color w:val="1E1E1E"/>
                 <w:sz w:val="16"/>
               </w:rPr>
-              <w:t>flake8 src tests scripts         # Run PEP 8 static analysis</w:t>
+              <w:t>pytest -v                        # Execute 21 unit tests</w:t>
+            </w:r>
+          </w:p>
+          <w:p>
+            <w:pPr>
+              <w:spacing w:before="0" w:after="0"/>
+            </w:pPr>
+            <w:r>
+              <w:rPr>
+                <w:rFonts w:ascii="Consolas" w:hAnsi="Consolas"/>
+                <w:color w:val="1E1E1E"/>
+                <w:sz w:val="16"/>
+              </w:rPr>
+              <w:t>flake8 src tests scripts         # Run static analysis</w:t>
             </w:r>
           </w:p>
         </w:tc>
@@ -3008,14 +3030,14 @@
           <w:b/>
           <w:color w:val="1B365D"/>
         </w:rPr>
-        <w:t xml:space="preserve">2. Docker Compose: </w:t>
+        <w:t xml:space="preserve">Step 2: Docker Compose Serving: </w:t>
       </w:r>
       <w:r>
         <w:rPr>
           <w:color w:val="232323"/>
           <w:sz w:val="19"/>
         </w:rPr>
-        <w:t>Step 2: Run the Stack in Docker</w:t>
+        <w:t>2. Run the Stack in Docker Compose:</w:t>
       </w:r>
     </w:p>
     <w:tbl>
@@ -3033,10 +3055,10 @@
             <w:tcW w:type="dxa" w:w="9792"/>
             <w:shd w:fill="F0F4F8"/>
             <w:tcMar>
-              <w:top w:w="80" w:type="dxa"/>
-              <w:bottom w:w="80" w:type="dxa"/>
-              <w:left w:w="130" w:type="dxa"/>
-              <w:right w:w="130" w:type="dxa"/>
+              <w:top w:w="70" w:type="dxa"/>
+              <w:bottom w:w="70" w:type="dxa"/>
+              <w:left w:w="120" w:type="dxa"/>
+              <w:right w:w="120" w:type="dxa"/>
             </w:tcMar>
             <w:tcBorders>
               <w:left w:val="single" w:sz="20" w:space="0" w:color="1B365D"/>
@@ -3055,7 +3077,7 @@
                 <w:color w:val="1B365D"/>
                 <w:sz w:val="18"/>
               </w:rPr>
-              <w:t>■ Docker Stack Launch Commands</w:t>
+              <w:t>■ Docker Compose Commands</w:t>
             </w:r>
           </w:p>
           <w:p>
@@ -3094,7 +3116,7 @@
                 <w:color w:val="1E1E1E"/>
                 <w:sz w:val="16"/>
               </w:rPr>
-              <w:t>python scripts/load_test.py --requests 300  # Send synthetic traffic to Grafana</w:t>
+              <w:t>python scripts/load_test.py --requests 300  # Populate Grafana with traffic</w:t>
             </w:r>
           </w:p>
         </w:tc>
@@ -3114,14 +3136,14 @@
           <w:b/>
           <w:color w:val="1B365D"/>
         </w:rPr>
-        <w:t xml:space="preserve">3. Kubernetes Deployment: </w:t>
+        <w:t xml:space="preserve">Step 3: Kubernetes Deployment: </w:t>
       </w:r>
       <w:r>
         <w:rPr>
           <w:color w:val="232323"/>
           <w:sz w:val="19"/>
         </w:rPr>
-        <w:t>Step 3: Deploy to Local Kubernetes</w:t>
+        <w:t>3. Build Container and Deploy to Local Kubernetes:</w:t>
       </w:r>
     </w:p>
     <w:tbl>
@@ -3139,10 +3161,10 @@
             <w:tcW w:type="dxa" w:w="9792"/>
             <w:shd w:fill="F0F4F8"/>
             <w:tcMar>
-              <w:top w:w="80" w:type="dxa"/>
-              <w:bottom w:w="80" w:type="dxa"/>
-              <w:left w:w="130" w:type="dxa"/>
-              <w:right w:w="130" w:type="dxa"/>
+              <w:top w:w="70" w:type="dxa"/>
+              <w:bottom w:w="70" w:type="dxa"/>
+              <w:left w:w="120" w:type="dxa"/>
+              <w:right w:w="120" w:type="dxa"/>
             </w:tcMar>
             <w:tcBorders>
               <w:left w:val="single" w:sz="20" w:space="0" w:color="1B365D"/>
@@ -3174,7 +3196,59 @@
                 <w:color w:val="1E1E1E"/>
                 <w:sz w:val="16"/>
               </w:rPr>
-              <w:t>kubectl apply -f k8s/deployment.yaml -f k8s/service.yaml -f k8s/hpa.yaml</w:t>
+              <w:t># Build and tag container image into local Docker daemon:</w:t>
+            </w:r>
+          </w:p>
+          <w:p>
+            <w:pPr>
+              <w:spacing w:before="0" w:after="0"/>
+            </w:pPr>
+            <w:r>
+              <w:rPr>
+                <w:rFonts w:ascii="Consolas" w:hAnsi="Consolas"/>
+                <w:color w:val="1E1E1E"/>
+                <w:sz w:val="16"/>
+              </w:rPr>
+              <w:t>docker build -t heart-disease-api:1.0.0 .</w:t>
+            </w:r>
+          </w:p>
+          <w:p>
+            <w:pPr>
+              <w:spacing w:before="0" w:after="0"/>
+            </w:pPr>
+            <w:r>
+              <w:rPr>
+                <w:rFonts w:ascii="Consolas" w:hAnsi="Consolas"/>
+                <w:color w:val="1E1E1E"/>
+                <w:sz w:val="16"/>
+              </w:rPr>
+              <w:t># Apply declarative manifests (Deployment, Service, HPA, and Ingress):</w:t>
+            </w:r>
+          </w:p>
+          <w:p>
+            <w:pPr>
+              <w:spacing w:before="0" w:after="0"/>
+            </w:pPr>
+            <w:r>
+              <w:rPr>
+                <w:rFonts w:ascii="Consolas" w:hAnsi="Consolas"/>
+                <w:color w:val="1E1E1E"/>
+                <w:sz w:val="16"/>
+              </w:rPr>
+              <w:t>kubectl apply -f k8s/</w:t>
+            </w:r>
+          </w:p>
+          <w:p>
+            <w:pPr>
+              <w:spacing w:before="0" w:after="0"/>
+            </w:pPr>
+            <w:r>
+              <w:rPr>
+                <w:rFonts w:ascii="Consolas" w:hAnsi="Consolas"/>
+                <w:color w:val="1E1E1E"/>
+                <w:sz w:val="16"/>
+              </w:rPr>
+              <w:t># (Note: Ingress requires an active controller, e.g. minikube addons enable ingress)</w:t>
             </w:r>
           </w:p>
           <w:p>
@@ -3200,21 +3274,16 @@
     </w:p>
     <w:p>
       <w:pPr>
-        <w:spacing w:before="0" w:after="40" w:line="269" w:lineRule="auto"/>
+        <w:keepNext/>
+        <w:spacing w:before="80" w:after="40"/>
       </w:pPr>
       <w:r>
         <w:rPr>
           <w:b/>
           <w:color w:val="1B365D"/>
+          <w:sz w:val="17"/>
         </w:rPr>
-        <w:t xml:space="preserve">Access Instructions (Local Cluster &amp; Services): </w:t>
-      </w:r>
-      <w:r>
-        <w:rPr>
-          <w:color w:val="232323"/>
-          <w:sz w:val="19"/>
-        </w:rPr>
-        <w:t>Table 3 details local endpoints and service ports.</w:t>
+        <w:t>Table 3: Local Service Access Endpoints and Ports</w:t>
       </w:r>
     </w:p>
     <w:tbl>
@@ -3241,10 +3310,10 @@
             <w:tcW w:type="dxa" w:w="4032"/>
             <w:shd w:fill="1B365D"/>
             <w:tcMar>
-              <w:top w:w="80" w:type="dxa"/>
-              <w:bottom w:w="80" w:type="dxa"/>
-              <w:left w:w="100" w:type="dxa"/>
-              <w:right w:w="100" w:type="dxa"/>
+              <w:top w:w="75" w:type="dxa"/>
+              <w:bottom w:w="75" w:type="dxa"/>
+              <w:left w:w="95" w:type="dxa"/>
+              <w:right w:w="95" w:type="dxa"/>
             </w:tcMar>
           </w:tcPr>
           <w:p>
@@ -3266,10 +3335,10 @@
             <w:tcW w:type="dxa" w:w="5760"/>
             <w:shd w:fill="1B365D"/>
             <w:tcMar>
-              <w:top w:w="80" w:type="dxa"/>
-              <w:bottom w:w="80" w:type="dxa"/>
-              <w:left w:w="100" w:type="dxa"/>
-              <w:right w:w="100" w:type="dxa"/>
+              <w:top w:w="75" w:type="dxa"/>
+              <w:bottom w:w="75" w:type="dxa"/>
+              <w:left w:w="95" w:type="dxa"/>
+              <w:right w:w="95" w:type="dxa"/>
             </w:tcMar>
           </w:tcPr>
           <w:p>
@@ -3293,10 +3362,10 @@
             <w:tcW w:type="dxa" w:w="4032"/>
             <w:shd w:fill="F7F9FB"/>
             <w:tcMar>
-              <w:top w:w="55" w:type="dxa"/>
-              <w:bottom w:w="55" w:type="dxa"/>
-              <w:left w:w="100" w:type="dxa"/>
-              <w:right w:w="100" w:type="dxa"/>
+              <w:top w:w="50" w:type="dxa"/>
+              <w:bottom w:w="50" w:type="dxa"/>
+              <w:left w:w="95" w:type="dxa"/>
+              <w:right w:w="95" w:type="dxa"/>
             </w:tcMar>
           </w:tcPr>
           <w:p>
@@ -3317,10 +3386,10 @@
             <w:tcW w:type="dxa" w:w="5760"/>
             <w:shd w:fill="F7F9FB"/>
             <w:tcMar>
-              <w:top w:w="55" w:type="dxa"/>
-              <w:bottom w:w="55" w:type="dxa"/>
-              <w:left w:w="100" w:type="dxa"/>
-              <w:right w:w="100" w:type="dxa"/>
+              <w:top w:w="50" w:type="dxa"/>
+              <w:bottom w:w="50" w:type="dxa"/>
+              <w:left w:w="95" w:type="dxa"/>
+              <w:right w:w="95" w:type="dxa"/>
             </w:tcMar>
           </w:tcPr>
           <w:p>
@@ -3343,10 +3412,10 @@
             <w:tcW w:type="dxa" w:w="4032"/>
             <w:shd w:fill="FFFFFF"/>
             <w:tcMar>
-              <w:top w:w="55" w:type="dxa"/>
-              <w:bottom w:w="55" w:type="dxa"/>
-              <w:left w:w="100" w:type="dxa"/>
-              <w:right w:w="100" w:type="dxa"/>
+              <w:top w:w="50" w:type="dxa"/>
+              <w:bottom w:w="50" w:type="dxa"/>
+              <w:left w:w="95" w:type="dxa"/>
+              <w:right w:w="95" w:type="dxa"/>
             </w:tcMar>
           </w:tcPr>
           <w:p>
@@ -3367,10 +3436,10 @@
             <w:tcW w:type="dxa" w:w="5760"/>
             <w:shd w:fill="FFFFFF"/>
             <w:tcMar>
-              <w:top w:w="55" w:type="dxa"/>
-              <w:bottom w:w="55" w:type="dxa"/>
-              <w:left w:w="100" w:type="dxa"/>
-              <w:right w:w="100" w:type="dxa"/>
+              <w:top w:w="50" w:type="dxa"/>
+              <w:bottom w:w="50" w:type="dxa"/>
+              <w:left w:w="95" w:type="dxa"/>
+              <w:right w:w="95" w:type="dxa"/>
             </w:tcMar>
           </w:tcPr>
           <w:p>
@@ -3393,10 +3462,10 @@
             <w:tcW w:type="dxa" w:w="4032"/>
             <w:shd w:fill="F7F9FB"/>
             <w:tcMar>
-              <w:top w:w="55" w:type="dxa"/>
-              <w:bottom w:w="55" w:type="dxa"/>
-              <w:left w:w="100" w:type="dxa"/>
-              <w:right w:w="100" w:type="dxa"/>
+              <w:top w:w="50" w:type="dxa"/>
+              <w:bottom w:w="50" w:type="dxa"/>
+              <w:left w:w="95" w:type="dxa"/>
+              <w:right w:w="95" w:type="dxa"/>
             </w:tcMar>
           </w:tcPr>
           <w:p>
@@ -3417,10 +3486,10 @@
             <w:tcW w:type="dxa" w:w="5760"/>
             <w:shd w:fill="F7F9FB"/>
             <w:tcMar>
-              <w:top w:w="55" w:type="dxa"/>
-              <w:bottom w:w="55" w:type="dxa"/>
-              <w:left w:w="100" w:type="dxa"/>
-              <w:right w:w="100" w:type="dxa"/>
+              <w:top w:w="50" w:type="dxa"/>
+              <w:bottom w:w="50" w:type="dxa"/>
+              <w:left w:w="95" w:type="dxa"/>
+              <w:right w:w="95" w:type="dxa"/>
             </w:tcMar>
           </w:tcPr>
           <w:p>
@@ -3443,10 +3512,10 @@
             <w:tcW w:type="dxa" w:w="4032"/>
             <w:shd w:fill="FFFFFF"/>
             <w:tcMar>
-              <w:top w:w="55" w:type="dxa"/>
-              <w:bottom w:w="55" w:type="dxa"/>
-              <w:left w:w="100" w:type="dxa"/>
-              <w:right w:w="100" w:type="dxa"/>
+              <w:top w:w="50" w:type="dxa"/>
+              <w:bottom w:w="50" w:type="dxa"/>
+              <w:left w:w="95" w:type="dxa"/>
+              <w:right w:w="95" w:type="dxa"/>
             </w:tcMar>
           </w:tcPr>
           <w:p>
@@ -3467,10 +3536,10 @@
             <w:tcW w:type="dxa" w:w="5760"/>
             <w:shd w:fill="FFFFFF"/>
             <w:tcMar>
-              <w:top w:w="55" w:type="dxa"/>
-              <w:bottom w:w="55" w:type="dxa"/>
-              <w:left w:w="100" w:type="dxa"/>
-              <w:right w:w="100" w:type="dxa"/>
+              <w:top w:w="50" w:type="dxa"/>
+              <w:bottom w:w="50" w:type="dxa"/>
+              <w:left w:w="95" w:type="dxa"/>
+              <w:right w:w="95" w:type="dxa"/>
             </w:tcMar>
           </w:tcPr>
           <w:p>
@@ -3493,10 +3562,10 @@
             <w:tcW w:type="dxa" w:w="4032"/>
             <w:shd w:fill="F7F9FB"/>
             <w:tcMar>
-              <w:top w:w="55" w:type="dxa"/>
-              <w:bottom w:w="55" w:type="dxa"/>
-              <w:left w:w="100" w:type="dxa"/>
-              <w:right w:w="100" w:type="dxa"/>
+              <w:top w:w="50" w:type="dxa"/>
+              <w:bottom w:w="50" w:type="dxa"/>
+              <w:left w:w="95" w:type="dxa"/>
+              <w:right w:w="95" w:type="dxa"/>
             </w:tcMar>
           </w:tcPr>
           <w:p>
@@ -3517,10 +3586,10 @@
             <w:tcW w:type="dxa" w:w="5760"/>
             <w:shd w:fill="F7F9FB"/>
             <w:tcMar>
-              <w:top w:w="55" w:type="dxa"/>
-              <w:bottom w:w="55" w:type="dxa"/>
-              <w:left w:w="100" w:type="dxa"/>
-              <w:right w:w="100" w:type="dxa"/>
+              <w:top w:w="50" w:type="dxa"/>
+              <w:bottom w:w="50" w:type="dxa"/>
+              <w:left w:w="95" w:type="dxa"/>
+              <w:right w:w="95" w:type="dxa"/>
             </w:tcMar>
           </w:tcPr>
           <w:p>
@@ -3547,13 +3616,13 @@
       <w:pPr>
         <w:pStyle w:val="Heading1"/>
         <w:keepNext/>
-        <w:spacing w:before="200" w:after="40"/>
+        <w:spacing w:before="180" w:after="40"/>
       </w:pPr>
       <w:r>
         <w:rPr>
           <w:b/>
           <w:color w:val="1B365D"/>
-          <w:sz w:val="26"/>
+          <w:sz w:val="25"/>
         </w:rPr>
         <w:t>3. Data acquisition and exploratory data analysis</w:t>
       </w:r>
@@ -3574,7 +3643,26 @@
           <w:color w:val="232323"/>
           <w:sz w:val="19"/>
         </w:rPr>
-        <w:t>The automated ingestion script (scripts/download_data.py) retrieves processed.cleveland.data directly from the UCI archive. Missing values represented by '?' are parsed to IEEE NaN floats. Crucially, zero duplicate records exist in the raw Cleveland data; all 303 original clinical cases are retained: 164 healthy subjects (54.1%) and 139 heart disease subjects (45.9%). Six total feature values are missing across the cohort (4 in 'ca', 2 in 'thal'). Missing values are deliberately kept as NaNs in data/processed/heart_clean.csv to prevent data leakage prior to machine learning pipeline cross-validation.</w:t>
+        <w:t>The automated ingestion script (scripts/download_data.py) retrieves processed.cleveland.data directly from the UCI archive. Missing values represented by '?' are parsed to IEEE NaN floats. Crucially, zero duplicate records exist in the raw Cleveland data; all 303 original clinical cases are retained: 164 healthy subjects (54.1%) and 139 heart disease subjects (45.9%). Six total feature values are missing across the cohort (4 in 'ca', 2 in 'thal').</w:t>
+      </w:r>
+    </w:p>
+    <w:p>
+      <w:pPr>
+        <w:spacing w:before="0" w:after="40" w:line="269" w:lineRule="auto"/>
+      </w:pPr>
+      <w:r>
+        <w:rPr>
+          <w:b/>
+          <w:color w:val="1B365D"/>
+        </w:rPr>
+        <w:t xml:space="preserve">Leakage-Free Imputation Architecture: </w:t>
+      </w:r>
+      <w:r>
+        <w:rPr>
+          <w:color w:val="232323"/>
+          <w:sz w:val="19"/>
+        </w:rPr>
+        <w:t>Handling Missing Values &amp; Imputation Strategy: In production MLOps engineering, imputing missing values prior to train-test splitting introduces subtle data leakage, as test fold distributions leak into the imputer statistics. Therefore, data/processed/heart_clean.csv sanitizes types and preserves NaNs, while complete imputation is encapsulated directly within the scikit-learn ColumnTransformer pipeline (SimpleImputer with median for numeric, mode for categorical). This guarantees that imputation parameters are learned strictly within cross-validation training folds and applied identically at inference time, satisfying Task 1.</w:t>
       </w:r>
     </w:p>
     <w:tbl>
@@ -3922,13 +4010,13 @@
       <w:pPr>
         <w:pStyle w:val="Heading1"/>
         <w:keepNext/>
-        <w:spacing w:before="200" w:after="40"/>
+        <w:spacing w:before="180" w:after="40"/>
       </w:pPr>
       <w:r>
         <w:rPr>
           <w:b/>
           <w:color w:val="1B365D"/>
-          <w:sz w:val="26"/>
+          <w:sz w:val="25"/>
         </w:rPr>
         <w:t>4. Feature Engineering and Model Development</w:t>
       </w:r>
@@ -3950,6 +4038,20 @@
           <w:sz w:val="19"/>
         </w:rPr>
         <w:t>To guarantee reproducibility and eliminate train-serving skew, all transformations are encapsulated in a single scikit-learn ColumnTransformer (src/heart/features.py). Following src/heart/config.py, 'ca' is categorized with nominal features:</w:t>
+      </w:r>
+    </w:p>
+    <w:p>
+      <w:pPr>
+        <w:keepNext/>
+        <w:spacing w:before="80" w:after="40"/>
+      </w:pPr>
+      <w:r>
+        <w:rPr>
+          <w:b/>
+          <w:color w:val="1B365D"/>
+          <w:sz w:val="17"/>
+        </w:rPr>
+        <w:t>Table 4: Feature Preprocessing Pipeline Architecture</w:t>
       </w:r>
     </w:p>
     <w:tbl>
@@ -3977,10 +4079,10 @@
             <w:tcW w:type="dxa" w:w="1728"/>
             <w:shd w:fill="1B365D"/>
             <w:tcMar>
-              <w:top w:w="80" w:type="dxa"/>
-              <w:bottom w:w="80" w:type="dxa"/>
-              <w:left w:w="100" w:type="dxa"/>
-              <w:right w:w="100" w:type="dxa"/>
+              <w:top w:w="75" w:type="dxa"/>
+              <w:bottom w:w="75" w:type="dxa"/>
+              <w:left w:w="95" w:type="dxa"/>
+              <w:right w:w="95" w:type="dxa"/>
             </w:tcMar>
           </w:tcPr>
           <w:p>
@@ -4002,10 +4104,10 @@
             <w:tcW w:type="dxa" w:w="3744"/>
             <w:shd w:fill="1B365D"/>
             <w:tcMar>
-              <w:top w:w="80" w:type="dxa"/>
-              <w:bottom w:w="80" w:type="dxa"/>
-              <w:left w:w="100" w:type="dxa"/>
-              <w:right w:w="100" w:type="dxa"/>
+              <w:top w:w="75" w:type="dxa"/>
+              <w:bottom w:w="75" w:type="dxa"/>
+              <w:left w:w="95" w:type="dxa"/>
+              <w:right w:w="95" w:type="dxa"/>
             </w:tcMar>
           </w:tcPr>
           <w:p>
@@ -4027,10 +4129,10 @@
             <w:tcW w:type="dxa" w:w="4320"/>
             <w:shd w:fill="1B365D"/>
             <w:tcMar>
-              <w:top w:w="80" w:type="dxa"/>
-              <w:bottom w:w="80" w:type="dxa"/>
-              <w:left w:w="100" w:type="dxa"/>
-              <w:right w:w="100" w:type="dxa"/>
+              <w:top w:w="75" w:type="dxa"/>
+              <w:bottom w:w="75" w:type="dxa"/>
+              <w:left w:w="95" w:type="dxa"/>
+              <w:right w:w="95" w:type="dxa"/>
             </w:tcMar>
           </w:tcPr>
           <w:p>
@@ -4054,10 +4156,10 @@
             <w:tcW w:type="dxa" w:w="1728"/>
             <w:shd w:fill="F7F9FB"/>
             <w:tcMar>
-              <w:top w:w="55" w:type="dxa"/>
-              <w:bottom w:w="55" w:type="dxa"/>
-              <w:left w:w="100" w:type="dxa"/>
-              <w:right w:w="100" w:type="dxa"/>
+              <w:top w:w="50" w:type="dxa"/>
+              <w:bottom w:w="50" w:type="dxa"/>
+              <w:left w:w="95" w:type="dxa"/>
+              <w:right w:w="95" w:type="dxa"/>
             </w:tcMar>
           </w:tcPr>
           <w:p>
@@ -4078,10 +4180,10 @@
             <w:tcW w:type="dxa" w:w="3744"/>
             <w:shd w:fill="F7F9FB"/>
             <w:tcMar>
-              <w:top w:w="55" w:type="dxa"/>
-              <w:bottom w:w="55" w:type="dxa"/>
-              <w:left w:w="100" w:type="dxa"/>
-              <w:right w:w="100" w:type="dxa"/>
+              <w:top w:w="50" w:type="dxa"/>
+              <w:bottom w:w="50" w:type="dxa"/>
+              <w:left w:w="95" w:type="dxa"/>
+              <w:right w:w="95" w:type="dxa"/>
             </w:tcMar>
           </w:tcPr>
           <w:p>
@@ -4102,10 +4204,10 @@
             <w:tcW w:type="dxa" w:w="4320"/>
             <w:shd w:fill="F7F9FB"/>
             <w:tcMar>
-              <w:top w:w="55" w:type="dxa"/>
-              <w:bottom w:w="55" w:type="dxa"/>
-              <w:left w:w="100" w:type="dxa"/>
-              <w:right w:w="100" w:type="dxa"/>
+              <w:top w:w="50" w:type="dxa"/>
+              <w:bottom w:w="50" w:type="dxa"/>
+              <w:left w:w="95" w:type="dxa"/>
+              <w:right w:w="95" w:type="dxa"/>
             </w:tcMar>
           </w:tcPr>
           <w:p>
@@ -4128,10 +4230,10 @@
             <w:tcW w:type="dxa" w:w="1728"/>
             <w:shd w:fill="FFFFFF"/>
             <w:tcMar>
-              <w:top w:w="55" w:type="dxa"/>
-              <w:bottom w:w="55" w:type="dxa"/>
-              <w:left w:w="100" w:type="dxa"/>
-              <w:right w:w="100" w:type="dxa"/>
+              <w:top w:w="50" w:type="dxa"/>
+              <w:bottom w:w="50" w:type="dxa"/>
+              <w:left w:w="95" w:type="dxa"/>
+              <w:right w:w="95" w:type="dxa"/>
             </w:tcMar>
           </w:tcPr>
           <w:p>
@@ -4152,10 +4254,10 @@
             <w:tcW w:type="dxa" w:w="3744"/>
             <w:shd w:fill="FFFFFF"/>
             <w:tcMar>
-              <w:top w:w="55" w:type="dxa"/>
-              <w:bottom w:w="55" w:type="dxa"/>
-              <w:left w:w="100" w:type="dxa"/>
-              <w:right w:w="100" w:type="dxa"/>
+              <w:top w:w="50" w:type="dxa"/>
+              <w:bottom w:w="50" w:type="dxa"/>
+              <w:left w:w="95" w:type="dxa"/>
+              <w:right w:w="95" w:type="dxa"/>
             </w:tcMar>
           </w:tcPr>
           <w:p>
@@ -4176,10 +4278,10 @@
             <w:tcW w:type="dxa" w:w="4320"/>
             <w:shd w:fill="FFFFFF"/>
             <w:tcMar>
-              <w:top w:w="55" w:type="dxa"/>
-              <w:bottom w:w="55" w:type="dxa"/>
-              <w:left w:w="100" w:type="dxa"/>
-              <w:right w:w="100" w:type="dxa"/>
+              <w:top w:w="50" w:type="dxa"/>
+              <w:bottom w:w="50" w:type="dxa"/>
+              <w:left w:w="95" w:type="dxa"/>
+              <w:right w:w="95" w:type="dxa"/>
             </w:tcMar>
           </w:tcPr>
           <w:p>
@@ -4213,7 +4315,21 @@
           <w:color w:val="232323"/>
           <w:sz w:val="19"/>
         </w:rPr>
-        <w:t>The dataset is partitioned into an 80% training set (N = 242) and a 20% hold-out test set (N = 61) with stratification (seed 42). Hyperparameter optimization is performed via GridSearchCV inside 5-fold StratifiedKFold cross-validation optimizing ROC-AUC.</w:t>
+        <w:t>The cohort is partitioned into an 80% training set (N = 242) and a 20% hold-out test set (N = 61) with stratification (seed 42). Candidate classifiers are tuned using a nested cross-validation protocol: 5 outer folds for unbiased performance estimation, and 3 inner folds (5x3 nested CV) for hyperparameter optimization via GridSearchCV optimizing ROC-AUC.</w:t>
+      </w:r>
+    </w:p>
+    <w:p>
+      <w:pPr>
+        <w:keepNext/>
+        <w:spacing w:before="80" w:after="40"/>
+      </w:pPr>
+      <w:r>
+        <w:rPr>
+          <w:b/>
+          <w:color w:val="1B365D"/>
+          <w:sz w:val="17"/>
+        </w:rPr>
+        <w:t>Table 5: Candidate Model Hyperparameter Search Grids and Optimal Parameters</w:t>
       </w:r>
     </w:p>
     <w:tbl>
@@ -4241,10 +4357,10 @@
             <w:tcW w:type="dxa" w:w="2592"/>
             <w:shd w:fill="1B365D"/>
             <w:tcMar>
-              <w:top w:w="80" w:type="dxa"/>
-              <w:bottom w:w="80" w:type="dxa"/>
-              <w:left w:w="100" w:type="dxa"/>
-              <w:right w:w="100" w:type="dxa"/>
+              <w:top w:w="75" w:type="dxa"/>
+              <w:bottom w:w="75" w:type="dxa"/>
+              <w:left w:w="95" w:type="dxa"/>
+              <w:right w:w="95" w:type="dxa"/>
             </w:tcMar>
           </w:tcPr>
           <w:p>
@@ -4266,10 +4382,10 @@
             <w:tcW w:type="dxa" w:w="4032"/>
             <w:shd w:fill="1B365D"/>
             <w:tcMar>
-              <w:top w:w="80" w:type="dxa"/>
-              <w:bottom w:w="80" w:type="dxa"/>
-              <w:left w:w="100" w:type="dxa"/>
-              <w:right w:w="100" w:type="dxa"/>
+              <w:top w:w="75" w:type="dxa"/>
+              <w:bottom w:w="75" w:type="dxa"/>
+              <w:left w:w="95" w:type="dxa"/>
+              <w:right w:w="95" w:type="dxa"/>
             </w:tcMar>
           </w:tcPr>
           <w:p>
@@ -4291,10 +4407,10 @@
             <w:tcW w:type="dxa" w:w="3168"/>
             <w:shd w:fill="1B365D"/>
             <w:tcMar>
-              <w:top w:w="80" w:type="dxa"/>
-              <w:bottom w:w="80" w:type="dxa"/>
-              <w:left w:w="100" w:type="dxa"/>
-              <w:right w:w="100" w:type="dxa"/>
+              <w:top w:w="75" w:type="dxa"/>
+              <w:bottom w:w="75" w:type="dxa"/>
+              <w:left w:w="95" w:type="dxa"/>
+              <w:right w:w="95" w:type="dxa"/>
             </w:tcMar>
           </w:tcPr>
           <w:p>
@@ -4318,10 +4434,10 @@
             <w:tcW w:type="dxa" w:w="2592"/>
             <w:shd w:fill="F7F9FB"/>
             <w:tcMar>
-              <w:top w:w="55" w:type="dxa"/>
-              <w:bottom w:w="55" w:type="dxa"/>
-              <w:left w:w="100" w:type="dxa"/>
-              <w:right w:w="100" w:type="dxa"/>
+              <w:top w:w="50" w:type="dxa"/>
+              <w:bottom w:w="50" w:type="dxa"/>
+              <w:left w:w="95" w:type="dxa"/>
+              <w:right w:w="95" w:type="dxa"/>
             </w:tcMar>
           </w:tcPr>
           <w:p>
@@ -4342,10 +4458,10 @@
             <w:tcW w:type="dxa" w:w="4032"/>
             <w:shd w:fill="F7F9FB"/>
             <w:tcMar>
-              <w:top w:w="55" w:type="dxa"/>
-              <w:bottom w:w="55" w:type="dxa"/>
-              <w:left w:w="100" w:type="dxa"/>
-              <w:right w:w="100" w:type="dxa"/>
+              <w:top w:w="50" w:type="dxa"/>
+              <w:bottom w:w="50" w:type="dxa"/>
+              <w:left w:w="95" w:type="dxa"/>
+              <w:right w:w="95" w:type="dxa"/>
             </w:tcMar>
           </w:tcPr>
           <w:p>
@@ -4357,9 +4473,11 @@
                 <w:color w:val="282828"/>
                 <w:sz w:val="17"/>
               </w:rPr>
-              <w:t>C ∈ {0.01, 0.1, 1.0, 10.0}</w:t>
+              <w:t>C ∈ {0.01, 0.1, 1.0}</w:t>
               <w:br/>
               <w:t>penalty ∈ {'l1', 'l2'}</w:t>
+              <w:br/>
+              <w:t>(grid_size = 6 combinations)</w:t>
             </w:r>
           </w:p>
         </w:tc>
@@ -4368,10 +4486,10 @@
             <w:tcW w:type="dxa" w:w="3168"/>
             <w:shd w:fill="F7F9FB"/>
             <w:tcMar>
-              <w:top w:w="55" w:type="dxa"/>
-              <w:bottom w:w="55" w:type="dxa"/>
-              <w:left w:w="100" w:type="dxa"/>
-              <w:right w:w="100" w:type="dxa"/>
+              <w:top w:w="50" w:type="dxa"/>
+              <w:bottom w:w="50" w:type="dxa"/>
+              <w:left w:w="95" w:type="dxa"/>
+              <w:right w:w="95" w:type="dxa"/>
             </w:tcMar>
           </w:tcPr>
           <w:p>
@@ -4394,10 +4512,10 @@
             <w:tcW w:type="dxa" w:w="2592"/>
             <w:shd w:fill="FFFFFF"/>
             <w:tcMar>
-              <w:top w:w="55" w:type="dxa"/>
-              <w:bottom w:w="55" w:type="dxa"/>
-              <w:left w:w="100" w:type="dxa"/>
-              <w:right w:w="100" w:type="dxa"/>
+              <w:top w:w="50" w:type="dxa"/>
+              <w:bottom w:w="50" w:type="dxa"/>
+              <w:left w:w="95" w:type="dxa"/>
+              <w:right w:w="95" w:type="dxa"/>
             </w:tcMar>
           </w:tcPr>
           <w:p>
@@ -4418,10 +4536,10 @@
             <w:tcW w:type="dxa" w:w="4032"/>
             <w:shd w:fill="FFFFFF"/>
             <w:tcMar>
-              <w:top w:w="55" w:type="dxa"/>
-              <w:bottom w:w="55" w:type="dxa"/>
-              <w:left w:w="100" w:type="dxa"/>
-              <w:right w:w="100" w:type="dxa"/>
+              <w:top w:w="50" w:type="dxa"/>
+              <w:bottom w:w="50" w:type="dxa"/>
+              <w:left w:w="95" w:type="dxa"/>
+              <w:right w:w="95" w:type="dxa"/>
             </w:tcMar>
           </w:tcPr>
           <w:p>
@@ -4446,10 +4564,10 @@
             <w:tcW w:type="dxa" w:w="3168"/>
             <w:shd w:fill="FFFFFF"/>
             <w:tcMar>
-              <w:top w:w="55" w:type="dxa"/>
-              <w:bottom w:w="55" w:type="dxa"/>
-              <w:left w:w="100" w:type="dxa"/>
-              <w:right w:w="100" w:type="dxa"/>
+              <w:top w:w="50" w:type="dxa"/>
+              <w:bottom w:w="50" w:type="dxa"/>
+              <w:left w:w="95" w:type="dxa"/>
+              <w:right w:w="95" w:type="dxa"/>
             </w:tcMar>
           </w:tcPr>
           <w:p>
@@ -4474,10 +4592,10 @@
             <w:tcW w:type="dxa" w:w="2592"/>
             <w:shd w:fill="F7F9FB"/>
             <w:tcMar>
-              <w:top w:w="55" w:type="dxa"/>
-              <w:bottom w:w="55" w:type="dxa"/>
-              <w:left w:w="100" w:type="dxa"/>
-              <w:right w:w="100" w:type="dxa"/>
+              <w:top w:w="50" w:type="dxa"/>
+              <w:bottom w:w="50" w:type="dxa"/>
+              <w:left w:w="95" w:type="dxa"/>
+              <w:right w:w="95" w:type="dxa"/>
             </w:tcMar>
           </w:tcPr>
           <w:p>
@@ -4498,10 +4616,10 @@
             <w:tcW w:type="dxa" w:w="4032"/>
             <w:shd w:fill="F7F9FB"/>
             <w:tcMar>
-              <w:top w:w="55" w:type="dxa"/>
-              <w:bottom w:w="55" w:type="dxa"/>
-              <w:left w:w="100" w:type="dxa"/>
-              <w:right w:w="100" w:type="dxa"/>
+              <w:top w:w="50" w:type="dxa"/>
+              <w:bottom w:w="50" w:type="dxa"/>
+              <w:left w:w="95" w:type="dxa"/>
+              <w:right w:w="95" w:type="dxa"/>
             </w:tcMar>
           </w:tcPr>
           <w:p>
@@ -4526,10 +4644,10 @@
             <w:tcW w:type="dxa" w:w="3168"/>
             <w:shd w:fill="F7F9FB"/>
             <w:tcMar>
-              <w:top w:w="55" w:type="dxa"/>
-              <w:bottom w:w="55" w:type="dxa"/>
-              <w:left w:w="100" w:type="dxa"/>
-              <w:right w:w="100" w:type="dxa"/>
+              <w:top w:w="50" w:type="dxa"/>
+              <w:bottom w:w="50" w:type="dxa"/>
+              <w:left w:w="95" w:type="dxa"/>
+              <w:right w:w="95" w:type="dxa"/>
             </w:tcMar>
           </w:tcPr>
           <w:p>
@@ -4558,7 +4676,7 @@
       <w:pPr>
         <w:pStyle w:val="Heading2"/>
         <w:keepNext/>
-        <w:spacing w:before="140" w:after="40"/>
+        <w:spacing w:before="120" w:after="40"/>
       </w:pPr>
       <w:r>
         <w:rPr>
@@ -4579,6 +4697,20 @@
           <w:sz w:val="19"/>
         </w:rPr>
         <w:t>Evaluation across 5-fold cross-validation and unbiased 61-patient hold-out test set (measured MLflow values):</w:t>
+      </w:r>
+    </w:p>
+    <w:p>
+      <w:pPr>
+        <w:keepNext/>
+        <w:spacing w:before="80" w:after="40"/>
+      </w:pPr>
+      <w:r>
+        <w:rPr>
+          <w:b/>
+          <w:color w:val="1B365D"/>
+          <w:sz w:val="17"/>
+        </w:rPr>
+        <w:t>Table 6: Candidate Model Cross-Validation and Test Evaluation Metrics</w:t>
       </w:r>
     </w:p>
     <w:tbl>
@@ -4611,10 +4743,10 @@
             <w:tcW w:type="dxa" w:w="2304"/>
             <w:shd w:fill="1B365D"/>
             <w:tcMar>
-              <w:top w:w="80" w:type="dxa"/>
-              <w:bottom w:w="80" w:type="dxa"/>
-              <w:left w:w="100" w:type="dxa"/>
-              <w:right w:w="100" w:type="dxa"/>
+              <w:top w:w="75" w:type="dxa"/>
+              <w:bottom w:w="75" w:type="dxa"/>
+              <w:left w:w="95" w:type="dxa"/>
+              <w:right w:w="95" w:type="dxa"/>
             </w:tcMar>
           </w:tcPr>
           <w:p>
@@ -4636,10 +4768,10 @@
             <w:tcW w:type="dxa" w:w="1080"/>
             <w:shd w:fill="1B365D"/>
             <w:tcMar>
-              <w:top w:w="80" w:type="dxa"/>
-              <w:bottom w:w="80" w:type="dxa"/>
-              <w:left w:w="100" w:type="dxa"/>
-              <w:right w:w="100" w:type="dxa"/>
+              <w:top w:w="75" w:type="dxa"/>
+              <w:bottom w:w="75" w:type="dxa"/>
+              <w:left w:w="95" w:type="dxa"/>
+              <w:right w:w="95" w:type="dxa"/>
             </w:tcMar>
           </w:tcPr>
           <w:p>
@@ -4661,10 +4793,10 @@
             <w:tcW w:type="dxa" w:w="1080"/>
             <w:shd w:fill="1B365D"/>
             <w:tcMar>
-              <w:top w:w="80" w:type="dxa"/>
-              <w:bottom w:w="80" w:type="dxa"/>
-              <w:left w:w="100" w:type="dxa"/>
-              <w:right w:w="100" w:type="dxa"/>
+              <w:top w:w="75" w:type="dxa"/>
+              <w:bottom w:w="75" w:type="dxa"/>
+              <w:left w:w="95" w:type="dxa"/>
+              <w:right w:w="95" w:type="dxa"/>
             </w:tcMar>
           </w:tcPr>
           <w:p>
@@ -4686,10 +4818,10 @@
             <w:tcW w:type="dxa" w:w="1080"/>
             <w:shd w:fill="1B365D"/>
             <w:tcMar>
-              <w:top w:w="80" w:type="dxa"/>
-              <w:bottom w:w="80" w:type="dxa"/>
-              <w:left w:w="100" w:type="dxa"/>
-              <w:right w:w="100" w:type="dxa"/>
+              <w:top w:w="75" w:type="dxa"/>
+              <w:bottom w:w="75" w:type="dxa"/>
+              <w:left w:w="95" w:type="dxa"/>
+              <w:right w:w="95" w:type="dxa"/>
             </w:tcMar>
           </w:tcPr>
           <w:p>
@@ -4711,10 +4843,10 @@
             <w:tcW w:type="dxa" w:w="1080"/>
             <w:shd w:fill="1B365D"/>
             <w:tcMar>
-              <w:top w:w="80" w:type="dxa"/>
-              <w:bottom w:w="80" w:type="dxa"/>
-              <w:left w:w="100" w:type="dxa"/>
-              <w:right w:w="100" w:type="dxa"/>
+              <w:top w:w="75" w:type="dxa"/>
+              <w:bottom w:w="75" w:type="dxa"/>
+              <w:left w:w="95" w:type="dxa"/>
+              <w:right w:w="95" w:type="dxa"/>
             </w:tcMar>
           </w:tcPr>
           <w:p>
@@ -4736,10 +4868,10 @@
             <w:tcW w:type="dxa" w:w="1440"/>
             <w:shd w:fill="1B365D"/>
             <w:tcMar>
-              <w:top w:w="80" w:type="dxa"/>
-              <w:bottom w:w="80" w:type="dxa"/>
-              <w:left w:w="100" w:type="dxa"/>
-              <w:right w:w="100" w:type="dxa"/>
+              <w:top w:w="75" w:type="dxa"/>
+              <w:bottom w:w="75" w:type="dxa"/>
+              <w:left w:w="95" w:type="dxa"/>
+              <w:right w:w="95" w:type="dxa"/>
             </w:tcMar>
           </w:tcPr>
           <w:p>
@@ -4761,10 +4893,10 @@
             <w:tcW w:type="dxa" w:w="1080"/>
             <w:shd w:fill="1B365D"/>
             <w:tcMar>
-              <w:top w:w="80" w:type="dxa"/>
-              <w:bottom w:w="80" w:type="dxa"/>
-              <w:left w:w="100" w:type="dxa"/>
-              <w:right w:w="100" w:type="dxa"/>
+              <w:top w:w="75" w:type="dxa"/>
+              <w:bottom w:w="75" w:type="dxa"/>
+              <w:left w:w="95" w:type="dxa"/>
+              <w:right w:w="95" w:type="dxa"/>
             </w:tcMar>
           </w:tcPr>
           <w:p>
@@ -4786,10 +4918,10 @@
             <w:tcW w:type="dxa" w:w="1368"/>
             <w:shd w:fill="1B365D"/>
             <w:tcMar>
-              <w:top w:w="80" w:type="dxa"/>
-              <w:bottom w:w="80" w:type="dxa"/>
-              <w:left w:w="100" w:type="dxa"/>
-              <w:right w:w="100" w:type="dxa"/>
+              <w:top w:w="75" w:type="dxa"/>
+              <w:bottom w:w="75" w:type="dxa"/>
+              <w:left w:w="95" w:type="dxa"/>
+              <w:right w:w="95" w:type="dxa"/>
             </w:tcMar>
           </w:tcPr>
           <w:p>
@@ -4813,10 +4945,10 @@
             <w:tcW w:type="dxa" w:w="2304"/>
             <w:shd w:fill="F7F9FB"/>
             <w:tcMar>
-              <w:top w:w="55" w:type="dxa"/>
-              <w:bottom w:w="55" w:type="dxa"/>
-              <w:left w:w="100" w:type="dxa"/>
-              <w:right w:w="100" w:type="dxa"/>
+              <w:top w:w="50" w:type="dxa"/>
+              <w:bottom w:w="50" w:type="dxa"/>
+              <w:left w:w="95" w:type="dxa"/>
+              <w:right w:w="95" w:type="dxa"/>
             </w:tcMar>
           </w:tcPr>
           <w:p>
@@ -4837,10 +4969,10 @@
             <w:tcW w:type="dxa" w:w="1080"/>
             <w:shd w:fill="F7F9FB"/>
             <w:tcMar>
-              <w:top w:w="55" w:type="dxa"/>
-              <w:bottom w:w="55" w:type="dxa"/>
-              <w:left w:w="100" w:type="dxa"/>
-              <w:right w:w="100" w:type="dxa"/>
+              <w:top w:w="50" w:type="dxa"/>
+              <w:bottom w:w="50" w:type="dxa"/>
+              <w:left w:w="95" w:type="dxa"/>
+              <w:right w:w="95" w:type="dxa"/>
             </w:tcMar>
           </w:tcPr>
           <w:p>
@@ -4861,10 +4993,10 @@
             <w:tcW w:type="dxa" w:w="1080"/>
             <w:shd w:fill="F7F9FB"/>
             <w:tcMar>
-              <w:top w:w="55" w:type="dxa"/>
-              <w:bottom w:w="55" w:type="dxa"/>
-              <w:left w:w="100" w:type="dxa"/>
-              <w:right w:w="100" w:type="dxa"/>
+              <w:top w:w="50" w:type="dxa"/>
+              <w:bottom w:w="50" w:type="dxa"/>
+              <w:left w:w="95" w:type="dxa"/>
+              <w:right w:w="95" w:type="dxa"/>
             </w:tcMar>
           </w:tcPr>
           <w:p>
@@ -4885,10 +5017,10 @@
             <w:tcW w:type="dxa" w:w="1080"/>
             <w:shd w:fill="F7F9FB"/>
             <w:tcMar>
-              <w:top w:w="55" w:type="dxa"/>
-              <w:bottom w:w="55" w:type="dxa"/>
-              <w:left w:w="100" w:type="dxa"/>
-              <w:right w:w="100" w:type="dxa"/>
+              <w:top w:w="50" w:type="dxa"/>
+              <w:bottom w:w="50" w:type="dxa"/>
+              <w:left w:w="95" w:type="dxa"/>
+              <w:right w:w="95" w:type="dxa"/>
             </w:tcMar>
           </w:tcPr>
           <w:p>
@@ -4909,10 +5041,10 @@
             <w:tcW w:type="dxa" w:w="1080"/>
             <w:shd w:fill="F7F9FB"/>
             <w:tcMar>
-              <w:top w:w="55" w:type="dxa"/>
-              <w:bottom w:w="55" w:type="dxa"/>
-              <w:left w:w="100" w:type="dxa"/>
-              <w:right w:w="100" w:type="dxa"/>
+              <w:top w:w="50" w:type="dxa"/>
+              <w:bottom w:w="50" w:type="dxa"/>
+              <w:left w:w="95" w:type="dxa"/>
+              <w:right w:w="95" w:type="dxa"/>
             </w:tcMar>
           </w:tcPr>
           <w:p>
@@ -4933,10 +5065,10 @@
             <w:tcW w:type="dxa" w:w="1440"/>
             <w:shd w:fill="F7F9FB"/>
             <w:tcMar>
-              <w:top w:w="55" w:type="dxa"/>
-              <w:bottom w:w="55" w:type="dxa"/>
-              <w:left w:w="100" w:type="dxa"/>
-              <w:right w:w="100" w:type="dxa"/>
+              <w:top w:w="50" w:type="dxa"/>
+              <w:bottom w:w="50" w:type="dxa"/>
+              <w:left w:w="95" w:type="dxa"/>
+              <w:right w:w="95" w:type="dxa"/>
             </w:tcMar>
           </w:tcPr>
           <w:p>
@@ -4957,10 +5089,10 @@
             <w:tcW w:type="dxa" w:w="1080"/>
             <w:shd w:fill="F7F9FB"/>
             <w:tcMar>
-              <w:top w:w="55" w:type="dxa"/>
-              <w:bottom w:w="55" w:type="dxa"/>
-              <w:left w:w="100" w:type="dxa"/>
-              <w:right w:w="100" w:type="dxa"/>
+              <w:top w:w="50" w:type="dxa"/>
+              <w:bottom w:w="50" w:type="dxa"/>
+              <w:left w:w="95" w:type="dxa"/>
+              <w:right w:w="95" w:type="dxa"/>
             </w:tcMar>
           </w:tcPr>
           <w:p>
@@ -4981,10 +5113,10 @@
             <w:tcW w:type="dxa" w:w="1368"/>
             <w:shd w:fill="F7F9FB"/>
             <w:tcMar>
-              <w:top w:w="55" w:type="dxa"/>
-              <w:bottom w:w="55" w:type="dxa"/>
-              <w:left w:w="100" w:type="dxa"/>
-              <w:right w:w="100" w:type="dxa"/>
+              <w:top w:w="50" w:type="dxa"/>
+              <w:bottom w:w="50" w:type="dxa"/>
+              <w:left w:w="95" w:type="dxa"/>
+              <w:right w:w="95" w:type="dxa"/>
             </w:tcMar>
           </w:tcPr>
           <w:p>
@@ -5007,10 +5139,10 @@
             <w:tcW w:type="dxa" w:w="2304"/>
             <w:shd w:fill="FFFFFF"/>
             <w:tcMar>
-              <w:top w:w="55" w:type="dxa"/>
-              <w:bottom w:w="55" w:type="dxa"/>
-              <w:left w:w="100" w:type="dxa"/>
-              <w:right w:w="100" w:type="dxa"/>
+              <w:top w:w="50" w:type="dxa"/>
+              <w:bottom w:w="50" w:type="dxa"/>
+              <w:left w:w="95" w:type="dxa"/>
+              <w:right w:w="95" w:type="dxa"/>
             </w:tcMar>
           </w:tcPr>
           <w:p>
@@ -5031,10 +5163,10 @@
             <w:tcW w:type="dxa" w:w="1080"/>
             <w:shd w:fill="FFFFFF"/>
             <w:tcMar>
-              <w:top w:w="55" w:type="dxa"/>
-              <w:bottom w:w="55" w:type="dxa"/>
-              <w:left w:w="100" w:type="dxa"/>
-              <w:right w:w="100" w:type="dxa"/>
+              <w:top w:w="50" w:type="dxa"/>
+              <w:bottom w:w="50" w:type="dxa"/>
+              <w:left w:w="95" w:type="dxa"/>
+              <w:right w:w="95" w:type="dxa"/>
             </w:tcMar>
           </w:tcPr>
           <w:p>
@@ -5055,10 +5187,10 @@
             <w:tcW w:type="dxa" w:w="1080"/>
             <w:shd w:fill="FFFFFF"/>
             <w:tcMar>
-              <w:top w:w="55" w:type="dxa"/>
-              <w:bottom w:w="55" w:type="dxa"/>
-              <w:left w:w="100" w:type="dxa"/>
-              <w:right w:w="100" w:type="dxa"/>
+              <w:top w:w="50" w:type="dxa"/>
+              <w:bottom w:w="50" w:type="dxa"/>
+              <w:left w:w="95" w:type="dxa"/>
+              <w:right w:w="95" w:type="dxa"/>
             </w:tcMar>
           </w:tcPr>
           <w:p>
@@ -5079,10 +5211,10 @@
             <w:tcW w:type="dxa" w:w="1080"/>
             <w:shd w:fill="FFFFFF"/>
             <w:tcMar>
-              <w:top w:w="55" w:type="dxa"/>
-              <w:bottom w:w="55" w:type="dxa"/>
-              <w:left w:w="100" w:type="dxa"/>
-              <w:right w:w="100" w:type="dxa"/>
+              <w:top w:w="50" w:type="dxa"/>
+              <w:bottom w:w="50" w:type="dxa"/>
+              <w:left w:w="95" w:type="dxa"/>
+              <w:right w:w="95" w:type="dxa"/>
             </w:tcMar>
           </w:tcPr>
           <w:p>
@@ -5103,10 +5235,10 @@
             <w:tcW w:type="dxa" w:w="1080"/>
             <w:shd w:fill="FFFFFF"/>
             <w:tcMar>
-              <w:top w:w="55" w:type="dxa"/>
-              <w:bottom w:w="55" w:type="dxa"/>
-              <w:left w:w="100" w:type="dxa"/>
-              <w:right w:w="100" w:type="dxa"/>
+              <w:top w:w="50" w:type="dxa"/>
+              <w:bottom w:w="50" w:type="dxa"/>
+              <w:left w:w="95" w:type="dxa"/>
+              <w:right w:w="95" w:type="dxa"/>
             </w:tcMar>
           </w:tcPr>
           <w:p>
@@ -5127,10 +5259,10 @@
             <w:tcW w:type="dxa" w:w="1440"/>
             <w:shd w:fill="FFFFFF"/>
             <w:tcMar>
-              <w:top w:w="55" w:type="dxa"/>
-              <w:bottom w:w="55" w:type="dxa"/>
-              <w:left w:w="100" w:type="dxa"/>
-              <w:right w:w="100" w:type="dxa"/>
+              <w:top w:w="50" w:type="dxa"/>
+              <w:bottom w:w="50" w:type="dxa"/>
+              <w:left w:w="95" w:type="dxa"/>
+              <w:right w:w="95" w:type="dxa"/>
             </w:tcMar>
           </w:tcPr>
           <w:p>
@@ -5151,10 +5283,10 @@
             <w:tcW w:type="dxa" w:w="1080"/>
             <w:shd w:fill="FFFFFF"/>
             <w:tcMar>
-              <w:top w:w="55" w:type="dxa"/>
-              <w:bottom w:w="55" w:type="dxa"/>
-              <w:left w:w="100" w:type="dxa"/>
-              <w:right w:w="100" w:type="dxa"/>
+              <w:top w:w="50" w:type="dxa"/>
+              <w:bottom w:w="50" w:type="dxa"/>
+              <w:left w:w="95" w:type="dxa"/>
+              <w:right w:w="95" w:type="dxa"/>
             </w:tcMar>
           </w:tcPr>
           <w:p>
@@ -5175,10 +5307,10 @@
             <w:tcW w:type="dxa" w:w="1368"/>
             <w:shd w:fill="FFFFFF"/>
             <w:tcMar>
-              <w:top w:w="55" w:type="dxa"/>
-              <w:bottom w:w="55" w:type="dxa"/>
-              <w:left w:w="100" w:type="dxa"/>
-              <w:right w:w="100" w:type="dxa"/>
+              <w:top w:w="50" w:type="dxa"/>
+              <w:bottom w:w="50" w:type="dxa"/>
+              <w:left w:w="95" w:type="dxa"/>
+              <w:right w:w="95" w:type="dxa"/>
             </w:tcMar>
           </w:tcPr>
           <w:p>
@@ -5201,10 +5333,10 @@
             <w:tcW w:type="dxa" w:w="2304"/>
             <w:shd w:fill="F7F9FB"/>
             <w:tcMar>
-              <w:top w:w="55" w:type="dxa"/>
-              <w:bottom w:w="55" w:type="dxa"/>
-              <w:left w:w="100" w:type="dxa"/>
-              <w:right w:w="100" w:type="dxa"/>
+              <w:top w:w="50" w:type="dxa"/>
+              <w:bottom w:w="50" w:type="dxa"/>
+              <w:left w:w="95" w:type="dxa"/>
+              <w:right w:w="95" w:type="dxa"/>
             </w:tcMar>
           </w:tcPr>
           <w:p>
@@ -5225,10 +5357,10 @@
             <w:tcW w:type="dxa" w:w="1080"/>
             <w:shd w:fill="F7F9FB"/>
             <w:tcMar>
-              <w:top w:w="55" w:type="dxa"/>
-              <w:bottom w:w="55" w:type="dxa"/>
-              <w:left w:w="100" w:type="dxa"/>
-              <w:right w:w="100" w:type="dxa"/>
+              <w:top w:w="50" w:type="dxa"/>
+              <w:bottom w:w="50" w:type="dxa"/>
+              <w:left w:w="95" w:type="dxa"/>
+              <w:right w:w="95" w:type="dxa"/>
             </w:tcMar>
           </w:tcPr>
           <w:p>
@@ -5249,10 +5381,10 @@
             <w:tcW w:type="dxa" w:w="1080"/>
             <w:shd w:fill="F7F9FB"/>
             <w:tcMar>
-              <w:top w:w="55" w:type="dxa"/>
-              <w:bottom w:w="55" w:type="dxa"/>
-              <w:left w:w="100" w:type="dxa"/>
-              <w:right w:w="100" w:type="dxa"/>
+              <w:top w:w="50" w:type="dxa"/>
+              <w:bottom w:w="50" w:type="dxa"/>
+              <w:left w:w="95" w:type="dxa"/>
+              <w:right w:w="95" w:type="dxa"/>
             </w:tcMar>
           </w:tcPr>
           <w:p>
@@ -5273,10 +5405,10 @@
             <w:tcW w:type="dxa" w:w="1080"/>
             <w:shd w:fill="F7F9FB"/>
             <w:tcMar>
-              <w:top w:w="55" w:type="dxa"/>
-              <w:bottom w:w="55" w:type="dxa"/>
-              <w:left w:w="100" w:type="dxa"/>
-              <w:right w:w="100" w:type="dxa"/>
+              <w:top w:w="50" w:type="dxa"/>
+              <w:bottom w:w="50" w:type="dxa"/>
+              <w:left w:w="95" w:type="dxa"/>
+              <w:right w:w="95" w:type="dxa"/>
             </w:tcMar>
           </w:tcPr>
           <w:p>
@@ -5297,10 +5429,10 @@
             <w:tcW w:type="dxa" w:w="1080"/>
             <w:shd w:fill="F7F9FB"/>
             <w:tcMar>
-              <w:top w:w="55" w:type="dxa"/>
-              <w:bottom w:w="55" w:type="dxa"/>
-              <w:left w:w="100" w:type="dxa"/>
-              <w:right w:w="100" w:type="dxa"/>
+              <w:top w:w="50" w:type="dxa"/>
+              <w:bottom w:w="50" w:type="dxa"/>
+              <w:left w:w="95" w:type="dxa"/>
+              <w:right w:w="95" w:type="dxa"/>
             </w:tcMar>
           </w:tcPr>
           <w:p>
@@ -5321,10 +5453,10 @@
             <w:tcW w:type="dxa" w:w="1440"/>
             <w:shd w:fill="F7F9FB"/>
             <w:tcMar>
-              <w:top w:w="55" w:type="dxa"/>
-              <w:bottom w:w="55" w:type="dxa"/>
-              <w:left w:w="100" w:type="dxa"/>
-              <w:right w:w="100" w:type="dxa"/>
+              <w:top w:w="50" w:type="dxa"/>
+              <w:bottom w:w="50" w:type="dxa"/>
+              <w:left w:w="95" w:type="dxa"/>
+              <w:right w:w="95" w:type="dxa"/>
             </w:tcMar>
           </w:tcPr>
           <w:p>
@@ -5345,10 +5477,10 @@
             <w:tcW w:type="dxa" w:w="1080"/>
             <w:shd w:fill="F7F9FB"/>
             <w:tcMar>
-              <w:top w:w="55" w:type="dxa"/>
-              <w:bottom w:w="55" w:type="dxa"/>
-              <w:left w:w="100" w:type="dxa"/>
-              <w:right w:w="100" w:type="dxa"/>
+              <w:top w:w="50" w:type="dxa"/>
+              <w:bottom w:w="50" w:type="dxa"/>
+              <w:left w:w="95" w:type="dxa"/>
+              <w:right w:w="95" w:type="dxa"/>
             </w:tcMar>
           </w:tcPr>
           <w:p>
@@ -5369,10 +5501,10 @@
             <w:tcW w:type="dxa" w:w="1368"/>
             <w:shd w:fill="F7F9FB"/>
             <w:tcMar>
-              <w:top w:w="55" w:type="dxa"/>
-              <w:bottom w:w="55" w:type="dxa"/>
-              <w:left w:w="100" w:type="dxa"/>
-              <w:right w:w="100" w:type="dxa"/>
+              <w:top w:w="50" w:type="dxa"/>
+              <w:bottom w:w="50" w:type="dxa"/>
+              <w:left w:w="95" w:type="dxa"/>
+              <w:right w:w="95" w:type="dxa"/>
             </w:tcMar>
           </w:tcPr>
           <w:p>
@@ -5601,13 +5733,13 @@
       <w:pPr>
         <w:pStyle w:val="Heading1"/>
         <w:keepNext/>
-        <w:spacing w:before="200" w:after="40"/>
+        <w:spacing w:before="180" w:after="40"/>
       </w:pPr>
       <w:r>
         <w:rPr>
           <w:b/>
           <w:color w:val="1B365D"/>
-          <w:sz w:val="26"/>
+          <w:sz w:val="25"/>
         </w:rPr>
         <w:t>5. Experiment tracking</w:t>
       </w:r>
@@ -5796,7 +5928,7 @@
           <w:color w:val="505050"/>
           <w:sz w:val="16"/>
         </w:rPr>
-        <w:t>Fig 9. MLflow run detail view: Logged parameters (10) and cross-validation/test metrics (16) for champion Logistic Regression.</w:t>
+        <w:t>Fig 9. MLflow run detail view: Logged parameters (10, confirming grid_size = 6, inner_folds = 3, outer_folds = 5) and metrics (16) for champion Logistic Regression.</w:t>
       </w:r>
     </w:p>
     <w:p>
@@ -5862,13 +5994,13 @@
       <w:pPr>
         <w:pStyle w:val="Heading1"/>
         <w:keepNext/>
-        <w:spacing w:before="200" w:after="40"/>
+        <w:spacing w:before="180" w:after="40"/>
       </w:pPr>
       <w:r>
         <w:rPr>
           <w:b/>
           <w:color w:val="1B365D"/>
-          <w:sz w:val="26"/>
+          <w:sz w:val="25"/>
         </w:rPr>
         <w:t>6. Model packaging and reproducibility</w:t>
       </w:r>
@@ -5977,13 +6109,13 @@
       <w:pPr>
         <w:pStyle w:val="Heading1"/>
         <w:keepNext/>
-        <w:spacing w:before="200" w:after="40"/>
+        <w:spacing w:before="180" w:after="40"/>
       </w:pPr>
       <w:r>
         <w:rPr>
           <w:b/>
           <w:color w:val="1B365D"/>
-          <w:sz w:val="26"/>
+          <w:sz w:val="25"/>
         </w:rPr>
         <w:t>7. CI/CD pipeline and automated testing</w:t>
       </w:r>
@@ -6005,6 +6137,20 @@
           <w:sz w:val="19"/>
         </w:rPr>
         <w:t>The automated test suite comprises 21 offline unit tests executed via pytest:</w:t>
+      </w:r>
+    </w:p>
+    <w:p>
+      <w:pPr>
+        <w:keepNext/>
+        <w:spacing w:before="80" w:after="40"/>
+      </w:pPr>
+      <w:r>
+        <w:rPr>
+          <w:b/>
+          <w:color w:val="1B365D"/>
+          <w:sz w:val="17"/>
+        </w:rPr>
+        <w:t>Table 7: Automated Unit Test Suite Scope (21 pytest tests)</w:t>
       </w:r>
     </w:p>
     <w:tbl>
@@ -6031,10 +6177,10 @@
             <w:tcW w:type="dxa" w:w="2592"/>
             <w:shd w:fill="1B365D"/>
             <w:tcMar>
-              <w:top w:w="80" w:type="dxa"/>
-              <w:bottom w:w="80" w:type="dxa"/>
-              <w:left w:w="100" w:type="dxa"/>
-              <w:right w:w="100" w:type="dxa"/>
+              <w:top w:w="75" w:type="dxa"/>
+              <w:bottom w:w="75" w:type="dxa"/>
+              <w:left w:w="95" w:type="dxa"/>
+              <w:right w:w="95" w:type="dxa"/>
             </w:tcMar>
           </w:tcPr>
           <w:p>
@@ -6056,10 +6202,10 @@
             <w:tcW w:type="dxa" w:w="7200"/>
             <w:shd w:fill="1B365D"/>
             <w:tcMar>
-              <w:top w:w="80" w:type="dxa"/>
-              <w:bottom w:w="80" w:type="dxa"/>
-              <w:left w:w="100" w:type="dxa"/>
-              <w:right w:w="100" w:type="dxa"/>
+              <w:top w:w="75" w:type="dxa"/>
+              <w:bottom w:w="75" w:type="dxa"/>
+              <w:left w:w="95" w:type="dxa"/>
+              <w:right w:w="95" w:type="dxa"/>
             </w:tcMar>
           </w:tcPr>
           <w:p>
@@ -6083,10 +6229,10 @@
             <w:tcW w:type="dxa" w:w="2592"/>
             <w:shd w:fill="F7F9FB"/>
             <w:tcMar>
-              <w:top w:w="55" w:type="dxa"/>
-              <w:bottom w:w="55" w:type="dxa"/>
-              <w:left w:w="100" w:type="dxa"/>
-              <w:right w:w="100" w:type="dxa"/>
+              <w:top w:w="50" w:type="dxa"/>
+              <w:bottom w:w="50" w:type="dxa"/>
+              <w:left w:w="95" w:type="dxa"/>
+              <w:right w:w="95" w:type="dxa"/>
             </w:tcMar>
           </w:tcPr>
           <w:p>
@@ -6107,10 +6253,10 @@
             <w:tcW w:type="dxa" w:w="7200"/>
             <w:shd w:fill="F7F9FB"/>
             <w:tcMar>
-              <w:top w:w="55" w:type="dxa"/>
-              <w:bottom w:w="55" w:type="dxa"/>
-              <w:left w:w="100" w:type="dxa"/>
-              <w:right w:w="100" w:type="dxa"/>
+              <w:top w:w="50" w:type="dxa"/>
+              <w:bottom w:w="50" w:type="dxa"/>
+              <w:left w:w="95" w:type="dxa"/>
+              <w:right w:w="95" w:type="dxa"/>
             </w:tcMar>
           </w:tcPr>
           <w:p>
@@ -6133,10 +6279,10 @@
             <w:tcW w:type="dxa" w:w="2592"/>
             <w:shd w:fill="FFFFFF"/>
             <w:tcMar>
-              <w:top w:w="55" w:type="dxa"/>
-              <w:bottom w:w="55" w:type="dxa"/>
-              <w:left w:w="100" w:type="dxa"/>
-              <w:right w:w="100" w:type="dxa"/>
+              <w:top w:w="50" w:type="dxa"/>
+              <w:bottom w:w="50" w:type="dxa"/>
+              <w:left w:w="95" w:type="dxa"/>
+              <w:right w:w="95" w:type="dxa"/>
             </w:tcMar>
           </w:tcPr>
           <w:p>
@@ -6157,10 +6303,10 @@
             <w:tcW w:type="dxa" w:w="7200"/>
             <w:shd w:fill="FFFFFF"/>
             <w:tcMar>
-              <w:top w:w="55" w:type="dxa"/>
-              <w:bottom w:w="55" w:type="dxa"/>
-              <w:left w:w="100" w:type="dxa"/>
-              <w:right w:w="100" w:type="dxa"/>
+              <w:top w:w="50" w:type="dxa"/>
+              <w:bottom w:w="50" w:type="dxa"/>
+              <w:left w:w="95" w:type="dxa"/>
+              <w:right w:w="95" w:type="dxa"/>
             </w:tcMar>
           </w:tcPr>
           <w:p>
@@ -6183,10 +6329,10 @@
             <w:tcW w:type="dxa" w:w="2592"/>
             <w:shd w:fill="F7F9FB"/>
             <w:tcMar>
-              <w:top w:w="55" w:type="dxa"/>
-              <w:bottom w:w="55" w:type="dxa"/>
-              <w:left w:w="100" w:type="dxa"/>
-              <w:right w:w="100" w:type="dxa"/>
+              <w:top w:w="50" w:type="dxa"/>
+              <w:bottom w:w="50" w:type="dxa"/>
+              <w:left w:w="95" w:type="dxa"/>
+              <w:right w:w="95" w:type="dxa"/>
             </w:tcMar>
           </w:tcPr>
           <w:p>
@@ -6207,10 +6353,10 @@
             <w:tcW w:type="dxa" w:w="7200"/>
             <w:shd w:fill="F7F9FB"/>
             <w:tcMar>
-              <w:top w:w="55" w:type="dxa"/>
-              <w:bottom w:w="55" w:type="dxa"/>
-              <w:left w:w="100" w:type="dxa"/>
-              <w:right w:w="100" w:type="dxa"/>
+              <w:top w:w="50" w:type="dxa"/>
+              <w:bottom w:w="50" w:type="dxa"/>
+              <w:left w:w="95" w:type="dxa"/>
+              <w:right w:w="95" w:type="dxa"/>
             </w:tcMar>
           </w:tcPr>
           <w:p>
@@ -6233,10 +6379,10 @@
             <w:tcW w:type="dxa" w:w="2592"/>
             <w:shd w:fill="FFFFFF"/>
             <w:tcMar>
-              <w:top w:w="55" w:type="dxa"/>
-              <w:bottom w:w="55" w:type="dxa"/>
-              <w:left w:w="100" w:type="dxa"/>
-              <w:right w:w="100" w:type="dxa"/>
+              <w:top w:w="50" w:type="dxa"/>
+              <w:bottom w:w="50" w:type="dxa"/>
+              <w:left w:w="95" w:type="dxa"/>
+              <w:right w:w="95" w:type="dxa"/>
             </w:tcMar>
           </w:tcPr>
           <w:p>
@@ -6257,10 +6403,10 @@
             <w:tcW w:type="dxa" w:w="7200"/>
             <w:shd w:fill="FFFFFF"/>
             <w:tcMar>
-              <w:top w:w="55" w:type="dxa"/>
-              <w:bottom w:w="55" w:type="dxa"/>
-              <w:left w:w="100" w:type="dxa"/>
-              <w:right w:w="100" w:type="dxa"/>
+              <w:top w:w="50" w:type="dxa"/>
+              <w:bottom w:w="50" w:type="dxa"/>
+              <w:left w:w="95" w:type="dxa"/>
+              <w:right w:w="95" w:type="dxa"/>
             </w:tcMar>
           </w:tcPr>
           <w:p>
@@ -6341,7 +6487,7 @@
       <w:pPr>
         <w:pStyle w:val="Heading2"/>
         <w:keepNext/>
-        <w:spacing w:before="140" w:after="40"/>
+        <w:spacing w:before="120" w:after="40"/>
       </w:pPr>
       <w:r>
         <w:rPr>
@@ -6361,7 +6507,7 @@
           <w:color w:val="232323"/>
           <w:sz w:val="19"/>
         </w:rPr>
-        <w:t>Continuous integration triggers on push to main, pull requests, and manual triggers. It enforces four sequential jobs: Job 1 (lint): flake8 style conformance; Job 2 (test): installs dependencies, runs 21 pytest tests with coverage; Job 3 (train): runs download, EDA, nested CV model training, and uploads artifacts; Job 4 (docker): builds the serving image and runs smoke tests. Any failure in an upstream job halts the pipeline immediately (fail-fast).</w:t>
+        <w:t>Continuous integration triggers on push to main, pull requests, and manual triggers. It enforces four sequential jobs: Job 1 (lint): flake8 style conformance; Job 2 (test): installs dependencies, runs 21 pytest tests with coverage; Job 3 (train): runs download, EDA, nested CV model training, and uploads artifacts; Job 4 (docker): builds the serving image and runs smoke tests. The CI/CD pipeline enforces strict quality gates: any PEP 8 style violation or failing pytest unit test immediately halts the pipeline with non-zero exit code, preventing defective code from reaching training or packaging.</w:t>
       </w:r>
     </w:p>
     <w:p>
@@ -6415,7 +6561,7 @@
           <w:color w:val="505050"/>
           <w:sz w:val="16"/>
         </w:rPr>
-        <w:t>Fig 12. Fail-fast demonstration: An intentional PEP 8 lint error halts the GitHub Actions pipeline at Job 1, preventing defective code from reaching deployment.</w:t>
+        <w:t>Fig 12. CI/CD fail-fast verification: Job 1 (lint) strictly halts the pipeline upon flake8 line-length violations in helper scripts, preventing defective code from progressing to testing, training, or container build stages.</w:t>
       </w:r>
     </w:p>
     <w:p>
@@ -6469,7 +6615,7 @@
           <w:color w:val="505050"/>
           <w:sz w:val="16"/>
         </w:rPr>
-        <w:t>Fig 13. GitHub Actions workflow history: Illustrating fail-fast termination on run #1 (red) followed by resolution on run #2 (green).</w:t>
+        <w:t>Fig 13. GitHub Actions workflow run history: Showing initial build failure on run #1 (red) followed by resolution on run #2 (green) after standardizing setup.cfg to enforce strict linting across core production and test modules.</w:t>
       </w:r>
     </w:p>
     <w:p>
@@ -6481,7 +6627,7 @@
       <w:pPr>
         <w:pStyle w:val="Heading2"/>
         <w:keepNext/>
-        <w:spacing w:before="140" w:after="40"/>
+        <w:spacing w:before="120" w:after="40"/>
       </w:pPr>
       <w:r>
         <w:rPr>
@@ -6663,13 +6809,13 @@
       <w:pPr>
         <w:pStyle w:val="Heading1"/>
         <w:keepNext/>
-        <w:spacing w:before="200" w:after="40"/>
+        <w:spacing w:before="180" w:after="40"/>
       </w:pPr>
       <w:r>
         <w:rPr>
           <w:b/>
           <w:color w:val="1B365D"/>
-          <w:sz w:val="26"/>
+          <w:sz w:val="25"/>
         </w:rPr>
         <w:t>8. Containerization and API</w:t>
       </w:r>
@@ -6769,10 +6915,10 @@
             <w:tcW w:type="dxa" w:w="9792"/>
             <w:shd w:fill="F0F4F8"/>
             <w:tcMar>
-              <w:top w:w="80" w:type="dxa"/>
-              <w:bottom w:w="80" w:type="dxa"/>
-              <w:left w:w="130" w:type="dxa"/>
-              <w:right w:w="130" w:type="dxa"/>
+              <w:top w:w="70" w:type="dxa"/>
+              <w:bottom w:w="70" w:type="dxa"/>
+              <w:left w:w="120" w:type="dxa"/>
+              <w:right w:w="120" w:type="dxa"/>
             </w:tcMar>
             <w:tcBorders>
               <w:left w:val="single" w:sz="20" w:space="0" w:color="1B365D"/>
@@ -7009,7 +7155,7 @@
       <w:pPr>
         <w:pStyle w:val="Heading2"/>
         <w:keepNext/>
-        <w:spacing w:before="140" w:after="40"/>
+        <w:spacing w:before="120" w:after="40"/>
       </w:pPr>
       <w:r>
         <w:rPr>
@@ -7101,10 +7247,10 @@
             <w:tcW w:type="dxa" w:w="9792"/>
             <w:shd w:fill="F0F4F8"/>
             <w:tcMar>
-              <w:top w:w="80" w:type="dxa"/>
-              <w:bottom w:w="80" w:type="dxa"/>
-              <w:left w:w="130" w:type="dxa"/>
-              <w:right w:w="130" w:type="dxa"/>
+              <w:top w:w="70" w:type="dxa"/>
+              <w:bottom w:w="70" w:type="dxa"/>
+              <w:left w:w="120" w:type="dxa"/>
+              <w:right w:w="120" w:type="dxa"/>
             </w:tcMar>
             <w:tcBorders>
               <w:left w:val="single" w:sz="20" w:space="0" w:color="1B365D"/>
@@ -7195,13 +7341,13 @@
       <w:pPr>
         <w:pStyle w:val="Heading1"/>
         <w:keepNext/>
-        <w:spacing w:before="200" w:after="40"/>
+        <w:spacing w:before="180" w:after="40"/>
       </w:pPr>
       <w:r>
         <w:rPr>
           <w:b/>
           <w:color w:val="1B365D"/>
-          <w:sz w:val="26"/>
+          <w:sz w:val="25"/>
         </w:rPr>
         <w:t>9. Production deployment (Kubernetes)</w:t>
       </w:r>
@@ -7223,6 +7369,20 @@
           <w:sz w:val="19"/>
         </w:rPr>
         <w:t>Declarative Kubernetes manifests (k8s/) support scalable production deployment across local clusters (Docker Desktop Kubernetes, Minikube) and managed cloud platforms (GKE, EKS, AKS):</w:t>
+      </w:r>
+    </w:p>
+    <w:p>
+      <w:pPr>
+        <w:keepNext/>
+        <w:spacing w:before="80" w:after="40"/>
+      </w:pPr>
+      <w:r>
+        <w:rPr>
+          <w:b/>
+          <w:color w:val="1B365D"/>
+          <w:sz w:val="17"/>
+        </w:rPr>
+        <w:t>Table 8: Declarative Kubernetes Manifests Specification</w:t>
       </w:r>
     </w:p>
     <w:tbl>
@@ -7250,10 +7410,10 @@
             <w:tcW w:type="dxa" w:w="2592"/>
             <w:shd w:fill="1B365D"/>
             <w:tcMar>
-              <w:top w:w="80" w:type="dxa"/>
-              <w:bottom w:w="80" w:type="dxa"/>
-              <w:left w:w="100" w:type="dxa"/>
-              <w:right w:w="100" w:type="dxa"/>
+              <w:top w:w="75" w:type="dxa"/>
+              <w:bottom w:w="75" w:type="dxa"/>
+              <w:left w:w="95" w:type="dxa"/>
+              <w:right w:w="95" w:type="dxa"/>
             </w:tcMar>
           </w:tcPr>
           <w:p>
@@ -7275,10 +7435,10 @@
             <w:tcW w:type="dxa" w:w="2592"/>
             <w:shd w:fill="1B365D"/>
             <w:tcMar>
-              <w:top w:w="80" w:type="dxa"/>
-              <w:bottom w:w="80" w:type="dxa"/>
-              <w:left w:w="100" w:type="dxa"/>
-              <w:right w:w="100" w:type="dxa"/>
+              <w:top w:w="75" w:type="dxa"/>
+              <w:bottom w:w="75" w:type="dxa"/>
+              <w:left w:w="95" w:type="dxa"/>
+              <w:right w:w="95" w:type="dxa"/>
             </w:tcMar>
           </w:tcPr>
           <w:p>
@@ -7300,10 +7460,10 @@
             <w:tcW w:type="dxa" w:w="4608"/>
             <w:shd w:fill="1B365D"/>
             <w:tcMar>
-              <w:top w:w="80" w:type="dxa"/>
-              <w:bottom w:w="80" w:type="dxa"/>
-              <w:left w:w="100" w:type="dxa"/>
-              <w:right w:w="100" w:type="dxa"/>
+              <w:top w:w="75" w:type="dxa"/>
+              <w:bottom w:w="75" w:type="dxa"/>
+              <w:left w:w="95" w:type="dxa"/>
+              <w:right w:w="95" w:type="dxa"/>
             </w:tcMar>
           </w:tcPr>
           <w:p>
@@ -7327,10 +7487,10 @@
             <w:tcW w:type="dxa" w:w="2592"/>
             <w:shd w:fill="F7F9FB"/>
             <w:tcMar>
-              <w:top w:w="55" w:type="dxa"/>
-              <w:bottom w:w="55" w:type="dxa"/>
-              <w:left w:w="100" w:type="dxa"/>
-              <w:right w:w="100" w:type="dxa"/>
+              <w:top w:w="50" w:type="dxa"/>
+              <w:bottom w:w="50" w:type="dxa"/>
+              <w:left w:w="95" w:type="dxa"/>
+              <w:right w:w="95" w:type="dxa"/>
             </w:tcMar>
           </w:tcPr>
           <w:p>
@@ -7351,10 +7511,10 @@
             <w:tcW w:type="dxa" w:w="2592"/>
             <w:shd w:fill="F7F9FB"/>
             <w:tcMar>
-              <w:top w:w="55" w:type="dxa"/>
-              <w:bottom w:w="55" w:type="dxa"/>
-              <w:left w:w="100" w:type="dxa"/>
-              <w:right w:w="100" w:type="dxa"/>
+              <w:top w:w="50" w:type="dxa"/>
+              <w:bottom w:w="50" w:type="dxa"/>
+              <w:left w:w="95" w:type="dxa"/>
+              <w:right w:w="95" w:type="dxa"/>
             </w:tcMar>
           </w:tcPr>
           <w:p>
@@ -7375,10 +7535,10 @@
             <w:tcW w:type="dxa" w:w="4608"/>
             <w:shd w:fill="F7F9FB"/>
             <w:tcMar>
-              <w:top w:w="55" w:type="dxa"/>
-              <w:bottom w:w="55" w:type="dxa"/>
-              <w:left w:w="100" w:type="dxa"/>
-              <w:right w:w="100" w:type="dxa"/>
+              <w:top w:w="50" w:type="dxa"/>
+              <w:bottom w:w="50" w:type="dxa"/>
+              <w:left w:w="95" w:type="dxa"/>
+              <w:right w:w="95" w:type="dxa"/>
             </w:tcMar>
           </w:tcPr>
           <w:p>
@@ -7401,10 +7561,10 @@
             <w:tcW w:type="dxa" w:w="2592"/>
             <w:shd w:fill="FFFFFF"/>
             <w:tcMar>
-              <w:top w:w="55" w:type="dxa"/>
-              <w:bottom w:w="55" w:type="dxa"/>
-              <w:left w:w="100" w:type="dxa"/>
-              <w:right w:w="100" w:type="dxa"/>
+              <w:top w:w="50" w:type="dxa"/>
+              <w:bottom w:w="50" w:type="dxa"/>
+              <w:left w:w="95" w:type="dxa"/>
+              <w:right w:w="95" w:type="dxa"/>
             </w:tcMar>
           </w:tcPr>
           <w:p>
@@ -7425,10 +7585,10 @@
             <w:tcW w:type="dxa" w:w="2592"/>
             <w:shd w:fill="FFFFFF"/>
             <w:tcMar>
-              <w:top w:w="55" w:type="dxa"/>
-              <w:bottom w:w="55" w:type="dxa"/>
-              <w:left w:w="100" w:type="dxa"/>
-              <w:right w:w="100" w:type="dxa"/>
+              <w:top w:w="50" w:type="dxa"/>
+              <w:bottom w:w="50" w:type="dxa"/>
+              <w:left w:w="95" w:type="dxa"/>
+              <w:right w:w="95" w:type="dxa"/>
             </w:tcMar>
           </w:tcPr>
           <w:p>
@@ -7449,10 +7609,10 @@
             <w:tcW w:type="dxa" w:w="4608"/>
             <w:shd w:fill="FFFFFF"/>
             <w:tcMar>
-              <w:top w:w="55" w:type="dxa"/>
-              <w:bottom w:w="55" w:type="dxa"/>
-              <w:left w:w="100" w:type="dxa"/>
-              <w:right w:w="100" w:type="dxa"/>
+              <w:top w:w="50" w:type="dxa"/>
+              <w:bottom w:w="50" w:type="dxa"/>
+              <w:left w:w="95" w:type="dxa"/>
+              <w:right w:w="95" w:type="dxa"/>
             </w:tcMar>
           </w:tcPr>
           <w:p>
@@ -7475,10 +7635,10 @@
             <w:tcW w:type="dxa" w:w="2592"/>
             <w:shd w:fill="F7F9FB"/>
             <w:tcMar>
-              <w:top w:w="55" w:type="dxa"/>
-              <w:bottom w:w="55" w:type="dxa"/>
-              <w:left w:w="100" w:type="dxa"/>
-              <w:right w:w="100" w:type="dxa"/>
+              <w:top w:w="50" w:type="dxa"/>
+              <w:bottom w:w="50" w:type="dxa"/>
+              <w:left w:w="95" w:type="dxa"/>
+              <w:right w:w="95" w:type="dxa"/>
             </w:tcMar>
           </w:tcPr>
           <w:p>
@@ -7499,10 +7659,10 @@
             <w:tcW w:type="dxa" w:w="2592"/>
             <w:shd w:fill="F7F9FB"/>
             <w:tcMar>
-              <w:top w:w="55" w:type="dxa"/>
-              <w:bottom w:w="55" w:type="dxa"/>
-              <w:left w:w="100" w:type="dxa"/>
-              <w:right w:w="100" w:type="dxa"/>
+              <w:top w:w="50" w:type="dxa"/>
+              <w:bottom w:w="50" w:type="dxa"/>
+              <w:left w:w="95" w:type="dxa"/>
+              <w:right w:w="95" w:type="dxa"/>
             </w:tcMar>
           </w:tcPr>
           <w:p>
@@ -7523,10 +7683,10 @@
             <w:tcW w:type="dxa" w:w="4608"/>
             <w:shd w:fill="F7F9FB"/>
             <w:tcMar>
-              <w:top w:w="55" w:type="dxa"/>
-              <w:bottom w:w="55" w:type="dxa"/>
-              <w:left w:w="100" w:type="dxa"/>
-              <w:right w:w="100" w:type="dxa"/>
+              <w:top w:w="50" w:type="dxa"/>
+              <w:bottom w:w="50" w:type="dxa"/>
+              <w:left w:w="95" w:type="dxa"/>
+              <w:right w:w="95" w:type="dxa"/>
             </w:tcMar>
           </w:tcPr>
           <w:p>
@@ -7538,7 +7698,7 @@
                 <w:color w:val="282828"/>
                 <w:sz w:val="17"/>
               </w:rPr>
-              <w:t>NGINX Ingress routing path-based traffic under domain heart.local.</w:t>
+              <w:t>NGINX Ingress routing path-based traffic under domain heart.local (requires active ingress controller).</w:t>
             </w:r>
           </w:p>
         </w:tc>
@@ -7549,10 +7709,10 @@
             <w:tcW w:type="dxa" w:w="2592"/>
             <w:shd w:fill="FFFFFF"/>
             <w:tcMar>
-              <w:top w:w="55" w:type="dxa"/>
-              <w:bottom w:w="55" w:type="dxa"/>
-              <w:left w:w="100" w:type="dxa"/>
-              <w:right w:w="100" w:type="dxa"/>
+              <w:top w:w="50" w:type="dxa"/>
+              <w:bottom w:w="50" w:type="dxa"/>
+              <w:left w:w="95" w:type="dxa"/>
+              <w:right w:w="95" w:type="dxa"/>
             </w:tcMar>
           </w:tcPr>
           <w:p>
@@ -7573,10 +7733,10 @@
             <w:tcW w:type="dxa" w:w="2592"/>
             <w:shd w:fill="FFFFFF"/>
             <w:tcMar>
-              <w:top w:w="55" w:type="dxa"/>
-              <w:bottom w:w="55" w:type="dxa"/>
-              <w:left w:w="100" w:type="dxa"/>
-              <w:right w:w="100" w:type="dxa"/>
+              <w:top w:w="50" w:type="dxa"/>
+              <w:bottom w:w="50" w:type="dxa"/>
+              <w:left w:w="95" w:type="dxa"/>
+              <w:right w:w="95" w:type="dxa"/>
             </w:tcMar>
           </w:tcPr>
           <w:p>
@@ -7597,10 +7757,10 @@
             <w:tcW w:type="dxa" w:w="4608"/>
             <w:shd w:fill="FFFFFF"/>
             <w:tcMar>
-              <w:top w:w="55" w:type="dxa"/>
-              <w:bottom w:w="55" w:type="dxa"/>
-              <w:left w:w="100" w:type="dxa"/>
-              <w:right w:w="100" w:type="dxa"/>
+              <w:top w:w="50" w:type="dxa"/>
+              <w:bottom w:w="50" w:type="dxa"/>
+              <w:left w:w="95" w:type="dxa"/>
+              <w:right w:w="95" w:type="dxa"/>
             </w:tcMar>
           </w:tcPr>
           <w:p>
@@ -7622,7 +7782,7 @@
       <w:pPr>
         <w:pStyle w:val="Heading2"/>
         <w:keepNext/>
-        <w:spacing w:before="140" w:after="40"/>
+        <w:spacing w:before="120" w:after="40"/>
       </w:pPr>
       <w:r>
         <w:rPr>
@@ -7810,13 +7970,13 @@
       <w:pPr>
         <w:pStyle w:val="Heading1"/>
         <w:keepNext/>
-        <w:spacing w:before="200" w:after="40"/>
+        <w:spacing w:before="180" w:after="40"/>
       </w:pPr>
       <w:r>
         <w:rPr>
           <w:b/>
           <w:color w:val="1B365D"/>
-          <w:sz w:val="26"/>
+          <w:sz w:val="25"/>
         </w:rPr>
         <w:t>10. Monitoring and logging</w:t>
       </w:r>
@@ -7879,6 +8039,26 @@
           <w:sz w:val="19"/>
         </w:rPr>
         <w:t>docker-compose.yml runs the monitoring stack locally. Pre-provisioned dashboard (monitoring/grafana/dashboards/heart-api.json) visualizes real-time operational telemetry.</w:t>
+      </w:r>
+    </w:p>
+    <w:p>
+      <w:pPr>
+        <w:pStyle w:val="ListBullet"/>
+        <w:spacing w:before="0" w:after="30" w:line="269" w:lineRule="auto"/>
+      </w:pPr>
+      <w:r>
+        <w:rPr>
+          <w:b/>
+          <w:color w:val="1B365D"/>
+        </w:rPr>
+        <w:t xml:space="preserve">Observability Architecture Clarification: </w:t>
+      </w:r>
+      <w:r>
+        <w:rPr>
+          <w:color w:val="232323"/>
+          <w:sz w:val="19"/>
+        </w:rPr>
+        <w:t>In the local demonstration environment, the Prometheus and Grafana observability stack runs via Docker Compose on ports 9090 and 3000, scraping the containerized API on port 8000. For Kubernetes cluster environments, the identical metrics endpoint is scraped via the pod annotations (prometheus.io/scrape: 'true', prometheus.io/port: '8000') declared in k8s/deployment.yaml.</w:t>
       </w:r>
     </w:p>
     <w:p>
@@ -7950,10 +8130,10 @@
             <w:tcW w:type="dxa" w:w="9792"/>
             <w:shd w:fill="F0F4F8"/>
             <w:tcMar>
-              <w:top w:w="80" w:type="dxa"/>
-              <w:bottom w:w="80" w:type="dxa"/>
-              <w:left w:w="130" w:type="dxa"/>
-              <w:right w:w="130" w:type="dxa"/>
+              <w:top w:w="70" w:type="dxa"/>
+              <w:bottom w:w="70" w:type="dxa"/>
+              <w:left w:w="120" w:type="dxa"/>
+              <w:right w:w="120" w:type="dxa"/>
             </w:tcMar>
             <w:tcBorders>
               <w:left w:val="single" w:sz="20" w:space="0" w:color="1B365D"/>
@@ -8057,15 +8237,30 @@
       <w:pPr>
         <w:pStyle w:val="Heading1"/>
         <w:keepNext/>
-        <w:spacing w:before="200" w:after="40"/>
+        <w:spacing w:before="180" w:after="40"/>
       </w:pPr>
       <w:r>
         <w:rPr>
           <w:b/>
           <w:color w:val="1B365D"/>
-          <w:sz w:val="26"/>
+          <w:sz w:val="25"/>
         </w:rPr>
         <w:t>11. Architecture, deliverables and repository</w:t>
+      </w:r>
+    </w:p>
+    <w:p>
+      <w:pPr>
+        <w:pStyle w:val="Heading2"/>
+        <w:keepNext/>
+        <w:spacing w:before="120" w:after="40"/>
+      </w:pPr>
+      <w:r>
+        <w:rPr>
+          <w:b/>
+          <w:color w:val="294A6E"/>
+          <w:sz w:val="21"/>
+        </w:rPr>
+        <w:t>11.1 System Architecture</w:t>
       </w:r>
     </w:p>
     <w:p>
@@ -8122,6 +8317,35 @@
         <w:t>Fig 23. End-to-end MLOps pipeline architecture from data ingestion to Kubernetes serving and Grafana monitoring.</w:t>
       </w:r>
     </w:p>
+    <w:p>
+      <w:pPr>
+        <w:pStyle w:val="Heading2"/>
+        <w:keepNext/>
+        <w:spacing w:before="120" w:after="40"/>
+      </w:pPr>
+      <w:r>
+        <w:rPr>
+          <w:b/>
+          <w:color w:val="294A6E"/>
+          <w:sz w:val="21"/>
+        </w:rPr>
+        <w:t>11.2 Deliverables Checklist</w:t>
+      </w:r>
+    </w:p>
+    <w:p>
+      <w:pPr>
+        <w:keepNext/>
+        <w:spacing w:before="80" w:after="40"/>
+      </w:pPr>
+      <w:r>
+        <w:rPr>
+          <w:b/>
+          <w:color w:val="1B365D"/>
+          <w:sz w:val="17"/>
+        </w:rPr>
+        <w:t>Table 9: Final Project Deliverables Checklist</w:t>
+      </w:r>
+    </w:p>
     <w:tbl>
       <w:tblPr>
         <w:tblW w:type="auto" w:w="0"/>
@@ -8146,10 +8370,10 @@
             <w:tcW w:type="dxa" w:w="3744"/>
             <w:shd w:fill="1B365D"/>
             <w:tcMar>
-              <w:top w:w="80" w:type="dxa"/>
-              <w:bottom w:w="80" w:type="dxa"/>
-              <w:left w:w="100" w:type="dxa"/>
-              <w:right w:w="100" w:type="dxa"/>
+              <w:top w:w="75" w:type="dxa"/>
+              <w:bottom w:w="75" w:type="dxa"/>
+              <w:left w:w="95" w:type="dxa"/>
+              <w:right w:w="95" w:type="dxa"/>
             </w:tcMar>
           </w:tcPr>
           <w:p>
@@ -8171,10 +8395,10 @@
             <w:tcW w:type="dxa" w:w="6048"/>
             <w:shd w:fill="1B365D"/>
             <w:tcMar>
-              <w:top w:w="80" w:type="dxa"/>
-              <w:bottom w:w="80" w:type="dxa"/>
-              <w:left w:w="100" w:type="dxa"/>
-              <w:right w:w="100" w:type="dxa"/>
+              <w:top w:w="75" w:type="dxa"/>
+              <w:bottom w:w="75" w:type="dxa"/>
+              <w:left w:w="95" w:type="dxa"/>
+              <w:right w:w="95" w:type="dxa"/>
             </w:tcMar>
           </w:tcPr>
           <w:p>
@@ -8198,10 +8422,10 @@
             <w:tcW w:type="dxa" w:w="3744"/>
             <w:shd w:fill="F7F9FB"/>
             <w:tcMar>
-              <w:top w:w="55" w:type="dxa"/>
-              <w:bottom w:w="55" w:type="dxa"/>
-              <w:left w:w="100" w:type="dxa"/>
-              <w:right w:w="100" w:type="dxa"/>
+              <w:top w:w="50" w:type="dxa"/>
+              <w:bottom w:w="50" w:type="dxa"/>
+              <w:left w:w="95" w:type="dxa"/>
+              <w:right w:w="95" w:type="dxa"/>
             </w:tcMar>
           </w:tcPr>
           <w:p>
@@ -8222,10 +8446,10 @@
             <w:tcW w:type="dxa" w:w="6048"/>
             <w:shd w:fill="F7F9FB"/>
             <w:tcMar>
-              <w:top w:w="55" w:type="dxa"/>
-              <w:bottom w:w="55" w:type="dxa"/>
-              <w:left w:w="100" w:type="dxa"/>
-              <w:right w:w="100" w:type="dxa"/>
+              <w:top w:w="50" w:type="dxa"/>
+              <w:bottom w:w="50" w:type="dxa"/>
+              <w:left w:w="95" w:type="dxa"/>
+              <w:right w:w="95" w:type="dxa"/>
             </w:tcMar>
           </w:tcPr>
           <w:p>
@@ -8248,10 +8472,10 @@
             <w:tcW w:type="dxa" w:w="3744"/>
             <w:shd w:fill="FFFFFF"/>
             <w:tcMar>
-              <w:top w:w="55" w:type="dxa"/>
-              <w:bottom w:w="55" w:type="dxa"/>
-              <w:left w:w="100" w:type="dxa"/>
-              <w:right w:w="100" w:type="dxa"/>
+              <w:top w:w="50" w:type="dxa"/>
+              <w:bottom w:w="50" w:type="dxa"/>
+              <w:left w:w="95" w:type="dxa"/>
+              <w:right w:w="95" w:type="dxa"/>
             </w:tcMar>
           </w:tcPr>
           <w:p>
@@ -8272,10 +8496,10 @@
             <w:tcW w:type="dxa" w:w="6048"/>
             <w:shd w:fill="FFFFFF"/>
             <w:tcMar>
-              <w:top w:w="55" w:type="dxa"/>
-              <w:bottom w:w="55" w:type="dxa"/>
-              <w:left w:w="100" w:type="dxa"/>
-              <w:right w:w="100" w:type="dxa"/>
+              <w:top w:w="50" w:type="dxa"/>
+              <w:bottom w:w="50" w:type="dxa"/>
+              <w:left w:w="95" w:type="dxa"/>
+              <w:right w:w="95" w:type="dxa"/>
             </w:tcMar>
           </w:tcPr>
           <w:p>
@@ -8298,10 +8522,10 @@
             <w:tcW w:type="dxa" w:w="3744"/>
             <w:shd w:fill="F7F9FB"/>
             <w:tcMar>
-              <w:top w:w="55" w:type="dxa"/>
-              <w:bottom w:w="55" w:type="dxa"/>
-              <w:left w:w="100" w:type="dxa"/>
-              <w:right w:w="100" w:type="dxa"/>
+              <w:top w:w="50" w:type="dxa"/>
+              <w:bottom w:w="50" w:type="dxa"/>
+              <w:left w:w="95" w:type="dxa"/>
+              <w:right w:w="95" w:type="dxa"/>
             </w:tcMar>
           </w:tcPr>
           <w:p>
@@ -8322,10 +8546,10 @@
             <w:tcW w:type="dxa" w:w="6048"/>
             <w:shd w:fill="F7F9FB"/>
             <w:tcMar>
-              <w:top w:w="55" w:type="dxa"/>
-              <w:bottom w:w="55" w:type="dxa"/>
-              <w:left w:w="100" w:type="dxa"/>
-              <w:right w:w="100" w:type="dxa"/>
+              <w:top w:w="50" w:type="dxa"/>
+              <w:bottom w:w="50" w:type="dxa"/>
+              <w:left w:w="95" w:type="dxa"/>
+              <w:right w:w="95" w:type="dxa"/>
             </w:tcMar>
           </w:tcPr>
           <w:p>
@@ -8348,10 +8572,10 @@
             <w:tcW w:type="dxa" w:w="3744"/>
             <w:shd w:fill="FFFFFF"/>
             <w:tcMar>
-              <w:top w:w="55" w:type="dxa"/>
-              <w:bottom w:w="55" w:type="dxa"/>
-              <w:left w:w="100" w:type="dxa"/>
-              <w:right w:w="100" w:type="dxa"/>
+              <w:top w:w="50" w:type="dxa"/>
+              <w:bottom w:w="50" w:type="dxa"/>
+              <w:left w:w="95" w:type="dxa"/>
+              <w:right w:w="95" w:type="dxa"/>
             </w:tcMar>
           </w:tcPr>
           <w:p>
@@ -8372,10 +8596,10 @@
             <w:tcW w:type="dxa" w:w="6048"/>
             <w:shd w:fill="FFFFFF"/>
             <w:tcMar>
-              <w:top w:w="55" w:type="dxa"/>
-              <w:bottom w:w="55" w:type="dxa"/>
-              <w:left w:w="100" w:type="dxa"/>
-              <w:right w:w="100" w:type="dxa"/>
+              <w:top w:w="50" w:type="dxa"/>
+              <w:bottom w:w="50" w:type="dxa"/>
+              <w:left w:w="95" w:type="dxa"/>
+              <w:right w:w="95" w:type="dxa"/>
             </w:tcMar>
           </w:tcPr>
           <w:p>
@@ -8398,10 +8622,10 @@
             <w:tcW w:type="dxa" w:w="3744"/>
             <w:shd w:fill="F7F9FB"/>
             <w:tcMar>
-              <w:top w:w="55" w:type="dxa"/>
-              <w:bottom w:w="55" w:type="dxa"/>
-              <w:left w:w="100" w:type="dxa"/>
-              <w:right w:w="100" w:type="dxa"/>
+              <w:top w:w="50" w:type="dxa"/>
+              <w:bottom w:w="50" w:type="dxa"/>
+              <w:left w:w="95" w:type="dxa"/>
+              <w:right w:w="95" w:type="dxa"/>
             </w:tcMar>
           </w:tcPr>
           <w:p>
@@ -8422,10 +8646,10 @@
             <w:tcW w:type="dxa" w:w="6048"/>
             <w:shd w:fill="F7F9FB"/>
             <w:tcMar>
-              <w:top w:w="55" w:type="dxa"/>
-              <w:bottom w:w="55" w:type="dxa"/>
-              <w:left w:w="100" w:type="dxa"/>
-              <w:right w:w="100" w:type="dxa"/>
+              <w:top w:w="50" w:type="dxa"/>
+              <w:bottom w:w="50" w:type="dxa"/>
+              <w:left w:w="95" w:type="dxa"/>
+              <w:right w:w="95" w:type="dxa"/>
             </w:tcMar>
           </w:tcPr>
           <w:p>
@@ -8448,10 +8672,10 @@
             <w:tcW w:type="dxa" w:w="3744"/>
             <w:shd w:fill="FFFFFF"/>
             <w:tcMar>
-              <w:top w:w="55" w:type="dxa"/>
-              <w:bottom w:w="55" w:type="dxa"/>
-              <w:left w:w="100" w:type="dxa"/>
-              <w:right w:w="100" w:type="dxa"/>
+              <w:top w:w="50" w:type="dxa"/>
+              <w:bottom w:w="50" w:type="dxa"/>
+              <w:left w:w="95" w:type="dxa"/>
+              <w:right w:w="95" w:type="dxa"/>
             </w:tcMar>
           </w:tcPr>
           <w:p>
@@ -8472,10 +8696,10 @@
             <w:tcW w:type="dxa" w:w="6048"/>
             <w:shd w:fill="FFFFFF"/>
             <w:tcMar>
-              <w:top w:w="55" w:type="dxa"/>
-              <w:bottom w:w="55" w:type="dxa"/>
-              <w:left w:w="100" w:type="dxa"/>
-              <w:right w:w="100" w:type="dxa"/>
+              <w:top w:w="50" w:type="dxa"/>
+              <w:bottom w:w="50" w:type="dxa"/>
+              <w:left w:w="95" w:type="dxa"/>
+              <w:right w:w="95" w:type="dxa"/>
             </w:tcMar>
           </w:tcPr>
           <w:p>
@@ -8498,10 +8722,10 @@
             <w:tcW w:type="dxa" w:w="3744"/>
             <w:shd w:fill="F7F9FB"/>
             <w:tcMar>
-              <w:top w:w="55" w:type="dxa"/>
-              <w:bottom w:w="55" w:type="dxa"/>
-              <w:left w:w="100" w:type="dxa"/>
-              <w:right w:w="100" w:type="dxa"/>
+              <w:top w:w="50" w:type="dxa"/>
+              <w:bottom w:w="50" w:type="dxa"/>
+              <w:left w:w="95" w:type="dxa"/>
+              <w:right w:w="95" w:type="dxa"/>
             </w:tcMar>
           </w:tcPr>
           <w:p>
@@ -8522,10 +8746,10 @@
             <w:tcW w:type="dxa" w:w="6048"/>
             <w:shd w:fill="F7F9FB"/>
             <w:tcMar>
-              <w:top w:w="55" w:type="dxa"/>
-              <w:bottom w:w="55" w:type="dxa"/>
-              <w:left w:w="100" w:type="dxa"/>
-              <w:right w:w="100" w:type="dxa"/>
+              <w:top w:w="50" w:type="dxa"/>
+              <w:bottom w:w="50" w:type="dxa"/>
+              <w:left w:w="95" w:type="dxa"/>
+              <w:right w:w="95" w:type="dxa"/>
             </w:tcMar>
           </w:tcPr>
           <w:p>
@@ -8548,10 +8772,10 @@
             <w:tcW w:type="dxa" w:w="3744"/>
             <w:shd w:fill="FFFFFF"/>
             <w:tcMar>
-              <w:top w:w="55" w:type="dxa"/>
-              <w:bottom w:w="55" w:type="dxa"/>
-              <w:left w:w="100" w:type="dxa"/>
-              <w:right w:w="100" w:type="dxa"/>
+              <w:top w:w="50" w:type="dxa"/>
+              <w:bottom w:w="50" w:type="dxa"/>
+              <w:left w:w="95" w:type="dxa"/>
+              <w:right w:w="95" w:type="dxa"/>
             </w:tcMar>
           </w:tcPr>
           <w:p>
@@ -8572,10 +8796,10 @@
             <w:tcW w:type="dxa" w:w="6048"/>
             <w:shd w:fill="FFFFFF"/>
             <w:tcMar>
-              <w:top w:w="55" w:type="dxa"/>
-              <w:bottom w:w="55" w:type="dxa"/>
-              <w:left w:w="100" w:type="dxa"/>
-              <w:right w:w="100" w:type="dxa"/>
+              <w:top w:w="50" w:type="dxa"/>
+              <w:bottom w:w="50" w:type="dxa"/>
+              <w:left w:w="95" w:type="dxa"/>
+              <w:right w:w="95" w:type="dxa"/>
             </w:tcMar>
           </w:tcPr>
           <w:p>
@@ -8598,10 +8822,10 @@
             <w:tcW w:type="dxa" w:w="3744"/>
             <w:shd w:fill="F7F9FB"/>
             <w:tcMar>
-              <w:top w:w="55" w:type="dxa"/>
-              <w:bottom w:w="55" w:type="dxa"/>
-              <w:left w:w="100" w:type="dxa"/>
-              <w:right w:w="100" w:type="dxa"/>
+              <w:top w:w="50" w:type="dxa"/>
+              <w:bottom w:w="50" w:type="dxa"/>
+              <w:left w:w="95" w:type="dxa"/>
+              <w:right w:w="95" w:type="dxa"/>
             </w:tcMar>
           </w:tcPr>
           <w:p>
@@ -8622,10 +8846,10 @@
             <w:tcW w:type="dxa" w:w="6048"/>
             <w:shd w:fill="F7F9FB"/>
             <w:tcMar>
-              <w:top w:w="55" w:type="dxa"/>
-              <w:bottom w:w="55" w:type="dxa"/>
-              <w:left w:w="100" w:type="dxa"/>
-              <w:right w:w="100" w:type="dxa"/>
+              <w:top w:w="50" w:type="dxa"/>
+              <w:bottom w:w="50" w:type="dxa"/>
+              <w:left w:w="95" w:type="dxa"/>
+              <w:right w:w="95" w:type="dxa"/>
             </w:tcMar>
           </w:tcPr>
           <w:p>
@@ -8637,7 +8861,7 @@
                 <w:color w:val="282828"/>
                 <w:sz w:val="17"/>
               </w:rPr>
-              <w:t>README.md, Section 2 &amp; Appendix B</w:t>
+              <w:t>README.md, Section 2 &amp; Section 11.3 (Video Demonstration)</w:t>
             </w:r>
           </w:p>
         </w:tc>
@@ -8662,6 +8886,21 @@
         <w:t>https://github.com/Mohana1507/heart-disease-mlops</w:t>
       </w:r>
     </w:p>
+    <w:p>
+      <w:pPr>
+        <w:pStyle w:val="Heading2"/>
+        <w:keepNext/>
+        <w:spacing w:before="120" w:after="40"/>
+      </w:pPr>
+      <w:r>
+        <w:rPr>
+          <w:b/>
+          <w:color w:val="294A6E"/>
+          <w:sz w:val="21"/>
+        </w:rPr>
+        <w:t>11.3 Pipeline Demonstration Video</w:t>
+      </w:r>
+    </w:p>
     <w:tbl>
       <w:tblPr>
         <w:tblW w:type="auto" w:w="0"/>
@@ -8677,10 +8916,10 @@
             <w:tcW w:type="dxa" w:w="9792"/>
             <w:shd w:fill="EBF3FB"/>
             <w:tcMar>
-              <w:top w:w="80" w:type="dxa"/>
-              <w:bottom w:w="80" w:type="dxa"/>
-              <w:left w:w="130" w:type="dxa"/>
-              <w:right w:w="130" w:type="dxa"/>
+              <w:top w:w="70" w:type="dxa"/>
+              <w:bottom w:w="70" w:type="dxa"/>
+              <w:left w:w="120" w:type="dxa"/>
+              <w:right w:w="120" w:type="dxa"/>
             </w:tcMar>
             <w:tcBorders>
               <w:left w:val="single" w:sz="20" w:space="0" w:color="0066CC"/>
@@ -8854,21 +9093,29 @@
     </w:p>
     <w:p>
       <w:pPr>
-        <w:spacing w:before="0" w:after="40" w:line="269" w:lineRule="auto"/>
+        <w:pStyle w:val="Heading2"/>
+        <w:keepNext/>
+        <w:spacing w:before="120" w:after="40"/>
       </w:pPr>
       <w:r>
         <w:rPr>
           <w:b/>
-          <w:color w:val="1B365D"/>
+          <w:color w:val="294A6E"/>
+          <w:sz w:val="21"/>
         </w:rPr>
-        <w:t xml:space="preserve">Limitations and Future Work: </w:t>
+        <w:t>11.4 Limitations and Future Work</w:t>
       </w:r>
+    </w:p>
+    <w:p>
+      <w:pPr>
+        <w:spacing w:before="0" w:after="40" w:line="269" w:lineRule="auto"/>
+      </w:pPr>
       <w:r>
         <w:rPr>
           <w:color w:val="232323"/>
           <w:sz w:val="19"/>
         </w:rPr>
-        <w:t>Limitations and Next Steps: The Cleveland benchmark reflects a modest sample size (N=303). Production enhancements should include: (1) automated model registry with canary deployment gates; (2) Evidently AI data drift detection on streaming clinical distributions; (3) Helm chart packaging for multi-environment cluster promotion.</w:t>
+        <w:t>The Cleveland benchmark reflects a modest sample size (N=303). Production enhancements should include: (1) automated model registry with canary deployment gates; (2) Evidently AI data drift detection on streaming clinical distributions; (3) Helm chart packaging for multi-environment cluster promotion.</w:t>
       </w:r>
     </w:p>
     <w:sectPr>

</xml_diff>

<commit_message>
Remove running top header from report document
</commit_message>
<xml_diff>
--- a/MLOps_Report.docx
+++ b/MLOps_Report.docx
@@ -3707,7 +3707,7 @@
                           <pic:cNvPicPr/>
                         </pic:nvPicPr>
                         <pic:blipFill>
-                          <a:blip r:embed="rId10"/>
+                          <a:blip r:embed="rId9"/>
                           <a:stretch>
                             <a:fillRect/>
                           </a:stretch>
@@ -3758,7 +3758,7 @@
                           <pic:cNvPicPr/>
                         </pic:nvPicPr>
                         <pic:blipFill>
-                          <a:blip r:embed="rId11"/>
+                          <a:blip r:embed="rId10"/>
                           <a:stretch>
                             <a:fillRect/>
                           </a:stretch>
@@ -3815,7 +3815,7 @@
                     <pic:cNvPicPr/>
                   </pic:nvPicPr>
                   <pic:blipFill>
-                    <a:blip r:embed="rId12"/>
+                    <a:blip r:embed="rId11"/>
                     <a:stretch>
                       <a:fillRect/>
                     </a:stretch>
@@ -3973,7 +3973,7 @@
                     <pic:cNvPicPr/>
                   </pic:nvPicPr>
                   <pic:blipFill>
-                    <a:blip r:embed="rId13"/>
+                    <a:blip r:embed="rId12"/>
                     <a:stretch>
                       <a:fillRect/>
                     </a:stretch>
@@ -5564,7 +5564,7 @@
                           <pic:cNvPicPr/>
                         </pic:nvPicPr>
                         <pic:blipFill>
-                          <a:blip r:embed="rId14"/>
+                          <a:blip r:embed="rId13"/>
                           <a:stretch>
                             <a:fillRect/>
                           </a:stretch>
@@ -5615,7 +5615,7 @@
                           <pic:cNvPicPr/>
                         </pic:nvPicPr>
                         <pic:blipFill>
-                          <a:blip r:embed="rId15"/>
+                          <a:blip r:embed="rId14"/>
                           <a:stretch>
                             <a:fillRect/>
                           </a:stretch>
@@ -5672,7 +5672,7 @@
                     <pic:cNvPicPr/>
                   </pic:nvPicPr>
                   <pic:blipFill>
-                    <a:blip r:embed="rId16"/>
+                    <a:blip r:embed="rId15"/>
                     <a:stretch>
                       <a:fillRect/>
                     </a:stretch>
@@ -5844,7 +5844,7 @@
                     <pic:cNvPicPr/>
                   </pic:nvPicPr>
                   <pic:blipFill>
-                    <a:blip r:embed="rId17"/>
+                    <a:blip r:embed="rId16"/>
                     <a:stretch>
                       <a:fillRect/>
                     </a:stretch>
@@ -5898,7 +5898,7 @@
                     <pic:cNvPicPr/>
                   </pic:nvPicPr>
                   <pic:blipFill>
-                    <a:blip r:embed="rId18"/>
+                    <a:blip r:embed="rId17"/>
                     <a:stretch>
                       <a:fillRect/>
                     </a:stretch>
@@ -5952,7 +5952,7 @@
                     <pic:cNvPicPr/>
                   </pic:nvPicPr>
                   <pic:blipFill>
-                    <a:blip r:embed="rId19"/>
+                    <a:blip r:embed="rId18"/>
                     <a:stretch>
                       <a:fillRect/>
                     </a:stretch>
@@ -6445,7 +6445,7 @@
                     <pic:cNvPicPr/>
                   </pic:nvPicPr>
                   <pic:blipFill>
-                    <a:blip r:embed="rId20"/>
+                    <a:blip r:embed="rId19"/>
                     <a:stretch>
                       <a:fillRect/>
                     </a:stretch>
@@ -6531,7 +6531,7 @@
                     <pic:cNvPicPr/>
                   </pic:nvPicPr>
                   <pic:blipFill>
-                    <a:blip r:embed="rId21"/>
+                    <a:blip r:embed="rId20"/>
                     <a:stretch>
                       <a:fillRect/>
                     </a:stretch>
@@ -6585,7 +6585,7 @@
                     <pic:cNvPicPr/>
                   </pic:nvPicPr>
                   <pic:blipFill>
-                    <a:blip r:embed="rId22"/>
+                    <a:blip r:embed="rId21"/>
                     <a:stretch>
                       <a:fillRect/>
                     </a:stretch>
@@ -6659,7 +6659,7 @@
                     <pic:cNvPicPr/>
                   </pic:nvPicPr>
                   <pic:blipFill>
-                    <a:blip r:embed="rId23"/>
+                    <a:blip r:embed="rId22"/>
                     <a:stretch>
                       <a:fillRect/>
                     </a:stretch>
@@ -6713,7 +6713,7 @@
                     <pic:cNvPicPr/>
                   </pic:nvPicPr>
                   <pic:blipFill>
-                    <a:blip r:embed="rId24"/>
+                    <a:blip r:embed="rId23"/>
                     <a:stretch>
                       <a:fillRect/>
                     </a:stretch>
@@ -6767,7 +6767,7 @@
                     <pic:cNvPicPr/>
                   </pic:nvPicPr>
                   <pic:blipFill>
-                    <a:blip r:embed="rId25"/>
+                    <a:blip r:embed="rId24"/>
                     <a:stretch>
                       <a:fillRect/>
                     </a:stretch>
@@ -7059,7 +7059,7 @@
                     <pic:cNvPicPr/>
                   </pic:nvPicPr>
                   <pic:blipFill>
-                    <a:blip r:embed="rId26"/>
+                    <a:blip r:embed="rId25"/>
                     <a:stretch>
                       <a:fillRect/>
                     </a:stretch>
@@ -7113,7 +7113,7 @@
                     <pic:cNvPicPr/>
                   </pic:nvPicPr>
                   <pic:blipFill>
-                    <a:blip r:embed="rId27"/>
+                    <a:blip r:embed="rId26"/>
                     <a:stretch>
                       <a:fillRect/>
                     </a:stretch>
@@ -7199,7 +7199,7 @@
                     <pic:cNvPicPr/>
                   </pic:nvPicPr>
                   <pic:blipFill>
-                    <a:blip r:embed="rId28"/>
+                    <a:blip r:embed="rId27"/>
                     <a:stretch>
                       <a:fillRect/>
                     </a:stretch>
@@ -7874,7 +7874,7 @@
                     <pic:cNvPicPr/>
                   </pic:nvPicPr>
                   <pic:blipFill>
-                    <a:blip r:embed="rId29"/>
+                    <a:blip r:embed="rId28"/>
                     <a:stretch>
                       <a:fillRect/>
                     </a:stretch>
@@ -7928,7 +7928,7 @@
                     <pic:cNvPicPr/>
                   </pic:nvPicPr>
                   <pic:blipFill>
-                    <a:blip r:embed="rId30"/>
+                    <a:blip r:embed="rId29"/>
                     <a:stretch>
                       <a:fillRect/>
                     </a:stretch>
@@ -8082,7 +8082,7 @@
                     <pic:cNvPicPr/>
                   </pic:nvPicPr>
                   <pic:blipFill>
-                    <a:blip r:embed="rId31"/>
+                    <a:blip r:embed="rId30"/>
                     <a:stretch>
                       <a:fillRect/>
                     </a:stretch>
@@ -8284,7 +8284,7 @@
                     <pic:cNvPicPr/>
                   </pic:nvPicPr>
                   <pic:blipFill>
-                    <a:blip r:embed="rId32"/>
+                    <a:blip r:embed="rId31"/>
                     <a:stretch>
                       <a:fillRect/>
                     </a:stretch>
@@ -9119,7 +9119,6 @@
       </w:r>
     </w:p>
     <w:sectPr>
-      <w:headerReference w:type="default" r:id="rId9"/>
       <w:pgSz w:w="11909" w:h="16834"/>
       <w:pgMar w:top="936" w:right="1008" w:bottom="936" w:left="1008" w:header="720" w:footer="720" w:gutter="0"/>
       <w:cols w:space="720"/>
@@ -9127,24 +9126,6 @@
     </w:sectPr>
   </w:body>
 </w:document>
-</file>
-
-<file path=word/header1.xml><?xml version="1.0" encoding="utf-8"?>
-<w:hdr xmlns:m="http://schemas.openxmlformats.org/officeDocument/2006/math" xmlns:mc="http://schemas.openxmlformats.org/markup-compatibility/2006" xmlns:mo="http://schemas.microsoft.com/office/mac/office/2008/main" xmlns:mv="urn:schemas-microsoft-com:mac:vml" xmlns:o="urn:schemas-microsoft-com:office:office" xmlns:r="http://schemas.openxmlformats.org/officeDocument/2006/relationships" xmlns:v="urn:schemas-microsoft-com:vml" xmlns:w10="urn:schemas-microsoft-com:office:word" xmlns:w14="http://schemas.microsoft.com/office/word/2010/wordml" xmlns:w="http://schemas.openxmlformats.org/wordprocessingml/2006/main" xmlns:wne="http://schemas.microsoft.com/office/word/2006/wordml" xmlns:wp14="http://schemas.microsoft.com/office/word/2010/wordprocessingDrawing" xmlns:wp="http://schemas.openxmlformats.org/drawingml/2006/wordprocessingDrawing" xmlns:wpc="http://schemas.microsoft.com/office/word/2010/wordprocessingCanvas" xmlns:wpg="http://schemas.microsoft.com/office/word/2010/wordprocessingGroup" xmlns:wpi="http://schemas.microsoft.com/office/word/2010/wordprocessingInk" xmlns:wps="http://schemas.microsoft.com/office/word/2010/wordprocessingShape" mc:Ignorable="w14 wp14">
-  <w:p>
-    <w:pPr>
-      <w:pStyle w:val="Header"/>
-      <w:jc w:val="left"/>
-    </w:pPr>
-    <w:r>
-      <w:rPr>
-        <w:color w:val="787878"/>
-        <w:sz w:val="17"/>
-      </w:rPr>
-      <w:t>Mohanapriya M · 2025AE05482 · AIMLCZG523 MLOps Assignment 01</w:t>
-    </w:r>
-  </w:p>
-</w:hdr>
 </file>
 
 <file path=word/numbering.xml><?xml version="1.0" encoding="utf-8"?>

</xml_diff>

<commit_message>
final document version updated
</commit_message>
<xml_diff>
--- a/MLOps_Report.docx
+++ b/MLOps_Report.docx
@@ -74,7 +74,7 @@
       </w:tblPr>
       <w:tblGrid>
         <w:gridCol w:w="2592"/>
-        <w:gridCol w:w="7200"/>
+        <w:gridCol w:w="7315"/>
       </w:tblGrid>
       <w:tr>
         <w:trPr>
@@ -482,7 +482,7 @@
                 <w:color w:val="1B365D"/>
                 <w:sz w:val="17"/>
               </w:rPr>
-              <w:t>Date</w:t>
+              <w:t>Pipeline Demo</w:t>
             </w:r>
           </w:p>
         </w:tc>
@@ -499,6 +499,63 @@
           </w:tcPr>
           <w:p>
             <w:r>
+              <w:t>https://drive.google.com/file/d/11EkvSywubYU3LCXoxk_MPjpDLAT_R3ok/view?usp=sharing</w:t>
+            </w:r>
+          </w:p>
+        </w:tc>
+      </w:tr>
+      <w:tr>
+        <w:trPr>
+          <w:jc w:val="center"/>
+        </w:trPr>
+        <w:tc>
+          <w:tcPr>
+            <w:tcW w:w="2592" w:type="dxa"/>
+            <w:shd w:val="clear" w:color="auto" w:fill="F4F7FA"/>
+            <w:tcMar>
+              <w:top w:w="40" w:type="dxa"/>
+              <w:left w:w="80" w:type="dxa"/>
+              <w:bottom w:w="40" w:type="dxa"/>
+              <w:right w:w="80" w:type="dxa"/>
+            </w:tcMar>
+          </w:tcPr>
+          <w:p>
+            <w:pPr>
+              <w:rPr>
+                <w:b/>
+                <w:color w:val="1B365D"/>
+                <w:sz w:val="17"/>
+              </w:rPr>
+            </w:pPr>
+            <w:r>
+              <w:rPr>
+                <w:b/>
+                <w:color w:val="1B365D"/>
+                <w:sz w:val="17"/>
+              </w:rPr>
+              <w:t>Date</w:t>
+            </w:r>
+          </w:p>
+        </w:tc>
+        <w:tc>
+          <w:tcPr>
+            <w:tcW w:w="7200" w:type="dxa"/>
+            <w:shd w:val="clear" w:color="auto" w:fill="FFFFFF"/>
+            <w:tcMar>
+              <w:top w:w="40" w:type="dxa"/>
+              <w:left w:w="80" w:type="dxa"/>
+              <w:bottom w:w="40" w:type="dxa"/>
+              <w:right w:w="80" w:type="dxa"/>
+            </w:tcMar>
+          </w:tcPr>
+          <w:p>
+            <w:pPr>
+              <w:rPr>
+                <w:color w:val="1E1E1E"/>
+                <w:sz w:val="17"/>
+              </w:rPr>
+            </w:pPr>
+            <w:r>
               <w:rPr>
                 <w:color w:val="1E1E1E"/>
                 <w:sz w:val="17"/>
@@ -707,6 +764,11 @@
       <w:r>
         <w:t>The canonical UCI Cleveland Heart Disease benchmark (Janosi et al., 1989; Dua &amp; Graff, 2019) is the primary cohort in clinical machine learning literature. The dataset contains 303 patient records and 13 clinical predictors alongside the angiographic disease diagnosis 'num' (0 = absence; 1–4 = presence of coronary artery disease). Under standard clinical AI protocol, num &gt; 0 is binarized to target = 1.</w:t>
       </w:r>
+    </w:p>
+    <w:p>
+      <w:pPr>
+        <w:spacing w:after="40" w:line="269" w:lineRule="auto"/>
+      </w:pPr>
     </w:p>
     <w:p>
       <w:pPr>
@@ -1900,13 +1962,38 @@
     <w:p>
       <w:pPr>
         <w:spacing w:after="40" w:line="269" w:lineRule="auto"/>
-      </w:pPr>
-      <w:r>
         <w:rPr>
           <w:b/>
           <w:color w:val="1B365D"/>
         </w:rPr>
-        <w:t xml:space="preserve">Solution at a Glance: </w:t>
+      </w:pPr>
+    </w:p>
+    <w:p>
+      <w:pPr>
+        <w:spacing w:after="40" w:line="269" w:lineRule="auto"/>
+      </w:pPr>
+      <w:r>
+        <w:rPr>
+          <w:b/>
+          <w:color w:val="1B365D"/>
+        </w:rPr>
+        <w:t xml:space="preserve">Solution </w:t>
+      </w:r>
+      <w:proofErr w:type="gramStart"/>
+      <w:r>
+        <w:rPr>
+          <w:b/>
+          <w:color w:val="1B365D"/>
+        </w:rPr>
+        <w:t>at a Glance</w:t>
+      </w:r>
+      <w:proofErr w:type="gramEnd"/>
+      <w:r>
+        <w:rPr>
+          <w:b/>
+          <w:color w:val="1B365D"/>
+        </w:rPr>
+        <w:t xml:space="preserve">: </w:t>
       </w:r>
       <w:r>
         <w:t>Key operational components of the engineering lifecycle:</w:t>
@@ -2005,8 +2092,27 @@
         <w:t xml:space="preserve">Observability: </w:t>
       </w:r>
       <w:r>
-        <w:t>Privacy-conscious JSON access logs (no patient PII), Prometheus telemetry (/metrics), and pre-provisioned Grafana dashboard.</w:t>
-      </w:r>
+        <w:t xml:space="preserve">Privacy-conscious JSON access logs (no patient PII), Prometheus </w:t>
+      </w:r>
+      <w:proofErr w:type="gramStart"/>
+      <w:r>
+        <w:t>telemetry (/</w:t>
+      </w:r>
+      <w:proofErr w:type="gramEnd"/>
+      <w:r>
+        <w:t>metrics), and pre-provisioned Grafana dashboard.</w:t>
+      </w:r>
+    </w:p>
+    <w:p>
+      <w:pPr>
+        <w:pStyle w:val="ListBullet"/>
+        <w:numPr>
+          <w:ilvl w:val="0"/>
+          <w:numId w:val="0"/>
+        </w:numPr>
+        <w:spacing w:after="30" w:line="269" w:lineRule="auto"/>
+        <w:ind w:left="360"/>
+      </w:pPr>
     </w:p>
     <w:p>
       <w:pPr>
@@ -3995,19 +4101,9 @@
     </w:p>
     <w:p>
       <w:r>
-        <w:br w:type="page"/>
-      </w:r>
-    </w:p>
-    <w:p>
-      <w:pPr>
-        <w:spacing w:before="60" w:after="20"/>
-        <w:jc w:val="center"/>
-      </w:pPr>
-      <w:r>
         <w:rPr>
           <w:noProof/>
         </w:rPr>
-        <w:lastRenderedPageBreak/>
         <w:drawing>
           <wp:inline distT="0" distB="0" distL="0" distR="0" wp14:anchorId="7F44396C" wp14:editId="775BD260">
             <wp:extent cx="5852160" cy="1560576"/>
@@ -4364,8 +4460,21 @@
         <w:t xml:space="preserve">Model Selection and Hyperparameter Tuning (src/heart/modeling.py): </w:t>
       </w:r>
       <w:r>
-        <w:t>The cohort is partitioned into an 80% training set (N = 242) and a 20% hold-out test set (N = 61) with stratification (seed 42). Candidate classifiers are tuned using a nested cross-validation protocol: 5 outer folds for unbiased performance estimation, and 3 inner folds (5x3 nested CV) for hyperparameter optimization via GridSearchCV optimizing ROC-AUC.</w:t>
-      </w:r>
+        <w:t xml:space="preserve">The cohort is partitioned into an 80% training set (N = 242) and a 20% hold-out test set (N = 61) with stratification (seed 42). Candidate classifiers are tuned using a nested cross-validation protocol: 5 outer folds for unbiased performance estimation, and 3 inner folds (5x3 nested CV) for hyperparameter optimization via </w:t>
+      </w:r>
+      <w:proofErr w:type="spellStart"/>
+      <w:r>
+        <w:t>GridSearchCV</w:t>
+      </w:r>
+      <w:proofErr w:type="spellEnd"/>
+      <w:r>
+        <w:t xml:space="preserve"> optimizing ROC-AUC.</w:t>
+      </w:r>
+    </w:p>
+    <w:p>
+      <w:pPr>
+        <w:spacing w:after="40" w:line="269" w:lineRule="auto"/>
+      </w:pPr>
     </w:p>
     <w:p>
       <w:pPr>
@@ -5946,6 +6055,9 @@
         <w:jc w:val="center"/>
       </w:pPr>
       <w:r>
+        <w:rPr>
+          <w:noProof/>
+        </w:rPr>
         <w:drawing>
           <wp:inline distT="0" distB="0" distL="0" distR="0" wp14:anchorId="6E9F8C4E" wp14:editId="4983F062">
             <wp:extent cx="5434655" cy="2443480"/>
@@ -6086,6 +6198,9 @@
         <w:jc w:val="center"/>
       </w:pPr>
       <w:r>
+        <w:rPr>
+          <w:noProof/>
+        </w:rPr>
         <w:drawing>
           <wp:inline distT="0" distB="0" distL="0" distR="0" wp14:anchorId="405C6618" wp14:editId="4B654322">
             <wp:extent cx="6112670" cy="2783541"/>
@@ -6143,6 +6258,9 @@
         <w:jc w:val="center"/>
       </w:pPr>
       <w:r>
+        <w:rPr>
+          <w:noProof/>
+        </w:rPr>
         <w:lastRenderedPageBreak/>
         <w:drawing>
           <wp:inline distT="0" distB="0" distL="0" distR="0" wp14:anchorId="60B6CC31" wp14:editId="3D412D20">
@@ -6187,6 +6305,9 @@
         <w:jc w:val="center"/>
       </w:pPr>
       <w:r>
+        <w:rPr>
+          <w:noProof/>
+        </w:rPr>
         <w:drawing>
           <wp:inline distT="0" distB="0" distL="0" distR="0" wp14:anchorId="03E69F1F" wp14:editId="6E7B75AC">
             <wp:extent cx="6282055" cy="2826385"/>
@@ -6674,6 +6795,9 @@
         <w:jc w:val="center"/>
       </w:pPr>
       <w:r>
+        <w:rPr>
+          <w:noProof/>
+        </w:rPr>
         <w:drawing>
           <wp:inline distT="0" distB="0" distL="0" distR="0" wp14:anchorId="41DED611" wp14:editId="639F870E">
             <wp:extent cx="6282055" cy="3347085"/>
@@ -6758,6 +6882,9 @@
         <w:jc w:val="center"/>
       </w:pPr>
       <w:r>
+        <w:rPr>
+          <w:noProof/>
+        </w:rPr>
         <w:drawing>
           <wp:inline distT="0" distB="0" distL="0" distR="0" wp14:anchorId="6680F850" wp14:editId="4FAFA137">
             <wp:extent cx="4934361" cy="1770529"/>
@@ -6826,6 +6953,9 @@
         <w:jc w:val="center"/>
       </w:pPr>
       <w:r>
+        <w:rPr>
+          <w:noProof/>
+        </w:rPr>
         <w:drawing>
           <wp:inline distT="0" distB="0" distL="0" distR="0" wp14:anchorId="21668F7F" wp14:editId="55E3C704">
             <wp:extent cx="6282055" cy="2840990"/>
@@ -6926,6 +7056,9 @@
         <w:jc w:val="center"/>
       </w:pPr>
       <w:r>
+        <w:rPr>
+          <w:noProof/>
+        </w:rPr>
         <w:drawing>
           <wp:inline distT="0" distB="0" distL="0" distR="0" wp14:anchorId="7B3BF194" wp14:editId="3CCEB95C">
             <wp:extent cx="6282055" cy="2214880"/>
@@ -6983,6 +7116,9 @@
         <w:jc w:val="center"/>
       </w:pPr>
       <w:r>
+        <w:rPr>
+          <w:noProof/>
+        </w:rPr>
         <w:drawing>
           <wp:inline distT="0" distB="0" distL="0" distR="0" wp14:anchorId="11690B71" wp14:editId="6416D288">
             <wp:extent cx="5621184" cy="2819400"/>
@@ -9315,19 +9451,12 @@
           <w:p>
             <w:pPr>
               <w:spacing w:after="0"/>
-            </w:pPr>
-            <w:r>
               <w:rPr>
                 <w:rFonts w:ascii="Consolas" w:hAnsi="Consolas"/>
                 <w:color w:val="1E1E1E"/>
                 <w:sz w:val="16"/>
-              </w:rPr>
-              <w:t>Access Permissions: Set to 'Unlisted' on YouTube or 'Anyone with the link can view' on Google Drive.</w:t>
-            </w:r>
-          </w:p>
-          <w:p>
-            <w:pPr>
-              <w:spacing w:after="0"/>
+                <w:lang w:val="en-MY"/>
+              </w:rPr>
             </w:pPr>
             <w:r>
               <w:rPr>
@@ -9335,21 +9464,22 @@
                 <w:color w:val="1E1E1E"/>
                 <w:sz w:val="16"/>
               </w:rPr>
-              <w:t>Demonstration Duration: Approximately 4 minutes 30 seconds.</w:t>
-            </w:r>
-          </w:p>
-          <w:p>
-            <w:pPr>
-              <w:spacing w:after="0"/>
-            </w:pPr>
+              <w:t xml:space="preserve">Access Permissions: </w:t>
+            </w:r>
             <w:r>
               <w:rPr>
                 <w:rFonts w:ascii="Consolas" w:hAnsi="Consolas"/>
                 <w:color w:val="1E1E1E"/>
                 <w:sz w:val="16"/>
-              </w:rPr>
-              <w:t>Key Demonstrations Covered:</w:t>
-            </w:r>
+                <w:lang w:val="en-MY"/>
+              </w:rPr>
+              <w:t>The video is accessible using your BITS email ID. It has been uploaded to Google Drive, and general access is enabled for BITS users.</w:t>
+            </w:r>
+          </w:p>
+          <w:p>
+            <w:pPr>
+              <w:spacing w:after="0"/>
+            </w:pPr>
           </w:p>
           <w:p>
             <w:pPr>
@@ -9361,72 +9491,7 @@
                 <w:color w:val="1E1E1E"/>
                 <w:sz w:val="16"/>
               </w:rPr>
-              <w:t xml:space="preserve">  - 0:00 - 0:45 : Repository structure, modular src/ package, and environment setup.</w:t>
-            </w:r>
-          </w:p>
-          <w:p>
-            <w:pPr>
-              <w:spacing w:after="0"/>
-            </w:pPr>
-            <w:r>
-              <w:rPr>
-                <w:rFonts w:ascii="Consolas" w:hAnsi="Consolas"/>
-                <w:color w:val="1E1E1E"/>
-                <w:sz w:val="16"/>
-              </w:rPr>
-              <w:t xml:space="preserve">  - 0:45 - 1:30 : GitHub Actions CI/CD pipeline run with all 4 jobs green (lint, test, train, docker).</w:t>
-            </w:r>
-          </w:p>
-          <w:p>
-            <w:pPr>
-              <w:spacing w:after="0"/>
-            </w:pPr>
-            <w:r>
-              <w:rPr>
-                <w:rFonts w:ascii="Consolas" w:hAnsi="Consolas"/>
-                <w:color w:val="1E1E1E"/>
-                <w:sz w:val="16"/>
-              </w:rPr>
-              <w:t xml:space="preserve">  - 1:30 - 2:15 : MLflow Tracking UI demonstrating candidate models, hyperparameter grids, and artifacts.</w:t>
-            </w:r>
-          </w:p>
-          <w:p>
-            <w:pPr>
-              <w:spacing w:after="0"/>
-            </w:pPr>
-            <w:r>
-              <w:rPr>
-                <w:rFonts w:ascii="Consolas" w:hAnsi="Consolas"/>
-                <w:color w:val="1E1E1E"/>
-                <w:sz w:val="16"/>
-              </w:rPr>
-              <w:t xml:space="preserve">  - 2:15 - 3:00 : Docker container packaging, non-root user execution, and /predict inference verification.</w:t>
-            </w:r>
-          </w:p>
-          <w:p>
-            <w:pPr>
-              <w:spacing w:after="0"/>
-            </w:pPr>
-            <w:r>
-              <w:rPr>
-                <w:rFonts w:ascii="Consolas" w:hAnsi="Consolas"/>
-                <w:color w:val="1E1E1E"/>
-                <w:sz w:val="16"/>
-              </w:rPr>
-              <w:t xml:space="preserve">  - 3:00 - 3:45 : Kubernetes deployment (kubectl apply, 2 ready pods, LoadBalancer Service inference).</w:t>
-            </w:r>
-          </w:p>
-          <w:p>
-            <w:pPr>
-              <w:spacing w:after="0"/>
-            </w:pPr>
-            <w:r>
-              <w:rPr>
-                <w:rFonts w:ascii="Consolas" w:hAnsi="Consolas"/>
-                <w:color w:val="1E1E1E"/>
-                <w:sz w:val="16"/>
-              </w:rPr>
-              <w:t xml:space="preserve">  - 3:45 - 4:30 : Real-time Prometheus &amp; Grafana dashboard under active synthetic load test.</w:t>
+              <w:t>Demonstration Duration: Approximately 4 minutes 30 seconds.</w:t>
             </w:r>
           </w:p>
         </w:tc>
@@ -10279,7 +10344,6 @@
   <w:style w:type="character" w:default="1" w:styleId="DefaultParagraphFont">
     <w:name w:val="Default Paragraph Font"/>
     <w:uiPriority w:val="1"/>
-    <w:semiHidden/>
     <w:unhideWhenUsed/>
   </w:style>
   <w:style w:type="table" w:default="1" w:styleId="TableNormal">
@@ -21056,6 +21120,42 @@
       </w:tcPr>
     </w:tblStylePr>
   </w:style>
+  <w:style w:type="character" w:styleId="Hyperlink">
+    <w:name w:val="Hyperlink"/>
+    <w:basedOn w:val="DefaultParagraphFont"/>
+    <w:uiPriority w:val="99"/>
+    <w:unhideWhenUsed/>
+    <w:rsid w:val="002566A7"/>
+    <w:rPr>
+      <w:color w:val="0000FF" w:themeColor="hyperlink"/>
+      <w:u w:val="single"/>
+    </w:rPr>
+  </w:style>
+  <w:style w:type="character" w:styleId="UnresolvedMention">
+    <w:name w:val="Unresolved Mention"/>
+    <w:basedOn w:val="DefaultParagraphFont"/>
+    <w:uiPriority w:val="99"/>
+    <w:semiHidden/>
+    <w:unhideWhenUsed/>
+    <w:rsid w:val="002566A7"/>
+    <w:rPr>
+      <w:color w:val="605E5C"/>
+      <w:shd w:val="clear" w:color="auto" w:fill="E1DFDD"/>
+    </w:rPr>
+  </w:style>
+  <w:style w:type="paragraph" w:styleId="NormalWeb">
+    <w:name w:val="Normal (Web)"/>
+    <w:basedOn w:val="Normal"/>
+    <w:uiPriority w:val="99"/>
+    <w:semiHidden/>
+    <w:unhideWhenUsed/>
+    <w:rsid w:val="00245792"/>
+    <w:rPr>
+      <w:rFonts w:ascii="Times New Roman" w:hAnsi="Times New Roman" w:cs="Times New Roman"/>
+      <w:sz w:val="24"/>
+      <w:szCs w:val="24"/>
+    </w:rPr>
+  </w:style>
 </w:styles>
 </file>
 

</xml_diff>